<commit_message>
docs: el manual respeta el diseño de vidrio de la app (T116)
Página web con los tokens de la app (fondo con manchas, tarjetas translúcidas, claro y
oscuro). El .docx y el PDF llevan el fondo de la app, portada con el ícono y un panel de
vidrio, capturas con esquinas redondeadas y sombra, y tablas y notas en tonos claros.

Co-Authored-By: Claude Sonnet 5.5 <noreply@anthropic.com>
Claude-Session: https://claude.ai/code/session_01TbTsHuPZ8nDmqmeNXGzGnL
</commit_message>
<xml_diff>
--- a/docs/manual-usuario/manual-usuario.docx
+++ b/docs/manual-usuario/manual-usuario.docx
@@ -52,7 +52,7 @@
               <w:rFonts w:ascii="Calibri" w:hAnsi="Calibri" w:eastAsia="Calibri" w:cs="Calibri"/>
               <w:b/>
               <w:bCs w:val="false"/>
-              <w:color w:val="1E3FD0"/>
+              <w:color w:val="1D3FD1"/>
               <w:sz w:val="40"/>
             </w:rPr>
           </w:pPr>
@@ -61,7 +61,7 @@
               <w:rFonts w:eastAsia="Calibri" w:cs="Calibri"/>
               <w:b/>
               <w:bCs w:val="false"/>
-              <w:color w:val="1E3FD0"/>
+              <w:color w:val="1D3FD1"/>
               <w:sz w:val="40"/>
             </w:rPr>
             <w:t>Contenido</w:t>
@@ -93,7 +93,7 @@
             </w:rPr>
             <w:fldChar w:fldCharType="separate"/>
           </w:r>
-          <w:hyperlink w:anchor="__RefHeading___Toc1907_3230924885">
+          <w:hyperlink w:anchor="__RefHeading___Toc2117_2420786254">
             <w:r>
               <w:rPr>
                 <w:webHidden/>
@@ -114,7 +114,7 @@
             </w:tabs>
             <w:rPr/>
           </w:pPr>
-          <w:hyperlink w:anchor="__RefHeading___Toc1909_3230924885">
+          <w:hyperlink w:anchor="__RefHeading___Toc2119_2420786254">
             <w:r>
               <w:rPr>
                 <w:webHidden/>
@@ -135,7 +135,7 @@
             </w:tabs>
             <w:rPr/>
           </w:pPr>
-          <w:hyperlink w:anchor="__RefHeading___Toc1911_3230924885">
+          <w:hyperlink w:anchor="__RefHeading___Toc2121_2420786254">
             <w:r>
               <w:rPr>
                 <w:webHidden/>
@@ -156,7 +156,7 @@
             </w:tabs>
             <w:rPr/>
           </w:pPr>
-          <w:hyperlink w:anchor="__RefHeading___Toc1913_3230924885">
+          <w:hyperlink w:anchor="__RefHeading___Toc2123_2420786254">
             <w:r>
               <w:rPr>
                 <w:webHidden/>
@@ -177,7 +177,7 @@
             </w:tabs>
             <w:rPr/>
           </w:pPr>
-          <w:hyperlink w:anchor="__RefHeading___Toc1915_3230924885">
+          <w:hyperlink w:anchor="__RefHeading___Toc2125_2420786254">
             <w:r>
               <w:rPr>
                 <w:webHidden/>
@@ -198,7 +198,7 @@
             </w:tabs>
             <w:rPr/>
           </w:pPr>
-          <w:hyperlink w:anchor="__RefHeading___Toc1917_3230924885">
+          <w:hyperlink w:anchor="__RefHeading___Toc2127_2420786254">
             <w:r>
               <w:rPr>
                 <w:webHidden/>
@@ -219,7 +219,7 @@
             </w:tabs>
             <w:rPr/>
           </w:pPr>
-          <w:hyperlink w:anchor="__RefHeading___Toc1919_3230924885">
+          <w:hyperlink w:anchor="__RefHeading___Toc2129_2420786254">
             <w:r>
               <w:rPr>
                 <w:webHidden/>
@@ -240,7 +240,7 @@
             </w:tabs>
             <w:rPr/>
           </w:pPr>
-          <w:hyperlink w:anchor="__RefHeading___Toc1921_3230924885">
+          <w:hyperlink w:anchor="__RefHeading___Toc2131_2420786254">
             <w:r>
               <w:rPr>
                 <w:webHidden/>
@@ -261,7 +261,7 @@
             </w:tabs>
             <w:rPr/>
           </w:pPr>
-          <w:hyperlink w:anchor="__RefHeading___Toc1923_3230924885">
+          <w:hyperlink w:anchor="__RefHeading___Toc2133_2420786254">
             <w:r>
               <w:rPr>
                 <w:webHidden/>
@@ -282,7 +282,7 @@
             </w:tabs>
             <w:rPr/>
           </w:pPr>
-          <w:hyperlink w:anchor="__RefHeading___Toc1925_3230924885">
+          <w:hyperlink w:anchor="__RefHeading___Toc2135_2420786254">
             <w:r>
               <w:rPr>
                 <w:webHidden/>
@@ -303,7 +303,7 @@
             </w:tabs>
             <w:rPr/>
           </w:pPr>
-          <w:hyperlink w:anchor="__RefHeading___Toc1927_3230924885">
+          <w:hyperlink w:anchor="__RefHeading___Toc2137_2420786254">
             <w:r>
               <w:rPr>
                 <w:webHidden/>
@@ -324,7 +324,7 @@
             </w:tabs>
             <w:rPr/>
           </w:pPr>
-          <w:hyperlink w:anchor="__RefHeading___Toc1929_3230924885">
+          <w:hyperlink w:anchor="__RefHeading___Toc2139_2420786254">
             <w:r>
               <w:rPr>
                 <w:webHidden/>
@@ -345,7 +345,7 @@
             </w:tabs>
             <w:rPr/>
           </w:pPr>
-          <w:hyperlink w:anchor="__RefHeading___Toc1931_3230924885">
+          <w:hyperlink w:anchor="__RefHeading___Toc2141_2420786254">
             <w:r>
               <w:rPr>
                 <w:webHidden/>
@@ -366,7 +366,7 @@
             </w:tabs>
             <w:rPr/>
           </w:pPr>
-          <w:hyperlink w:anchor="__RefHeading___Toc1933_3230924885">
+          <w:hyperlink w:anchor="__RefHeading___Toc2143_2420786254">
             <w:r>
               <w:rPr>
                 <w:webHidden/>
@@ -387,7 +387,7 @@
             </w:tabs>
             <w:rPr/>
           </w:pPr>
-          <w:hyperlink w:anchor="__RefHeading___Toc1935_3230924885">
+          <w:hyperlink w:anchor="__RefHeading___Toc2145_2420786254">
             <w:r>
               <w:rPr>
                 <w:webHidden/>
@@ -408,7 +408,7 @@
             </w:tabs>
             <w:rPr/>
           </w:pPr>
-          <w:hyperlink w:anchor="__RefHeading___Toc1937_3230924885">
+          <w:hyperlink w:anchor="__RefHeading___Toc2147_2420786254">
             <w:r>
               <w:rPr>
                 <w:webHidden/>
@@ -429,7 +429,7 @@
             </w:tabs>
             <w:rPr/>
           </w:pPr>
-          <w:hyperlink w:anchor="__RefHeading___Toc1939_3230924885">
+          <w:hyperlink w:anchor="__RefHeading___Toc2149_2420786254">
             <w:r>
               <w:rPr>
                 <w:webHidden/>
@@ -450,7 +450,7 @@
             </w:tabs>
             <w:rPr/>
           </w:pPr>
-          <w:hyperlink w:anchor="__RefHeading___Toc1941_3230924885">
+          <w:hyperlink w:anchor="__RefHeading___Toc2151_2420786254">
             <w:r>
               <w:rPr>
                 <w:webHidden/>
@@ -471,7 +471,7 @@
             </w:tabs>
             <w:rPr/>
           </w:pPr>
-          <w:hyperlink w:anchor="__RefHeading___Toc1943_3230924885">
+          <w:hyperlink w:anchor="__RefHeading___Toc2153_2420786254">
             <w:r>
               <w:rPr>
                 <w:webHidden/>
@@ -492,7 +492,7 @@
             </w:tabs>
             <w:rPr/>
           </w:pPr>
-          <w:hyperlink w:anchor="__RefHeading___Toc1945_3230924885">
+          <w:hyperlink w:anchor="__RefHeading___Toc2155_2420786254">
             <w:r>
               <w:rPr>
                 <w:webHidden/>
@@ -513,7 +513,7 @@
             </w:tabs>
             <w:rPr/>
           </w:pPr>
-          <w:hyperlink w:anchor="__RefHeading___Toc1947_3230924885">
+          <w:hyperlink w:anchor="__RefHeading___Toc2157_2420786254">
             <w:r>
               <w:rPr>
                 <w:webHidden/>
@@ -521,7 +521,7 @@
               </w:rPr>
               <w:t>17. Consultar lo tuyo</w:t>
               <w:tab/>
-              <w:t>70</w:t>
+              <w:t>71</w:t>
             </w:r>
           </w:hyperlink>
         </w:p>
@@ -534,7 +534,7 @@
             </w:tabs>
             <w:rPr/>
           </w:pPr>
-          <w:hyperlink w:anchor="__RefHeading___Toc1949_3230924885">
+          <w:hyperlink w:anchor="__RefHeading___Toc2159_2420786254">
             <w:r>
               <w:rPr>
                 <w:webHidden/>
@@ -555,7 +555,7 @@
             </w:tabs>
             <w:rPr/>
           </w:pPr>
-          <w:hyperlink w:anchor="__RefHeading___Toc1951_3230924885">
+          <w:hyperlink w:anchor="__RefHeading___Toc2161_2420786254">
             <w:r>
               <w:rPr>
                 <w:webHidden/>
@@ -593,7 +593,7 @@
         <w:spacing w:before="0" w:after="120"/>
         <w:rPr/>
       </w:pPr>
-      <w:bookmarkStart w:id="0" w:name="__RefHeading___Toc1907_3230924885"/>
+      <w:bookmarkStart w:id="0" w:name="__RefHeading___Toc2117_2420786254"/>
       <w:bookmarkStart w:id="1" w:name="cómo-usar-este-manual"/>
       <w:bookmarkEnd w:id="0"/>
       <w:r>
@@ -630,6 +630,7 @@
         <w:tblW w:w="5000" w:type="pct"/>
         <w:jc w:val="left"/>
         <w:tblInd w:w="105" w:type="dxa"/>
+        <w:shd w:fill="F8FAFD" w:val="clear"/>
         <w:tblLayout w:type="fixed"/>
         <w:tblCellMar>
           <w:top w:w="60" w:type="dxa"/>
@@ -651,7 +652,7 @@
           <w:tcPr>
             <w:tcW w:w="4872" w:type="dxa"/>
             <w:tcBorders/>
-            <w:shd w:color="auto" w:fill="E3E9FB" w:val="clear"/>
+            <w:shd w:color="auto" w:fill="DCE5FB" w:val="clear"/>
           </w:tcPr>
           <w:p>
             <w:pPr>
@@ -681,7 +682,7 @@
           <w:tcPr>
             <w:tcW w:w="4873" w:type="dxa"/>
             <w:tcBorders/>
-            <w:shd w:color="auto" w:fill="E3E9FB" w:val="clear"/>
+            <w:shd w:color="auto" w:fill="DCE5FB" w:val="clear"/>
           </w:tcPr>
           <w:p>
             <w:pPr>
@@ -714,6 +715,7 @@
           <w:tcPr>
             <w:tcW w:w="4872" w:type="dxa"/>
             <w:tcBorders/>
+            <w:shd w:color="auto" w:fill="F8FAFD" w:val="clear"/>
           </w:tcPr>
           <w:p>
             <w:pPr>
@@ -741,6 +743,7 @@
           <w:tcPr>
             <w:tcW w:w="4873" w:type="dxa"/>
             <w:tcBorders/>
+            <w:shd w:color="auto" w:fill="F8FAFD" w:val="clear"/>
           </w:tcPr>
           <w:p>
             <w:pPr>
@@ -771,6 +774,7 @@
           <w:tcPr>
             <w:tcW w:w="4872" w:type="dxa"/>
             <w:tcBorders/>
+            <w:shd w:color="auto" w:fill="F8FAFD" w:val="clear"/>
           </w:tcPr>
           <w:p>
             <w:pPr>
@@ -798,6 +802,7 @@
           <w:tcPr>
             <w:tcW w:w="4873" w:type="dxa"/>
             <w:tcBorders/>
+            <w:shd w:color="auto" w:fill="F8FAFD" w:val="clear"/>
           </w:tcPr>
           <w:p>
             <w:pPr>
@@ -978,7 +983,7 @@
         <w:pStyle w:val="Heading1"/>
         <w:rPr/>
       </w:pPr>
-      <w:bookmarkStart w:id="2" w:name="__RefHeading___Toc1909_3230924885"/>
+      <w:bookmarkStart w:id="2" w:name="__RefHeading___Toc2119_2420786254"/>
       <w:bookmarkStart w:id="3" w:name="parte-1.-para-todos"/>
       <w:bookmarkEnd w:id="2"/>
       <w:r>
@@ -1001,7 +1006,7 @@
         <w:pStyle w:val="Heading2"/>
         <w:rPr/>
       </w:pPr>
-      <w:bookmarkStart w:id="4" w:name="__RefHeading___Toc1911_3230924885"/>
+      <w:bookmarkStart w:id="4" w:name="__RefHeading___Toc2121_2420786254"/>
       <w:bookmarkStart w:id="5" w:name="iniciar-sesión"/>
       <w:bookmarkEnd w:id="4"/>
       <w:r>
@@ -1069,7 +1074,7 @@
         <w:rPr/>
         <w:drawing>
           <wp:inline distT="0" distB="0" distL="0" distR="0">
-            <wp:extent cx="2339975" cy="5064125"/>
+            <wp:extent cx="2592070" cy="5328920"/>
             <wp:effectExtent l="0" t="0" r="0" b="0"/>
             <wp:docPr id="1" name="Picture" descr="Pantalla de inicio de sesión con el correo escrito y el botón Iniciar sesión señalado"/>
             <wp:cNvGraphicFramePr>
@@ -1093,7 +1098,7 @@
                   <pic:spPr bwMode="auto">
                     <a:xfrm>
                       <a:off x="0" y="0"/>
-                      <a:ext cx="2339975" cy="5064125"/>
+                      <a:ext cx="2592070" cy="5328920"/>
                     </a:xfrm>
                     <a:prstGeom prst="rect">
                       <a:avLst/>
@@ -1158,7 +1163,7 @@
         <w:rPr/>
         <w:drawing>
           <wp:inline distT="0" distB="0" distL="0" distR="0">
-            <wp:extent cx="2339975" cy="5064125"/>
+            <wp:extent cx="2592070" cy="5328920"/>
             <wp:effectExtent l="0" t="0" r="0" b="0"/>
             <wp:docPr id="2" name="Image2" descr="Aviso rojo “Correo o contraseña incorrectos.” sobre el formulario"/>
             <wp:cNvGraphicFramePr>
@@ -1182,7 +1187,7 @@
                   <pic:spPr bwMode="auto">
                     <a:xfrm>
                       <a:off x="0" y="0"/>
-                      <a:ext cx="2339975" cy="5064125"/>
+                      <a:ext cx="2592070" cy="5328920"/>
                     </a:xfrm>
                     <a:prstGeom prst="rect">
                       <a:avLst/>
@@ -1226,7 +1231,7 @@
         <w:pStyle w:val="Heading2"/>
         <w:rPr/>
       </w:pPr>
-      <w:bookmarkStart w:id="7" w:name="__RefHeading___Toc1913_3230924885"/>
+      <w:bookmarkStart w:id="7" w:name="__RefHeading___Toc2123_2420786254"/>
       <w:bookmarkStart w:id="8" w:name="conocer-la-pantalla"/>
       <w:bookmarkEnd w:id="7"/>
       <w:r>
@@ -1264,7 +1269,7 @@
         <w:rPr/>
         <w:drawing>
           <wp:inline distT="0" distB="0" distL="0" distR="0">
-            <wp:extent cx="2339975" cy="5064125"/>
+            <wp:extent cx="2592070" cy="5328920"/>
             <wp:effectExtent l="0" t="0" r="0" b="0"/>
             <wp:docPr id="3" name="Image3" descr="Pantalla Hoy sin el día preparado: aviso amarillo con el botón Preparar día señalado"/>
             <wp:cNvGraphicFramePr>
@@ -1288,7 +1293,7 @@
                   <pic:spPr bwMode="auto">
                     <a:xfrm>
                       <a:off x="0" y="0"/>
-                      <a:ext cx="2339975" cy="5064125"/>
+                      <a:ext cx="2592070" cy="5328920"/>
                     </a:xfrm>
                     <a:prstGeom prst="rect">
                       <a:avLst/>
@@ -1341,7 +1346,7 @@
         <w:rPr/>
         <w:drawing>
           <wp:inline distT="0" distB="0" distL="0" distR="0">
-            <wp:extent cx="2339975" cy="5064125"/>
+            <wp:extent cx="2592070" cy="5328920"/>
             <wp:effectExtent l="0" t="0" r="0" b="0"/>
             <wp:docPr id="4" name="Image4" descr="Pantalla Hoy con ventas, cobrado, pendientes por cobrar, cobro por método y utilidad bruta"/>
             <wp:cNvGraphicFramePr>
@@ -1365,7 +1370,7 @@
                   <pic:spPr bwMode="auto">
                     <a:xfrm>
                       <a:off x="0" y="0"/>
-                      <a:ext cx="2339975" cy="5064125"/>
+                      <a:ext cx="2592070" cy="5328920"/>
                     </a:xfrm>
                     <a:prstGeom prst="rect">
                       <a:avLst/>
@@ -1597,7 +1602,7 @@
         <w:pStyle w:val="Heading2"/>
         <w:rPr/>
       </w:pPr>
-      <w:bookmarkStart w:id="9" w:name="__RefHeading___Toc1915_3230924885"/>
+      <w:bookmarkStart w:id="9" w:name="__RefHeading___Toc2125_2420786254"/>
       <w:bookmarkStart w:id="10" w:name="preparar-el-día"/>
       <w:bookmarkEnd w:id="9"/>
       <w:r>
@@ -1686,7 +1691,7 @@
         <w:rPr/>
         <w:drawing>
           <wp:inline distT="0" distB="0" distL="0" distR="0">
-            <wp:extent cx="2339975" cy="5064125"/>
+            <wp:extent cx="2592070" cy="5328920"/>
             <wp:effectExtent l="0" t="0" r="0" b="0"/>
             <wp:docPr id="5" name="Image5" descr="Pantalla Preparar día vacía con el botón Agregar producto señalado"/>
             <wp:cNvGraphicFramePr>
@@ -1710,7 +1715,7 @@
                   <pic:spPr bwMode="auto">
                     <a:xfrm>
                       <a:off x="0" y="0"/>
-                      <a:ext cx="2339975" cy="5064125"/>
+                      <a:ext cx="2592070" cy="5328920"/>
                     </a:xfrm>
                     <a:prstGeom prst="rect">
                       <a:avLst/>
@@ -1764,7 +1769,7 @@
         <w:rPr/>
         <w:drawing>
           <wp:inline distT="0" distB="0" distL="0" distR="0">
-            <wp:extent cx="2339975" cy="5064125"/>
+            <wp:extent cx="2592070" cy="5328920"/>
             <wp:effectExtent l="0" t="0" r="0" b="0"/>
             <wp:docPr id="6" name="Image6" descr="Hoja Agregar producto con el buscador y la lista de productos"/>
             <wp:cNvGraphicFramePr>
@@ -1788,7 +1793,7 @@
                   <pic:spPr bwMode="auto">
                     <a:xfrm>
                       <a:off x="0" y="0"/>
-                      <a:ext cx="2339975" cy="5064125"/>
+                      <a:ext cx="2592070" cy="5328920"/>
                     </a:xfrm>
                     <a:prstGeom prst="rect">
                       <a:avLst/>
@@ -1864,7 +1869,7 @@
         <w:rPr/>
         <w:drawing>
           <wp:inline distT="0" distB="0" distL="0" distR="0">
-            <wp:extent cx="2339975" cy="5064125"/>
+            <wp:extent cx="2592070" cy="5328920"/>
             <wp:effectExtent l="0" t="0" r="0" b="0"/>
             <wp:docPr id="7" name="Image7" descr="Hoja Agregar producto con el producto elegido, la cantidad 40 y el botón Agregar al día señalado"/>
             <wp:cNvGraphicFramePr>
@@ -1888,7 +1893,7 @@
                   <pic:spPr bwMode="auto">
                     <a:xfrm>
                       <a:off x="0" y="0"/>
-                      <a:ext cx="2339975" cy="5064125"/>
+                      <a:ext cx="2592070" cy="5328920"/>
                     </a:xfrm>
                     <a:prstGeom prst="rect">
                       <a:avLst/>
@@ -1975,7 +1980,7 @@
         <w:rPr/>
         <w:drawing>
           <wp:inline distT="0" distB="0" distL="0" distR="0">
-            <wp:extent cx="4860290" cy="6202680"/>
+            <wp:extent cx="5255895" cy="6484620"/>
             <wp:effectExtent l="0" t="0" r="0" b="0"/>
             <wp:docPr id="8" name="Image8" descr="Preparar día con varios productos: Inicial, Vendido y Disponible de cada uno"/>
             <wp:cNvGraphicFramePr>
@@ -1999,7 +2004,7 @@
                   <pic:spPr bwMode="auto">
                     <a:xfrm>
                       <a:off x="0" y="0"/>
-                      <a:ext cx="4860290" cy="6202680"/>
+                      <a:ext cx="5255895" cy="6484620"/>
                     </a:xfrm>
                     <a:prstGeom prst="rect">
                       <a:avLst/>
@@ -2096,7 +2101,7 @@
         <w:rPr/>
         <w:drawing>
           <wp:inline distT="0" distB="0" distL="0" distR="0">
-            <wp:extent cx="2339975" cy="5064125"/>
+            <wp:extent cx="2592070" cy="5328920"/>
             <wp:effectExtent l="0" t="0" r="0" b="0"/>
             <wp:docPr id="9" name="Image9" descr="Hoja Aumentar cantidad con la cantidad nueva, el motivo y el botón Guardar aumento señalado"/>
             <wp:cNvGraphicFramePr>
@@ -2120,7 +2125,7 @@
                   <pic:spPr bwMode="auto">
                     <a:xfrm>
                       <a:off x="0" y="0"/>
-                      <a:ext cx="2339975" cy="5064125"/>
+                      <a:ext cx="2592070" cy="5328920"/>
                     </a:xfrm>
                     <a:prstGeom prst="rect">
                       <a:avLst/>
@@ -2191,7 +2196,7 @@
         <w:rPr/>
         <w:drawing>
           <wp:inline distT="0" distB="0" distL="0" distR="0">
-            <wp:extent cx="2339975" cy="5064125"/>
+            <wp:extent cx="2592070" cy="5328920"/>
             <wp:effectExtent l="0" t="0" r="0" b="0"/>
             <wp:docPr id="10" name="Image10" descr="Confirmación ¿Quitar Habas con sal del día? con el botón Quitar del día señalado"/>
             <wp:cNvGraphicFramePr>
@@ -2215,7 +2220,7 @@
                   <pic:spPr bwMode="auto">
                     <a:xfrm>
                       <a:off x="0" y="0"/>
-                      <a:ext cx="2339975" cy="5064125"/>
+                      <a:ext cx="2592070" cy="5328920"/>
                     </a:xfrm>
                     <a:prstGeom prst="rect">
                       <a:avLst/>
@@ -2268,7 +2273,7 @@
         <w:rPr/>
         <w:drawing>
           <wp:inline distT="0" distB="0" distL="0" distR="0">
-            <wp:extent cx="2339975" cy="5064125"/>
+            <wp:extent cx="2592070" cy="5328920"/>
             <wp:effectExtent l="0" t="0" r="0" b="0"/>
             <wp:docPr id="11" name="Image11" descr="Aviso No se puede quitar: el producto ya tiene piezas vendidas"/>
             <wp:cNvGraphicFramePr>
@@ -2292,7 +2297,7 @@
                   <pic:spPr bwMode="auto">
                     <a:xfrm>
                       <a:off x="0" y="0"/>
-                      <a:ext cx="2339975" cy="5064125"/>
+                      <a:ext cx="2592070" cy="5328920"/>
                     </a:xfrm>
                     <a:prstGeom prst="rect">
                       <a:avLst/>
@@ -2363,7 +2368,7 @@
         <w:rPr/>
         <w:drawing>
           <wp:inline distT="0" distB="0" distL="0" distR="0">
-            <wp:extent cx="2339975" cy="6377940"/>
+            <wp:extent cx="2592070" cy="6649085"/>
             <wp:effectExtent l="0" t="0" r="0" b="0"/>
             <wp:docPr id="12" name="Image12" descr="Pantalla Inventario con la barra de avance de cada producto"/>
             <wp:cNvGraphicFramePr>
@@ -2387,7 +2392,7 @@
                   <pic:spPr bwMode="auto">
                     <a:xfrm>
                       <a:off x="0" y="0"/>
-                      <a:ext cx="2339975" cy="6377940"/>
+                      <a:ext cx="2592070" cy="6649085"/>
                     </a:xfrm>
                     <a:prstGeom prst="rect">
                       <a:avLst/>
@@ -2458,7 +2463,7 @@
         <w:rPr/>
         <w:drawing>
           <wp:inline distT="0" distB="0" distL="0" distR="0">
-            <wp:extent cx="2339975" cy="5064125"/>
+            <wp:extent cx="2592070" cy="5328920"/>
             <wp:effectExtent l="0" t="0" r="0" b="0"/>
             <wp:docPr id="13" name="Image13" descr="Pantalla Jornadas anteriores sin días todavía"/>
             <wp:cNvGraphicFramePr>
@@ -2482,7 +2487,7 @@
                   <pic:spPr bwMode="auto">
                     <a:xfrm>
                       <a:off x="0" y="0"/>
-                      <a:ext cx="2339975" cy="5064125"/>
+                      <a:ext cx="2592070" cy="5328920"/>
                     </a:xfrm>
                     <a:prstGeom prst="rect">
                       <a:avLst/>
@@ -2539,7 +2544,7 @@
         <w:pStyle w:val="Heading2"/>
         <w:rPr/>
       </w:pPr>
-      <w:bookmarkStart w:id="11" w:name="__RefHeading___Toc1917_3230924885"/>
+      <w:bookmarkStart w:id="11" w:name="__RefHeading___Toc2127_2420786254"/>
       <w:bookmarkStart w:id="12" w:name="vender"/>
       <w:bookmarkEnd w:id="11"/>
       <w:r>
@@ -2607,7 +2612,7 @@
         <w:rPr/>
         <w:drawing>
           <wp:inline distT="0" distB="0" distL="0" distR="0">
-            <wp:extent cx="2339975" cy="5064125"/>
+            <wp:extent cx="2592070" cy="5328920"/>
             <wp:effectExtent l="0" t="0" r="0" b="0"/>
             <wp:docPr id="14" name="Image14" descr="Nueva venta, paso 1 de 2: el buscador señalado y la lista de productos con sus existencias"/>
             <wp:cNvGraphicFramePr>
@@ -2631,7 +2636,7 @@
                   <pic:spPr bwMode="auto">
                     <a:xfrm>
                       <a:off x="0" y="0"/>
-                      <a:ext cx="2339975" cy="5064125"/>
+                      <a:ext cx="2592070" cy="5328920"/>
                     </a:xfrm>
                     <a:prstGeom prst="rect">
                       <a:avLst/>
@@ -2729,7 +2734,7 @@
         <w:rPr/>
         <w:drawing>
           <wp:inline distT="0" distB="0" distL="0" distR="0">
-            <wp:extent cx="2339975" cy="5064125"/>
+            <wp:extent cx="2592070" cy="5328920"/>
             <wp:effectExtent l="0" t="0" r="0" b="0"/>
             <wp:docPr id="15" name="Image15" descr="Carrito con dos piezas de Cacahuate japonés y el botón Continuar señalado"/>
             <wp:cNvGraphicFramePr>
@@ -2753,7 +2758,7 @@
                   <pic:spPr bwMode="auto">
                     <a:xfrm>
                       <a:off x="0" y="0"/>
-                      <a:ext cx="2339975" cy="5064125"/>
+                      <a:ext cx="2592070" cy="5328920"/>
                     </a:xfrm>
                     <a:prstGeom prst="rect">
                       <a:avLst/>
@@ -2887,7 +2892,7 @@
         <w:rPr/>
         <w:drawing>
           <wp:inline distT="0" distB="0" distL="0" distR="0">
-            <wp:extent cx="2339975" cy="5064125"/>
+            <wp:extent cx="2592070" cy="5328920"/>
             <wp:effectExtent l="0" t="0" r="0" b="0"/>
             <wp:docPr id="16" name="Image16" descr="Nueva venta, paso 2 de 2: cobro en efectivo y el botón Confirmar venta señalado"/>
             <wp:cNvGraphicFramePr>
@@ -2911,7 +2916,7 @@
                   <pic:spPr bwMode="auto">
                     <a:xfrm>
                       <a:off x="0" y="0"/>
-                      <a:ext cx="2339975" cy="5064125"/>
+                      <a:ext cx="2592070" cy="5328920"/>
                     </a:xfrm>
                     <a:prstGeom prst="rect">
                       <a:avLst/>
@@ -3020,7 +3025,7 @@
         <w:rPr/>
         <w:drawing>
           <wp:inline distT="0" distB="0" distL="0" distR="0">
-            <wp:extent cx="2339975" cy="5064125"/>
+            <wp:extent cx="2592070" cy="5328920"/>
             <wp:effectExtent l="0" t="0" r="0" b="0"/>
             <wp:docPr id="17" name="Image17" descr="Pantalla Venta registrada con el folio, el total y el estado Pagada"/>
             <wp:cNvGraphicFramePr>
@@ -3044,7 +3049,7 @@
                   <pic:spPr bwMode="auto">
                     <a:xfrm>
                       <a:off x="0" y="0"/>
-                      <a:ext cx="2339975" cy="5064125"/>
+                      <a:ext cx="2592070" cy="5328920"/>
                     </a:xfrm>
                     <a:prstGeom prst="rect">
                       <a:avLst/>
@@ -3185,7 +3190,7 @@
         <w:rPr/>
         <w:drawing>
           <wp:inline distT="0" distB="0" distL="0" distR="0">
-            <wp:extent cx="2339975" cy="5064125"/>
+            <wp:extent cx="2592070" cy="5328920"/>
             <wp:effectExtent l="0" t="0" r="0" b="0"/>
             <wp:docPr id="18" name="Image18" descr="Hoja Cobro en modo Mixto, con 30 en efectivo y 14 en transferencia"/>
             <wp:cNvGraphicFramePr>
@@ -3209,7 +3214,7 @@
                   <pic:spPr bwMode="auto">
                     <a:xfrm>
                       <a:off x="0" y="0"/>
-                      <a:ext cx="2339975" cy="5064125"/>
+                      <a:ext cx="2592070" cy="5328920"/>
                     </a:xfrm>
                     <a:prstGeom prst="rect">
                       <a:avLst/>
@@ -3319,7 +3324,7 @@
         <w:rPr/>
         <w:drawing>
           <wp:inline distT="0" distB="0" distL="0" distR="0">
-            <wp:extent cx="2339975" cy="5064125"/>
+            <wp:extent cx="2592070" cy="5328920"/>
             <wp:effectExtent l="0" t="0" r="0" b="0"/>
             <wp:docPr id="19" name="Image19" descr="Paso 2 con la opción Dejar pendiente: la venta queda pendiente por el total"/>
             <wp:cNvGraphicFramePr>
@@ -3343,7 +3348,7 @@
                   <pic:spPr bwMode="auto">
                     <a:xfrm>
                       <a:off x="0" y="0"/>
-                      <a:ext cx="2339975" cy="5064125"/>
+                      <a:ext cx="2592070" cy="5328920"/>
                     </a:xfrm>
                     <a:prstGeom prst="rect">
                       <a:avLst/>
@@ -3447,7 +3452,7 @@
         <w:rPr/>
         <w:drawing>
           <wp:inline distT="0" distB="0" distL="0" distR="0">
-            <wp:extent cx="2339975" cy="5064125"/>
+            <wp:extent cx="2592070" cy="5328920"/>
             <wp:effectExtent l="0" t="0" r="0" b="0"/>
             <wp:docPr id="20" name="Image20" descr="Detalle de una venta pagada: productos, totales e historial de pagos"/>
             <wp:cNvGraphicFramePr>
@@ -3471,7 +3476,7 @@
                   <pic:spPr bwMode="auto">
                     <a:xfrm>
                       <a:off x="0" y="0"/>
-                      <a:ext cx="2339975" cy="5064125"/>
+                      <a:ext cx="2592070" cy="5328920"/>
                     </a:xfrm>
                     <a:prstGeom prst="rect">
                       <a:avLst/>
@@ -3503,7 +3508,7 @@
         <w:pStyle w:val="Heading2"/>
         <w:rPr/>
       </w:pPr>
-      <w:bookmarkStart w:id="17" w:name="__RefHeading___Toc1919_3230924885"/>
+      <w:bookmarkStart w:id="17" w:name="__RefHeading___Toc2129_2420786254"/>
       <w:bookmarkStart w:id="18" w:name="cobrar-una-venta-pendiente"/>
       <w:bookmarkEnd w:id="17"/>
       <w:r>
@@ -3593,7 +3598,7 @@
         <w:rPr/>
         <w:drawing>
           <wp:inline distT="0" distB="0" distL="0" distR="0">
-            <wp:extent cx="2339975" cy="5064125"/>
+            <wp:extent cx="2592070" cy="5328920"/>
             <wp:effectExtent l="0" t="0" r="0" b="0"/>
             <wp:docPr id="21" name="Image21" descr="Pantalla Pendientes con el total por cobrar y las ventas pendientes"/>
             <wp:cNvGraphicFramePr>
@@ -3617,7 +3622,7 @@
                   <pic:spPr bwMode="auto">
                     <a:xfrm>
                       <a:off x="0" y="0"/>
-                      <a:ext cx="2339975" cy="5064125"/>
+                      <a:ext cx="2592070" cy="5328920"/>
                     </a:xfrm>
                     <a:prstGeom prst="rect">
                       <a:avLst/>
@@ -3770,7 +3775,7 @@
         <w:rPr/>
         <w:drawing>
           <wp:inline distT="0" distB="0" distL="0" distR="0">
-            <wp:extent cx="2339975" cy="5064125"/>
+            <wp:extent cx="2592070" cy="5328920"/>
             <wp:effectExtent l="0" t="0" r="0" b="0"/>
             <wp:docPr id="22" name="Image22" descr="Hoja Filtrar por fecha de venta con los atajos y los campos Desde y Hasta"/>
             <wp:cNvGraphicFramePr>
@@ -3794,7 +3799,7 @@
                   <pic:spPr bwMode="auto">
                     <a:xfrm>
                       <a:off x="0" y="0"/>
-                      <a:ext cx="2339975" cy="5064125"/>
+                      <a:ext cx="2592070" cy="5328920"/>
                     </a:xfrm>
                     <a:prstGeom prst="rect">
                       <a:avLst/>
@@ -3870,7 +3875,7 @@
         <w:rPr/>
         <w:drawing>
           <wp:inline distT="0" distB="0" distL="0" distR="0">
-            <wp:extent cx="2339975" cy="5064125"/>
+            <wp:extent cx="2592070" cy="5328920"/>
             <wp:effectExtent l="0" t="0" r="0" b="0"/>
             <wp:docPr id="23" name="Image23" descr="Detalle de una venta pendiente con el botón Registrar pago señalado"/>
             <wp:cNvGraphicFramePr>
@@ -3894,7 +3899,7 @@
                   <pic:spPr bwMode="auto">
                     <a:xfrm>
                       <a:off x="0" y="0"/>
-                      <a:ext cx="2339975" cy="5064125"/>
+                      <a:ext cx="2592070" cy="5328920"/>
                     </a:xfrm>
                     <a:prstGeom prst="rect">
                       <a:avLst/>
@@ -3992,7 +3997,7 @@
         <w:rPr/>
         <w:drawing>
           <wp:inline distT="0" distB="0" distL="0" distR="0">
-            <wp:extent cx="2339975" cy="5064125"/>
+            <wp:extent cx="2592070" cy="5328920"/>
             <wp:effectExtent l="0" t="0" r="0" b="0"/>
             <wp:docPr id="24" name="Image24" descr="Hoja Registrar pago con el importe pendiente y el botón Registrar pago señalado"/>
             <wp:cNvGraphicFramePr>
@@ -4016,7 +4021,7 @@
                   <pic:spPr bwMode="auto">
                     <a:xfrm>
                       <a:off x="0" y="0"/>
-                      <a:ext cx="2339975" cy="5064125"/>
+                      <a:ext cx="2592070" cy="5328920"/>
                     </a:xfrm>
                     <a:prstGeom prst="rect">
                       <a:avLst/>
@@ -4092,7 +4097,7 @@
         <w:rPr/>
         <w:drawing>
           <wp:inline distT="0" distB="0" distL="0" distR="0">
-            <wp:extent cx="2339975" cy="5172075"/>
+            <wp:extent cx="2592070" cy="5436870"/>
             <wp:effectExtent l="0" t="0" r="0" b="0"/>
             <wp:docPr id="25" name="Image25" descr="Venta ya pagada: estado Pagada y falta por pagar en cero"/>
             <wp:cNvGraphicFramePr>
@@ -4116,7 +4121,7 @@
                   <pic:spPr bwMode="auto">
                     <a:xfrm>
                       <a:off x="0" y="0"/>
-                      <a:ext cx="2339975" cy="5172075"/>
+                      <a:ext cx="2592070" cy="5436870"/>
                     </a:xfrm>
                     <a:prstGeom prst="rect">
                       <a:avLst/>
@@ -4150,7 +4155,7 @@
         <w:pStyle w:val="Heading2"/>
         <w:rPr/>
       </w:pPr>
-      <w:bookmarkStart w:id="20" w:name="__RefHeading___Toc1921_3230924885"/>
+      <w:bookmarkStart w:id="20" w:name="__RefHeading___Toc2131_2420786254"/>
       <w:bookmarkStart w:id="21" w:name="corregir-un-error"/>
       <w:bookmarkEnd w:id="20"/>
       <w:r>
@@ -4285,7 +4290,7 @@
         <w:rPr/>
         <w:drawing>
           <wp:inline distT="0" distB="0" distL="0" distR="0">
-            <wp:extent cx="2339975" cy="5064125"/>
+            <wp:extent cx="2592070" cy="5328920"/>
             <wp:effectExtent l="0" t="0" r="0" b="0"/>
             <wp:docPr id="26" name="Image26" descr="Confirmación ¿Anular este pago? con el motivo escrito y el botón Anular pago señalado"/>
             <wp:cNvGraphicFramePr>
@@ -4309,7 +4314,7 @@
                   <pic:spPr bwMode="auto">
                     <a:xfrm>
                       <a:off x="0" y="0"/>
-                      <a:ext cx="2339975" cy="5064125"/>
+                      <a:ext cx="2592070" cy="5328920"/>
                     </a:xfrm>
                     <a:prstGeom prst="rect">
                       <a:avLst/>
@@ -4374,7 +4379,7 @@
         <w:rPr/>
         <w:drawing>
           <wp:inline distT="0" distB="0" distL="0" distR="0">
-            <wp:extent cx="2339975" cy="5412105"/>
+            <wp:extent cx="2592070" cy="5678170"/>
             <wp:effectExtent l="0" t="0" r="0" b="0"/>
             <wp:docPr id="27" name="Image27" descr="Historial de pagos con la transferencia tachada y marcada como Anulado"/>
             <wp:cNvGraphicFramePr>
@@ -4398,7 +4403,7 @@
                   <pic:spPr bwMode="auto">
                     <a:xfrm>
                       <a:off x="0" y="0"/>
-                      <a:ext cx="2339975" cy="5412105"/>
+                      <a:ext cx="2592070" cy="5678170"/>
                     </a:xfrm>
                     <a:prstGeom prst="rect">
                       <a:avLst/>
@@ -4522,7 +4527,7 @@
         <w:rPr/>
         <w:drawing>
           <wp:inline distT="0" distB="0" distL="0" distR="0">
-            <wp:extent cx="2339975" cy="5064125"/>
+            <wp:extent cx="2592070" cy="5328920"/>
             <wp:effectExtent l="0" t="0" r="0" b="0"/>
             <wp:docPr id="28" name="Image28" descr="Confirmación ¿Cancelar la venta? con el motivo escrito y el botón Cancelar venta señalado"/>
             <wp:cNvGraphicFramePr>
@@ -4546,7 +4551,7 @@
                   <pic:spPr bwMode="auto">
                     <a:xfrm>
                       <a:off x="0" y="0"/>
-                      <a:ext cx="2339975" cy="5064125"/>
+                      <a:ext cx="2592070" cy="5328920"/>
                     </a:xfrm>
                     <a:prstGeom prst="rect">
                       <a:avLst/>
@@ -4611,7 +4616,7 @@
         <w:rPr/>
         <w:drawing>
           <wp:inline distT="0" distB="0" distL="0" distR="0">
-            <wp:extent cx="2339975" cy="5831840"/>
+            <wp:extent cx="2592070" cy="6100445"/>
             <wp:effectExtent l="0" t="0" r="0" b="0"/>
             <wp:docPr id="29" name="Image29" descr="Venta cancelada con el aviso de lo que hay que devolver fuera del sistema"/>
             <wp:cNvGraphicFramePr>
@@ -4635,7 +4640,7 @@
                   <pic:spPr bwMode="auto">
                     <a:xfrm>
                       <a:off x="0" y="0"/>
-                      <a:ext cx="2339975" cy="5831840"/>
+                      <a:ext cx="2592070" cy="6100445"/>
                     </a:xfrm>
                     <a:prstGeom prst="rect">
                       <a:avLst/>
@@ -4764,7 +4769,7 @@
         <w:pStyle w:val="Heading2"/>
         <w:rPr/>
       </w:pPr>
-      <w:bookmarkStart w:id="25" w:name="__RefHeading___Toc1923_3230924885"/>
+      <w:bookmarkStart w:id="25" w:name="__RefHeading___Toc2133_2420786254"/>
       <w:bookmarkStart w:id="26" w:name="consultar-tus-ventas-historial"/>
       <w:bookmarkEnd w:id="25"/>
       <w:r>
@@ -4824,7 +4829,7 @@
         <w:rPr/>
         <w:drawing>
           <wp:inline distT="0" distB="0" distL="0" distR="0">
-            <wp:extent cx="2339975" cy="5064125"/>
+            <wp:extent cx="2592070" cy="5328920"/>
             <wp:effectExtent l="0" t="0" r="0" b="0"/>
             <wp:docPr id="30" name="Image30" descr="Historial con todas las ventas: folio, fecha, cliente, total y estado"/>
             <wp:cNvGraphicFramePr>
@@ -4848,7 +4853,7 @@
                   <pic:spPr bwMode="auto">
                     <a:xfrm>
                       <a:off x="0" y="0"/>
-                      <a:ext cx="2339975" cy="5064125"/>
+                      <a:ext cx="2592070" cy="5328920"/>
                     </a:xfrm>
                     <a:prstGeom prst="rect">
                       <a:avLst/>
@@ -4956,7 +4961,7 @@
         <w:rPr/>
         <w:drawing>
           <wp:inline distT="0" distB="0" distL="0" distR="0">
-            <wp:extent cx="2339975" cy="5064125"/>
+            <wp:extent cx="2592070" cy="5328920"/>
             <wp:effectExtent l="0" t="0" r="0" b="0"/>
             <wp:docPr id="31" name="Image31" descr="Historial filtrado por Pendientes"/>
             <wp:cNvGraphicFramePr>
@@ -4980,7 +4985,7 @@
                   <pic:spPr bwMode="auto">
                     <a:xfrm>
                       <a:off x="0" y="0"/>
-                      <a:ext cx="2339975" cy="5064125"/>
+                      <a:ext cx="2592070" cy="5328920"/>
                     </a:xfrm>
                     <a:prstGeom prst="rect">
                       <a:avLst/>
@@ -5045,7 +5050,7 @@
         <w:rPr/>
         <w:drawing>
           <wp:inline distT="0" distB="0" distL="0" distR="0">
-            <wp:extent cx="2339975" cy="5064125"/>
+            <wp:extent cx="2592070" cy="5328920"/>
             <wp:effectExtent l="0" t="0" r="0" b="0"/>
             <wp:docPr id="32" name="Image32" descr="Hoja de filtro por fecha en el Historial"/>
             <wp:cNvGraphicFramePr>
@@ -5069,7 +5074,7 @@
                   <pic:spPr bwMode="auto">
                     <a:xfrm>
                       <a:off x="0" y="0"/>
-                      <a:ext cx="2339975" cy="5064125"/>
+                      <a:ext cx="2592070" cy="5328920"/>
                     </a:xfrm>
                     <a:prstGeom prst="rect">
                       <a:avLst/>
@@ -5117,7 +5122,7 @@
         <w:pStyle w:val="Heading2"/>
         <w:rPr/>
       </w:pPr>
-      <w:bookmarkStart w:id="28" w:name="__RefHeading___Toc1925_3230924885"/>
+      <w:bookmarkStart w:id="28" w:name="__RefHeading___Toc2135_2420786254"/>
       <w:bookmarkEnd w:id="28"/>
       <w:r>
         <w:rPr/>
@@ -5220,7 +5225,7 @@
         <w:rPr/>
         <w:drawing>
           <wp:inline distT="0" distB="0" distL="0" distR="0">
-            <wp:extent cx="4860290" cy="4528820"/>
+            <wp:extent cx="5255895" cy="4800600"/>
             <wp:effectExtent l="0" t="0" r="0" b="0"/>
             <wp:docPr id="33" name="Image33" descr="Reportes del día: ventas, cobrado, pendiente del periodo, cobro por método y utilidad bruta"/>
             <wp:cNvGraphicFramePr>
@@ -5244,7 +5249,7 @@
                   <pic:spPr bwMode="auto">
                     <a:xfrm>
                       <a:off x="0" y="0"/>
-                      <a:ext cx="4860290" cy="4528820"/>
+                      <a:ext cx="5255895" cy="4800600"/>
                     </a:xfrm>
                     <a:prstGeom prst="rect">
                       <a:avLst/>
@@ -5276,7 +5281,7 @@
         <w:rPr/>
         <w:drawing>
           <wp:inline distT="0" distB="0" distL="0" distR="0">
-            <wp:extent cx="2339975" cy="5064125"/>
+            <wp:extent cx="2592070" cy="5328920"/>
             <wp:effectExtent l="0" t="0" r="0" b="0"/>
             <wp:docPr id="34" name="Image34" descr="Selector de periodo en Reportes con Semana elegida"/>
             <wp:cNvGraphicFramePr>
@@ -5300,7 +5305,7 @@
                   <pic:spPr bwMode="auto">
                     <a:xfrm>
                       <a:off x="0" y="0"/>
-                      <a:ext cx="2339975" cy="5064125"/>
+                      <a:ext cx="2592070" cy="5328920"/>
                     </a:xfrm>
                     <a:prstGeom prst="rect">
                       <a:avLst/>
@@ -5386,7 +5391,7 @@
         <w:rPr/>
         <w:drawing>
           <wp:inline distT="0" distB="0" distL="0" distR="0">
-            <wp:extent cx="2339975" cy="5064125"/>
+            <wp:extent cx="2592070" cy="5328920"/>
             <wp:effectExtent l="0" t="0" r="0" b="0"/>
             <wp:docPr id="35" name="Image35" descr="Reportes por rango: campos Desde y Hasta y el botón Aplicar rango"/>
             <wp:cNvGraphicFramePr>
@@ -5410,7 +5415,7 @@
                   <pic:spPr bwMode="auto">
                     <a:xfrm>
                       <a:off x="0" y="0"/>
-                      <a:ext cx="2339975" cy="5064125"/>
+                      <a:ext cx="2592070" cy="5328920"/>
                     </a:xfrm>
                     <a:prstGeom prst="rect">
                       <a:avLst/>
@@ -5449,6 +5454,7 @@
         <w:tblW w:w="5000" w:type="pct"/>
         <w:jc w:val="left"/>
         <w:tblInd w:w="105" w:type="dxa"/>
+        <w:shd w:fill="F8FAFD" w:val="clear"/>
         <w:tblLayout w:type="fixed"/>
         <w:tblCellMar>
           <w:top w:w="60" w:type="dxa"/>
@@ -5470,7 +5476,7 @@
           <w:tcPr>
             <w:tcW w:w="4872" w:type="dxa"/>
             <w:tcBorders/>
-            <w:shd w:color="auto" w:fill="E3E9FB" w:val="clear"/>
+            <w:shd w:color="auto" w:fill="DCE5FB" w:val="clear"/>
           </w:tcPr>
           <w:p>
             <w:pPr>
@@ -5500,7 +5506,7 @@
           <w:tcPr>
             <w:tcW w:w="4873" w:type="dxa"/>
             <w:tcBorders/>
-            <w:shd w:color="auto" w:fill="E3E9FB" w:val="clear"/>
+            <w:shd w:color="auto" w:fill="DCE5FB" w:val="clear"/>
           </w:tcPr>
           <w:p>
             <w:pPr>
@@ -5533,6 +5539,7 @@
           <w:tcPr>
             <w:tcW w:w="4872" w:type="dxa"/>
             <w:tcBorders/>
+            <w:shd w:color="auto" w:fill="F8FAFD" w:val="clear"/>
           </w:tcPr>
           <w:p>
             <w:pPr>
@@ -5562,6 +5569,7 @@
           <w:tcPr>
             <w:tcW w:w="4873" w:type="dxa"/>
             <w:tcBorders/>
+            <w:shd w:color="auto" w:fill="F8FAFD" w:val="clear"/>
           </w:tcPr>
           <w:p>
             <w:pPr>
@@ -5592,6 +5600,7 @@
           <w:tcPr>
             <w:tcW w:w="4872" w:type="dxa"/>
             <w:tcBorders/>
+            <w:shd w:color="auto" w:fill="F8FAFD" w:val="clear"/>
           </w:tcPr>
           <w:p>
             <w:pPr>
@@ -5621,6 +5630,7 @@
           <w:tcPr>
             <w:tcW w:w="4873" w:type="dxa"/>
             <w:tcBorders/>
+            <w:shd w:color="auto" w:fill="F8FAFD" w:val="clear"/>
           </w:tcPr>
           <w:p>
             <w:pPr>
@@ -5669,6 +5679,7 @@
           <w:tcPr>
             <w:tcW w:w="4872" w:type="dxa"/>
             <w:tcBorders/>
+            <w:shd w:color="auto" w:fill="F8FAFD" w:val="clear"/>
           </w:tcPr>
           <w:p>
             <w:pPr>
@@ -5698,6 +5709,7 @@
           <w:tcPr>
             <w:tcW w:w="4873" w:type="dxa"/>
             <w:tcBorders/>
+            <w:shd w:color="auto" w:fill="F8FAFD" w:val="clear"/>
           </w:tcPr>
           <w:p>
             <w:pPr>
@@ -5728,6 +5740,7 @@
           <w:tcPr>
             <w:tcW w:w="4872" w:type="dxa"/>
             <w:tcBorders/>
+            <w:shd w:color="auto" w:fill="F8FAFD" w:val="clear"/>
           </w:tcPr>
           <w:p>
             <w:pPr>
@@ -5757,6 +5770,7 @@
           <w:tcPr>
             <w:tcW w:w="4873" w:type="dxa"/>
             <w:tcBorders/>
+            <w:shd w:color="auto" w:fill="F8FAFD" w:val="clear"/>
           </w:tcPr>
           <w:p>
             <w:pPr>
@@ -5787,6 +5801,7 @@
           <w:tcPr>
             <w:tcW w:w="4872" w:type="dxa"/>
             <w:tcBorders/>
+            <w:shd w:color="auto" w:fill="F8FAFD" w:val="clear"/>
           </w:tcPr>
           <w:p>
             <w:pPr>
@@ -5816,6 +5831,7 @@
           <w:tcPr>
             <w:tcW w:w="4873" w:type="dxa"/>
             <w:tcBorders/>
+            <w:shd w:color="auto" w:fill="F8FAFD" w:val="clear"/>
           </w:tcPr>
           <w:p>
             <w:pPr>
@@ -5874,6 +5890,7 @@
           <w:tcPr>
             <w:tcW w:w="4872" w:type="dxa"/>
             <w:tcBorders/>
+            <w:shd w:color="auto" w:fill="F8FAFD" w:val="clear"/>
           </w:tcPr>
           <w:p>
             <w:pPr>
@@ -5903,6 +5920,7 @@
           <w:tcPr>
             <w:tcW w:w="4873" w:type="dxa"/>
             <w:tcBorders/>
+            <w:shd w:color="auto" w:fill="F8FAFD" w:val="clear"/>
           </w:tcPr>
           <w:p>
             <w:pPr>
@@ -5933,6 +5951,7 @@
           <w:tcPr>
             <w:tcW w:w="4872" w:type="dxa"/>
             <w:tcBorders/>
+            <w:shd w:color="auto" w:fill="F8FAFD" w:val="clear"/>
           </w:tcPr>
           <w:p>
             <w:pPr>
@@ -5962,6 +5981,7 @@
           <w:tcPr>
             <w:tcW w:w="4873" w:type="dxa"/>
             <w:tcBorders/>
+            <w:shd w:color="auto" w:fill="F8FAFD" w:val="clear"/>
           </w:tcPr>
           <w:p>
             <w:pPr>
@@ -5994,7 +6014,7 @@
         <w:pStyle w:val="Heading2"/>
         <w:rPr/>
       </w:pPr>
-      <w:bookmarkStart w:id="30" w:name="__RefHeading___Toc1927_3230924885"/>
+      <w:bookmarkStart w:id="30" w:name="__RefHeading___Toc2137_2420786254"/>
       <w:bookmarkEnd w:id="30"/>
       <w:r>
         <w:rPr/>
@@ -6097,7 +6117,7 @@
         <w:rPr/>
         <w:drawing>
           <wp:inline distT="0" distB="0" distL="0" distR="0">
-            <wp:extent cx="2339975" cy="5064125"/>
+            <wp:extent cx="2592070" cy="5328920"/>
             <wp:effectExtent l="0" t="0" r="0" b="0"/>
             <wp:docPr id="36" name="Image36" descr="Perfil con el correo, la tienda, el rol y el botón Cerrar sesión señalado"/>
             <wp:cNvGraphicFramePr>
@@ -6121,7 +6141,7 @@
                   <pic:spPr bwMode="auto">
                     <a:xfrm>
                       <a:off x="0" y="0"/>
-                      <a:ext cx="2339975" cy="5064125"/>
+                      <a:ext cx="2592070" cy="5328920"/>
                     </a:xfrm>
                     <a:prstGeom prst="rect">
                       <a:avLst/>
@@ -6174,7 +6194,7 @@
         <w:rPr/>
         <w:drawing>
           <wp:inline distT="0" distB="0" distL="0" distR="0">
-            <wp:extent cx="2339975" cy="5064125"/>
+            <wp:extent cx="2592070" cy="5328920"/>
             <wp:effectExtent l="0" t="0" r="0" b="0"/>
             <wp:docPr id="37" name="Image37" descr="Pantalla Más del propietario con Catálogo, Historial, Reportes, Equipo, Configuración y Perfil"/>
             <wp:cNvGraphicFramePr>
@@ -6198,7 +6218,7 @@
                   <pic:spPr bwMode="auto">
                     <a:xfrm>
                       <a:off x="0" y="0"/>
-                      <a:ext cx="2339975" cy="5064125"/>
+                      <a:ext cx="2592070" cy="5328920"/>
                     </a:xfrm>
                     <a:prstGeom prst="rect">
                       <a:avLst/>
@@ -6226,7 +6246,7 @@
         <w:pStyle w:val="Heading2"/>
         <w:rPr/>
       </w:pPr>
-      <w:bookmarkStart w:id="31" w:name="__RefHeading___Toc1929_3230924885"/>
+      <w:bookmarkStart w:id="31" w:name="__RefHeading___Toc2139_2420786254"/>
       <w:bookmarkStart w:id="32" w:name="si-algo-no-sale-como-esperabas"/>
       <w:bookmarkEnd w:id="31"/>
       <w:r>
@@ -6260,7 +6280,7 @@
         <w:rPr/>
         <w:drawing>
           <wp:inline distT="0" distB="0" distL="0" distR="0">
-            <wp:extent cx="2339975" cy="5064125"/>
+            <wp:extent cx="2592070" cy="5328920"/>
             <wp:effectExtent l="0" t="0" r="0" b="0"/>
             <wp:docPr id="38" name="Image38" descr="Aviso amarillo “Sin conexión. Nada se guardará hasta que vuelva el internet.”"/>
             <wp:cNvGraphicFramePr>
@@ -6284,7 +6304,7 @@
                   <pic:spPr bwMode="auto">
                     <a:xfrm>
                       <a:off x="0" y="0"/>
-                      <a:ext cx="2339975" cy="5064125"/>
+                      <a:ext cx="2592070" cy="5328920"/>
                     </a:xfrm>
                     <a:prstGeom prst="rect">
                       <a:avLst/>
@@ -6355,7 +6375,7 @@
         <w:rPr/>
         <w:drawing>
           <wp:inline distT="0" distB="0" distL="0" distR="0">
-            <wp:extent cx="2339975" cy="5064125"/>
+            <wp:extent cx="2592070" cy="5328920"/>
             <wp:effectExtent l="0" t="0" r="0" b="0"/>
             <wp:docPr id="39" name="Image39" descr="Pantalla de error con el botón Reintentar señalado"/>
             <wp:cNvGraphicFramePr>
@@ -6379,7 +6399,7 @@
                   <pic:spPr bwMode="auto">
                     <a:xfrm>
                       <a:off x="0" y="0"/>
-                      <a:ext cx="2339975" cy="5064125"/>
+                      <a:ext cx="2592070" cy="5328920"/>
                     </a:xfrm>
                     <a:prstGeom prst="rect">
                       <a:avLst/>
@@ -6446,7 +6466,7 @@
         <w:rPr/>
         <w:drawing>
           <wp:inline distT="0" distB="0" distL="0" distR="0">
-            <wp:extent cx="2339975" cy="5064125"/>
+            <wp:extent cx="2592070" cy="5328920"/>
             <wp:effectExtent l="0" t="0" r="0" b="0"/>
             <wp:docPr id="40" name="Image40" descr="Aviso “Tu sesión expiró” con el botón Iniciar sesión señalado"/>
             <wp:cNvGraphicFramePr>
@@ -6470,7 +6490,7 @@
                   <pic:spPr bwMode="auto">
                     <a:xfrm>
                       <a:off x="0" y="0"/>
-                      <a:ext cx="2339975" cy="5064125"/>
+                      <a:ext cx="2592070" cy="5328920"/>
                     </a:xfrm>
                     <a:prstGeom prst="rect">
                       <a:avLst/>
@@ -6530,7 +6550,7 @@
         <w:rPr/>
         <w:drawing>
           <wp:inline distT="0" distB="0" distL="0" distR="0">
-            <wp:extent cx="2339975" cy="5064125"/>
+            <wp:extent cx="2592070" cy="5328920"/>
             <wp:effectExtent l="0" t="0" r="0" b="0"/>
             <wp:docPr id="41" name="Image41" descr="Pantalla “No encontramos esta página”"/>
             <wp:cNvGraphicFramePr>
@@ -6554,7 +6574,7 @@
                   <pic:spPr bwMode="auto">
                     <a:xfrm>
                       <a:off x="0" y="0"/>
-                      <a:ext cx="2339975" cy="5064125"/>
+                      <a:ext cx="2592070" cy="5328920"/>
                     </a:xfrm>
                     <a:prstGeom prst="rect">
                       <a:avLst/>
@@ -6603,7 +6623,7 @@
         <w:rPr/>
         <w:drawing>
           <wp:inline distT="0" distB="0" distL="0" distR="0">
-            <wp:extent cx="2339975" cy="5064125"/>
+            <wp:extent cx="2592070" cy="5328920"/>
             <wp:effectExtent l="0" t="0" r="0" b="0"/>
             <wp:docPr id="42" name="Image42" descr="Pantalla “Tu cuenta aún no tiene una tienda”"/>
             <wp:cNvGraphicFramePr>
@@ -6627,7 +6647,7 @@
                   <pic:spPr bwMode="auto">
                     <a:xfrm>
                       <a:off x="0" y="0"/>
-                      <a:ext cx="2339975" cy="5064125"/>
+                      <a:ext cx="2592070" cy="5328920"/>
                     </a:xfrm>
                     <a:prstGeom prst="rect">
                       <a:avLst/>
@@ -6691,7 +6711,7 @@
         <w:pStyle w:val="Heading1"/>
         <w:rPr/>
       </w:pPr>
-      <w:bookmarkStart w:id="33" w:name="__RefHeading___Toc1931_3230924885"/>
+      <w:bookmarkStart w:id="33" w:name="__RefHeading___Toc2141_2420786254"/>
       <w:bookmarkStart w:id="34" w:name="parte-2.-guía-del-propietario"/>
       <w:bookmarkEnd w:id="33"/>
       <w:r>
@@ -6714,7 +6734,7 @@
         <w:pStyle w:val="Heading2"/>
         <w:rPr/>
       </w:pPr>
-      <w:bookmarkStart w:id="35" w:name="__RefHeading___Toc1933_3230924885"/>
+      <w:bookmarkStart w:id="35" w:name="__RefHeading___Toc2143_2420786254"/>
       <w:bookmarkStart w:id="36" w:name="catálogo-de-productos"/>
       <w:bookmarkEnd w:id="35"/>
       <w:r>
@@ -6759,7 +6779,7 @@
         <w:rPr/>
         <w:drawing>
           <wp:inline distT="0" distB="0" distL="0" distR="0">
-            <wp:extent cx="2339975" cy="5064125"/>
+            <wp:extent cx="2592070" cy="5328920"/>
             <wp:effectExtent l="0" t="0" r="0" b="0"/>
             <wp:docPr id="43" name="Image43" descr="Catálogo con los productos activos, su precio, su costo y el interruptor de cada uno"/>
             <wp:cNvGraphicFramePr>
@@ -6783,7 +6803,7 @@
                   <pic:spPr bwMode="auto">
                     <a:xfrm>
                       <a:off x="0" y="0"/>
-                      <a:ext cx="2339975" cy="5064125"/>
+                      <a:ext cx="2592070" cy="5328920"/>
                     </a:xfrm>
                     <a:prstGeom prst="rect">
                       <a:avLst/>
@@ -6948,6 +6968,7 @@
         <w:tblW w:w="5000" w:type="pct"/>
         <w:jc w:val="left"/>
         <w:tblInd w:w="825" w:type="dxa"/>
+        <w:shd w:fill="F8FAFD" w:val="clear"/>
         <w:tblLayout w:type="fixed"/>
         <w:tblCellMar>
           <w:top w:w="60" w:type="dxa"/>
@@ -6969,7 +6990,7 @@
           <w:tcPr>
             <w:tcW w:w="4872" w:type="dxa"/>
             <w:tcBorders/>
-            <w:shd w:color="auto" w:fill="E3E9FB" w:val="clear"/>
+            <w:shd w:color="auto" w:fill="DCE5FB" w:val="clear"/>
           </w:tcPr>
           <w:p>
             <w:pPr>
@@ -6999,7 +7020,7 @@
           <w:tcPr>
             <w:tcW w:w="4873" w:type="dxa"/>
             <w:tcBorders/>
-            <w:shd w:color="auto" w:fill="E3E9FB" w:val="clear"/>
+            <w:shd w:color="auto" w:fill="DCE5FB" w:val="clear"/>
           </w:tcPr>
           <w:p>
             <w:pPr>
@@ -7032,6 +7053,7 @@
           <w:tcPr>
             <w:tcW w:w="4872" w:type="dxa"/>
             <w:tcBorders/>
+            <w:shd w:color="auto" w:fill="F8FAFD" w:val="clear"/>
           </w:tcPr>
           <w:p>
             <w:pPr>
@@ -7061,6 +7083,7 @@
           <w:tcPr>
             <w:tcW w:w="4873" w:type="dxa"/>
             <w:tcBorders/>
+            <w:shd w:color="auto" w:fill="F8FAFD" w:val="clear"/>
           </w:tcPr>
           <w:p>
             <w:pPr>
@@ -7091,6 +7114,7 @@
           <w:tcPr>
             <w:tcW w:w="4872" w:type="dxa"/>
             <w:tcBorders/>
+            <w:shd w:color="auto" w:fill="F8FAFD" w:val="clear"/>
           </w:tcPr>
           <w:p>
             <w:pPr>
@@ -7120,6 +7144,7 @@
           <w:tcPr>
             <w:tcW w:w="4873" w:type="dxa"/>
             <w:tcBorders/>
+            <w:shd w:color="auto" w:fill="F8FAFD" w:val="clear"/>
           </w:tcPr>
           <w:p>
             <w:pPr>
@@ -7150,6 +7175,7 @@
           <w:tcPr>
             <w:tcW w:w="4872" w:type="dxa"/>
             <w:tcBorders/>
+            <w:shd w:color="auto" w:fill="F8FAFD" w:val="clear"/>
           </w:tcPr>
           <w:p>
             <w:pPr>
@@ -7179,6 +7205,7 @@
           <w:tcPr>
             <w:tcW w:w="4873" w:type="dxa"/>
             <w:tcBorders/>
+            <w:shd w:color="auto" w:fill="F8FAFD" w:val="clear"/>
           </w:tcPr>
           <w:p>
             <w:pPr>
@@ -7209,6 +7236,7 @@
           <w:tcPr>
             <w:tcW w:w="4872" w:type="dxa"/>
             <w:tcBorders/>
+            <w:shd w:color="auto" w:fill="F8FAFD" w:val="clear"/>
           </w:tcPr>
           <w:p>
             <w:pPr>
@@ -7238,6 +7266,7 @@
           <w:tcPr>
             <w:tcW w:w="4873" w:type="dxa"/>
             <w:tcBorders/>
+            <w:shd w:color="auto" w:fill="F8FAFD" w:val="clear"/>
           </w:tcPr>
           <w:p>
             <w:pPr>
@@ -7268,6 +7297,7 @@
           <w:tcPr>
             <w:tcW w:w="4872" w:type="dxa"/>
             <w:tcBorders/>
+            <w:shd w:color="auto" w:fill="F8FAFD" w:val="clear"/>
           </w:tcPr>
           <w:p>
             <w:pPr>
@@ -7297,6 +7327,7 @@
           <w:tcPr>
             <w:tcW w:w="4873" w:type="dxa"/>
             <w:tcBorders/>
+            <w:shd w:color="auto" w:fill="F8FAFD" w:val="clear"/>
           </w:tcPr>
           <w:p>
             <w:pPr>
@@ -7327,6 +7358,7 @@
           <w:tcPr>
             <w:tcW w:w="4872" w:type="dxa"/>
             <w:tcBorders/>
+            <w:shd w:color="auto" w:fill="F8FAFD" w:val="clear"/>
           </w:tcPr>
           <w:p>
             <w:pPr>
@@ -7392,6 +7424,7 @@
           <w:tcPr>
             <w:tcW w:w="4873" w:type="dxa"/>
             <w:tcBorders/>
+            <w:shd w:color="auto" w:fill="F8FAFD" w:val="clear"/>
           </w:tcPr>
           <w:p>
             <w:pPr>
@@ -7422,6 +7455,7 @@
           <w:tcPr>
             <w:tcW w:w="4872" w:type="dxa"/>
             <w:tcBorders/>
+            <w:shd w:color="auto" w:fill="F8FAFD" w:val="clear"/>
           </w:tcPr>
           <w:p>
             <w:pPr>
@@ -7451,6 +7485,7 @@
           <w:tcPr>
             <w:tcW w:w="4873" w:type="dxa"/>
             <w:tcBorders/>
+            <w:shd w:color="auto" w:fill="F8FAFD" w:val="clear"/>
           </w:tcPr>
           <w:p>
             <w:pPr>
@@ -7489,7 +7524,7 @@
         <w:rPr/>
         <w:drawing>
           <wp:inline distT="0" distB="0" distL="0" distR="0">
-            <wp:extent cx="2339975" cy="5681980"/>
+            <wp:extent cx="2592070" cy="5949950"/>
             <wp:effectExtent l="0" t="0" r="0" b="0"/>
             <wp:docPr id="44" name="Image44" descr="Formulario Nuevo producto con el botón Guardar producto señalado"/>
             <wp:cNvGraphicFramePr>
@@ -7513,7 +7548,7 @@
                   <pic:spPr bwMode="auto">
                     <a:xfrm>
                       <a:off x="0" y="0"/>
-                      <a:ext cx="2339975" cy="5681980"/>
+                      <a:ext cx="2592070" cy="5949950"/>
                     </a:xfrm>
                     <a:prstGeom prst="rect">
                       <a:avLst/>
@@ -7589,7 +7624,7 @@
         <w:rPr/>
         <w:drawing>
           <wp:inline distT="0" distB="0" distL="0" distR="0">
-            <wp:extent cx="2339975" cy="5219700"/>
+            <wp:extent cx="2592070" cy="5485130"/>
             <wp:effectExtent l="0" t="0" r="0" b="0"/>
             <wp:docPr id="45" name="Image45" descr="Catálogo con el producto nuevo ya agregado"/>
             <wp:cNvGraphicFramePr>
@@ -7613,7 +7648,7 @@
                   <pic:spPr bwMode="auto">
                     <a:xfrm>
                       <a:off x="0" y="0"/>
-                      <a:ext cx="2339975" cy="5219700"/>
+                      <a:ext cx="2592070" cy="5485130"/>
                     </a:xfrm>
                     <a:prstGeom prst="rect">
                       <a:avLst/>
@@ -7725,7 +7760,7 @@
         <w:rPr/>
         <w:drawing>
           <wp:inline distT="0" distB="0" distL="0" distR="0">
-            <wp:extent cx="2339975" cy="5969635"/>
+            <wp:extent cx="2592070" cy="6238875"/>
             <wp:effectExtent l="0" t="0" r="0" b="0"/>
             <wp:docPr id="46" name="Image46" descr="Formulario Editar producto"/>
             <wp:cNvGraphicFramePr>
@@ -7749,7 +7784,7 @@
                   <pic:spPr bwMode="auto">
                     <a:xfrm>
                       <a:off x="0" y="0"/>
-                      <a:ext cx="2339975" cy="5969635"/>
+                      <a:ext cx="2592070" cy="6238875"/>
                     </a:xfrm>
                     <a:prstGeom prst="rect">
                       <a:avLst/>
@@ -7802,7 +7837,7 @@
         <w:rPr/>
         <w:drawing>
           <wp:inline distT="0" distB="0" distL="0" distR="0">
-            <wp:extent cx="2339975" cy="5064125"/>
+            <wp:extent cx="2592070" cy="5328920"/>
             <wp:effectExtent l="0" t="0" r="0" b="0"/>
             <wp:docPr id="47" name="Image47" descr="Catálogo filtrado por Inactivos con el producto desactivado"/>
             <wp:cNvGraphicFramePr>
@@ -7826,7 +7861,7 @@
                   <pic:spPr bwMode="auto">
                     <a:xfrm>
                       <a:off x="0" y="0"/>
-                      <a:ext cx="2339975" cy="5064125"/>
+                      <a:ext cx="2592070" cy="5328920"/>
                     </a:xfrm>
                     <a:prstGeom prst="rect">
                       <a:avLst/>
@@ -7858,7 +7893,7 @@
         <w:pStyle w:val="Heading2"/>
         <w:rPr/>
       </w:pPr>
-      <w:bookmarkStart w:id="41" w:name="__RefHeading___Toc1935_3230924885"/>
+      <w:bookmarkStart w:id="41" w:name="__RefHeading___Toc2145_2420786254"/>
       <w:bookmarkStart w:id="42" w:name="configuración-de-la-tienda"/>
       <w:bookmarkEnd w:id="41"/>
       <w:r>
@@ -7914,7 +7949,7 @@
         <w:rPr/>
         <w:drawing>
           <wp:inline distT="0" distB="0" distL="0" distR="0">
-            <wp:extent cx="2339975" cy="5309870"/>
+            <wp:extent cx="2592070" cy="5575935"/>
             <wp:effectExtent l="0" t="0" r="0" b="0"/>
             <wp:docPr id="48" name="Image48" descr="Pantalla Mi tienda: nombre, moneda, zona horaria, horario de la jornada y días de operación"/>
             <wp:cNvGraphicFramePr>
@@ -7938,7 +7973,7 @@
                   <pic:spPr bwMode="auto">
                     <a:xfrm>
                       <a:off x="0" y="0"/>
-                      <a:ext cx="2339975" cy="5309870"/>
+                      <a:ext cx="2592070" cy="5575935"/>
                     </a:xfrm>
                     <a:prstGeom prst="rect">
                       <a:avLst/>
@@ -8095,7 +8130,7 @@
         <w:pStyle w:val="Heading2"/>
         <w:rPr/>
       </w:pPr>
-      <w:bookmarkStart w:id="43" w:name="__RefHeading___Toc1937_3230924885"/>
+      <w:bookmarkStart w:id="43" w:name="__RefHeading___Toc2147_2420786254"/>
       <w:bookmarkStart w:id="44" w:name="equipo-tus-vendedores"/>
       <w:bookmarkEnd w:id="43"/>
       <w:r>
@@ -8151,7 +8186,7 @@
         <w:rPr/>
         <w:drawing>
           <wp:inline distT="0" distB="0" distL="0" distR="0">
-            <wp:extent cx="2339975" cy="5064125"/>
+            <wp:extent cx="2592070" cy="5328920"/>
             <wp:effectExtent l="0" t="0" r="0" b="0"/>
             <wp:docPr id="49" name="Image49" descr="Pantalla Equipo vacía, con el botón Agregar vendedor señalado"/>
             <wp:cNvGraphicFramePr>
@@ -8175,7 +8210,7 @@
                   <pic:spPr bwMode="auto">
                     <a:xfrm>
                       <a:off x="0" y="0"/>
-                      <a:ext cx="2339975" cy="5064125"/>
+                      <a:ext cx="2592070" cy="5328920"/>
                     </a:xfrm>
                     <a:prstGeom prst="rect">
                       <a:avLst/>
@@ -8294,7 +8329,7 @@
         <w:rPr/>
         <w:drawing>
           <wp:inline distT="0" distB="0" distL="0" distR="0">
-            <wp:extent cx="2339975" cy="5064125"/>
+            <wp:extent cx="2592070" cy="5328920"/>
             <wp:effectExtent l="0" t="0" r="0" b="0"/>
             <wp:docPr id="50" name="Image50" descr="Hoja Agregar vendedor con nombre, correo y contraseña, y el botón Crear vendedor señalado"/>
             <wp:cNvGraphicFramePr>
@@ -8318,7 +8353,7 @@
                   <pic:spPr bwMode="auto">
                     <a:xfrm>
                       <a:off x="0" y="0"/>
-                      <a:ext cx="2339975" cy="5064125"/>
+                      <a:ext cx="2592070" cy="5328920"/>
                     </a:xfrm>
                     <a:prstGeom prst="rect">
                       <a:avLst/>
@@ -8428,7 +8463,7 @@
         <w:rPr/>
         <w:drawing>
           <wp:inline distT="0" distB="0" distL="0" distR="0">
-            <wp:extent cx="2339975" cy="5064125"/>
+            <wp:extent cx="2592070" cy="5328920"/>
             <wp:effectExtent l="0" t="0" r="0" b="0"/>
             <wp:docPr id="51" name="Image51" descr="Lista del equipo: tú como propietario y dos vendedores activos"/>
             <wp:cNvGraphicFramePr>
@@ -8452,7 +8487,7 @@
                   <pic:spPr bwMode="auto">
                     <a:xfrm>
                       <a:off x="0" y="0"/>
-                      <a:ext cx="2339975" cy="5064125"/>
+                      <a:ext cx="2592070" cy="5328920"/>
                     </a:xfrm>
                     <a:prstGeom prst="rect">
                       <a:avLst/>
@@ -8652,7 +8687,7 @@
         <w:rPr/>
         <w:drawing>
           <wp:inline distT="0" distB="0" distL="0" distR="0">
-            <wp:extent cx="2339975" cy="5064125"/>
+            <wp:extent cx="2592070" cy="5328920"/>
             <wp:effectExtent l="0" t="0" r="0" b="0"/>
             <wp:docPr id="52" name="Image52" descr="Confirmación ¿Dar de baja a Beto? con los botones Mantener activo y Dar de baja"/>
             <wp:cNvGraphicFramePr>
@@ -8676,7 +8711,7 @@
                   <pic:spPr bwMode="auto">
                     <a:xfrm>
                       <a:off x="0" y="0"/>
-                      <a:ext cx="2339975" cy="5064125"/>
+                      <a:ext cx="2592070" cy="5328920"/>
                     </a:xfrm>
                     <a:prstGeom prst="rect">
                       <a:avLst/>
@@ -8752,7 +8787,7 @@
         <w:rPr/>
         <w:drawing>
           <wp:inline distT="0" distB="0" distL="0" distR="0">
-            <wp:extent cx="2339975" cy="5064125"/>
+            <wp:extent cx="2592070" cy="5328920"/>
             <wp:effectExtent l="0" t="0" r="0" b="0"/>
             <wp:docPr id="53" name="Image53" descr="Fila del vendedor dado de baja con el botón Reactivar señalado"/>
             <wp:cNvGraphicFramePr>
@@ -8776,7 +8811,7 @@
                   <pic:spPr bwMode="auto">
                     <a:xfrm>
                       <a:off x="0" y="0"/>
-                      <a:ext cx="2339975" cy="5064125"/>
+                      <a:ext cx="2592070" cy="5328920"/>
                     </a:xfrm>
                     <a:prstGeom prst="rect">
                       <a:avLst/>
@@ -8812,7 +8847,7 @@
         <w:pStyle w:val="Heading2"/>
         <w:rPr/>
       </w:pPr>
-      <w:bookmarkStart w:id="49" w:name="__RefHeading___Toc1939_3230924885"/>
+      <w:bookmarkStart w:id="49" w:name="__RefHeading___Toc2149_2420786254"/>
       <w:bookmarkStart w:id="50" w:name="ver-el-trabajo-de-tu-equipo"/>
       <w:bookmarkEnd w:id="49"/>
       <w:r>
@@ -8867,7 +8902,7 @@
         <w:rPr/>
         <w:drawing>
           <wp:inline distT="0" distB="0" distL="0" distR="0">
-            <wp:extent cx="2339975" cy="6522085"/>
+            <wp:extent cx="2592070" cy="6793865"/>
             <wp:effectExtent l="0" t="0" r="0" b="0"/>
             <wp:docPr id="54" name="Image54" descr="Pantalla Hoy del propietario con el bloque Por vendedor señalado"/>
             <wp:cNvGraphicFramePr>
@@ -8891,7 +8926,7 @@
                   <pic:spPr bwMode="auto">
                     <a:xfrm>
                       <a:off x="0" y="0"/>
-                      <a:ext cx="2339975" cy="6522085"/>
+                      <a:ext cx="2592070" cy="6793865"/>
                     </a:xfrm>
                     <a:prstGeom prst="rect">
                       <a:avLst/>
@@ -8940,7 +8975,7 @@
         <w:rPr/>
         <w:drawing>
           <wp:inline distT="0" distB="0" distL="0" distR="0">
-            <wp:extent cx="4860290" cy="4689475"/>
+            <wp:extent cx="5255895" cy="4962525"/>
             <wp:effectExtent l="0" t="0" r="0" b="0"/>
             <wp:docPr id="55" name="Image55" descr="Pendientes con el bloque Por vendedor señalado"/>
             <wp:cNvGraphicFramePr>
@@ -8964,7 +8999,7 @@
                   <pic:spPr bwMode="auto">
                     <a:xfrm>
                       <a:off x="0" y="0"/>
-                      <a:ext cx="4860290" cy="4689475"/>
+                      <a:ext cx="5255895" cy="4962525"/>
                     </a:xfrm>
                     <a:prstGeom prst="rect">
                       <a:avLst/>
@@ -9024,7 +9059,7 @@
         <w:rPr/>
         <w:drawing>
           <wp:inline distT="0" distB="0" distL="0" distR="0">
-            <wp:extent cx="2339975" cy="5064125"/>
+            <wp:extent cx="2592070" cy="5328920"/>
             <wp:effectExtent l="0" t="0" r="0" b="0"/>
             <wp:docPr id="56" name="Image56" descr="Filtro del Historial con el campo Vendedor señalado"/>
             <wp:cNvGraphicFramePr>
@@ -9048,7 +9083,7 @@
                   <pic:spPr bwMode="auto">
                     <a:xfrm>
                       <a:off x="0" y="0"/>
-                      <a:ext cx="2339975" cy="5064125"/>
+                      <a:ext cx="2592070" cy="5328920"/>
                     </a:xfrm>
                     <a:prstGeom prst="rect">
                       <a:avLst/>
@@ -9119,7 +9154,7 @@
         <w:rPr/>
         <w:drawing>
           <wp:inline distT="0" distB="0" distL="0" distR="0">
-            <wp:extent cx="2339975" cy="5064125"/>
+            <wp:extent cx="2592070" cy="5328920"/>
             <wp:effectExtent l="0" t="0" r="0" b="0"/>
             <wp:docPr id="57" name="Image57" descr="Menú Más con la opción Reportes por vendedor señalada"/>
             <wp:cNvGraphicFramePr>
@@ -9143,7 +9178,7 @@
                   <pic:spPr bwMode="auto">
                     <a:xfrm>
                       <a:off x="0" y="0"/>
-                      <a:ext cx="2339975" cy="5064125"/>
+                      <a:ext cx="2592070" cy="5328920"/>
                     </a:xfrm>
                     <a:prstGeom prst="rect">
                       <a:avLst/>
@@ -9207,7 +9242,7 @@
         <w:rPr/>
         <w:drawing>
           <wp:inline distT="0" distB="0" distL="0" distR="0">
-            <wp:extent cx="4860290" cy="4750435"/>
+            <wp:extent cx="5255895" cy="5023485"/>
             <wp:effectExtent l="0" t="0" r="0" b="0"/>
             <wp:docPr id="58" name="Image58" descr="Reportes por vendedor: totales de la tienda y una tarjeta por persona"/>
             <wp:cNvGraphicFramePr>
@@ -9231,7 +9266,7 @@
                   <pic:spPr bwMode="auto">
                     <a:xfrm>
                       <a:off x="0" y="0"/>
-                      <a:ext cx="4860290" cy="4750435"/>
+                      <a:ext cx="5255895" cy="5023485"/>
                     </a:xfrm>
                     <a:prstGeom prst="rect">
                       <a:avLst/>
@@ -9284,7 +9319,7 @@
         <w:rPr/>
         <w:drawing>
           <wp:inline distT="0" distB="0" distL="0" distR="0">
-            <wp:extent cx="4258945" cy="7021830"/>
+            <wp:extent cx="4442460" cy="7019925"/>
             <wp:effectExtent l="0" t="0" r="0" b="0"/>
             <wp:docPr id="59" name="Image59" descr="Detalle del vendedor: lo que se le debe, ventas y cobros del periodo"/>
             <wp:cNvGraphicFramePr>
@@ -9308,7 +9343,7 @@
                   <pic:spPr bwMode="auto">
                     <a:xfrm>
                       <a:off x="0" y="0"/>
-                      <a:ext cx="4258945" cy="7021830"/>
+                      <a:ext cx="4442460" cy="7019925"/>
                     </a:xfrm>
                     <a:prstGeom prst="rect">
                       <a:avLst/>
@@ -9379,7 +9414,7 @@
         <w:rPr/>
         <w:drawing>
           <wp:inline distT="0" distB="0" distL="0" distR="0">
-            <wp:extent cx="2339975" cy="5064125"/>
+            <wp:extent cx="2592070" cy="5328920"/>
             <wp:effectExtent l="0" t="0" r="0" b="0"/>
             <wp:docPr id="60" name="Image60" descr="Inventario de un vendedor, en solo lectura"/>
             <wp:cNvGraphicFramePr>
@@ -9403,7 +9438,7 @@
                   <pic:spPr bwMode="auto">
                     <a:xfrm>
                       <a:off x="0" y="0"/>
-                      <a:ext cx="2339975" cy="5064125"/>
+                      <a:ext cx="2592070" cy="5328920"/>
                     </a:xfrm>
                     <a:prstGeom prst="rect">
                       <a:avLst/>
@@ -9450,7 +9485,7 @@
         <w:pStyle w:val="Heading1"/>
         <w:rPr/>
       </w:pPr>
-      <w:bookmarkStart w:id="51" w:name="__RefHeading___Toc1941_3230924885"/>
+      <w:bookmarkStart w:id="51" w:name="__RefHeading___Toc2151_2420786254"/>
       <w:bookmarkStart w:id="52" w:name="parte-3.-guía-del-vendedor"/>
       <w:bookmarkEnd w:id="51"/>
       <w:r>
@@ -9473,7 +9508,7 @@
         <w:pStyle w:val="Heading2"/>
         <w:rPr/>
       </w:pPr>
-      <w:bookmarkStart w:id="53" w:name="__RefHeading___Toc1943_3230924885"/>
+      <w:bookmarkStart w:id="53" w:name="__RefHeading___Toc2153_2420786254"/>
       <w:bookmarkStart w:id="54" w:name="lo-que-puedes-y-lo-que-no"/>
       <w:bookmarkEnd w:id="53"/>
       <w:r>
@@ -9487,6 +9522,7 @@
         <w:tblW w:w="5000" w:type="pct"/>
         <w:jc w:val="left"/>
         <w:tblInd w:w="105" w:type="dxa"/>
+        <w:shd w:fill="F8FAFD" w:val="clear"/>
         <w:tblLayout w:type="fixed"/>
         <w:tblCellMar>
           <w:top w:w="60" w:type="dxa"/>
@@ -9508,7 +9544,7 @@
           <w:tcPr>
             <w:tcW w:w="4872" w:type="dxa"/>
             <w:tcBorders/>
-            <w:shd w:color="auto" w:fill="E3E9FB" w:val="clear"/>
+            <w:shd w:color="auto" w:fill="DCE5FB" w:val="clear"/>
           </w:tcPr>
           <w:p>
             <w:pPr>
@@ -9538,7 +9574,7 @@
           <w:tcPr>
             <w:tcW w:w="4873" w:type="dxa"/>
             <w:tcBorders/>
-            <w:shd w:color="auto" w:fill="E3E9FB" w:val="clear"/>
+            <w:shd w:color="auto" w:fill="DCE5FB" w:val="clear"/>
           </w:tcPr>
           <w:p>
             <w:pPr>
@@ -9571,6 +9607,7 @@
           <w:tcPr>
             <w:tcW w:w="4872" w:type="dxa"/>
             <w:tcBorders/>
+            <w:shd w:color="auto" w:fill="F8FAFD" w:val="clear"/>
           </w:tcPr>
           <w:p>
             <w:pPr>
@@ -9598,6 +9635,7 @@
           <w:tcPr>
             <w:tcW w:w="4873" w:type="dxa"/>
             <w:tcBorders/>
+            <w:shd w:color="auto" w:fill="F8FAFD" w:val="clear"/>
           </w:tcPr>
           <w:p>
             <w:pPr>
@@ -9628,6 +9666,7 @@
           <w:tcPr>
             <w:tcW w:w="4872" w:type="dxa"/>
             <w:tcBorders/>
+            <w:shd w:color="auto" w:fill="F8FAFD" w:val="clear"/>
           </w:tcPr>
           <w:p>
             <w:pPr>
@@ -9655,6 +9694,7 @@
           <w:tcPr>
             <w:tcW w:w="4873" w:type="dxa"/>
             <w:tcBorders/>
+            <w:shd w:color="auto" w:fill="F8FAFD" w:val="clear"/>
           </w:tcPr>
           <w:p>
             <w:pPr>
@@ -9685,6 +9725,7 @@
           <w:tcPr>
             <w:tcW w:w="4872" w:type="dxa"/>
             <w:tcBorders/>
+            <w:shd w:color="auto" w:fill="F8FAFD" w:val="clear"/>
           </w:tcPr>
           <w:p>
             <w:pPr>
@@ -9712,6 +9753,7 @@
           <w:tcPr>
             <w:tcW w:w="4873" w:type="dxa"/>
             <w:tcBorders/>
+            <w:shd w:color="auto" w:fill="F8FAFD" w:val="clear"/>
           </w:tcPr>
           <w:p>
             <w:pPr>
@@ -9742,6 +9784,7 @@
           <w:tcPr>
             <w:tcW w:w="4872" w:type="dxa"/>
             <w:tcBorders/>
+            <w:shd w:color="auto" w:fill="F8FAFD" w:val="clear"/>
           </w:tcPr>
           <w:p>
             <w:pPr>
@@ -9805,6 +9848,7 @@
           <w:tcPr>
             <w:tcW w:w="4873" w:type="dxa"/>
             <w:tcBorders/>
+            <w:shd w:color="auto" w:fill="F8FAFD" w:val="clear"/>
           </w:tcPr>
           <w:p>
             <w:pPr>
@@ -9835,6 +9879,7 @@
           <w:tcPr>
             <w:tcW w:w="4872" w:type="dxa"/>
             <w:tcBorders/>
+            <w:shd w:color="auto" w:fill="F8FAFD" w:val="clear"/>
           </w:tcPr>
           <w:p>
             <w:pPr>
@@ -9898,6 +9943,7 @@
           <w:tcPr>
             <w:tcW w:w="4873" w:type="dxa"/>
             <w:tcBorders/>
+            <w:shd w:color="auto" w:fill="F8FAFD" w:val="clear"/>
           </w:tcPr>
           <w:p>
             <w:pPr>
@@ -9953,7 +9999,7 @@
         <w:rPr/>
         <w:drawing>
           <wp:inline distT="0" distB="0" distL="0" distR="0">
-            <wp:extent cx="2339975" cy="5064125"/>
+            <wp:extent cx="2592070" cy="5328920"/>
             <wp:effectExtent l="0" t="0" r="0" b="0"/>
             <wp:docPr id="61" name="Image61" descr="Menú Más del vendedor: Mis ventas, Mis reportes y Perfil"/>
             <wp:cNvGraphicFramePr>
@@ -9977,7 +10023,7 @@
                   <pic:spPr bwMode="auto">
                     <a:xfrm>
                       <a:off x="0" y="0"/>
-                      <a:ext cx="2339975" cy="5064125"/>
+                      <a:ext cx="2592070" cy="5328920"/>
                     </a:xfrm>
                     <a:prstGeom prst="rect">
                       <a:avLst/>
@@ -10037,7 +10083,7 @@
         <w:rPr/>
         <w:drawing>
           <wp:inline distT="0" distB="0" distL="0" distR="0">
-            <wp:extent cx="2339975" cy="5064125"/>
+            <wp:extent cx="2592070" cy="5328920"/>
             <wp:effectExtent l="0" t="0" r="0" b="0"/>
             <wp:docPr id="62" name="Image62" descr="Pantalla Hoy con el aviso “No tienes acceso a esa pantalla.”"/>
             <wp:cNvGraphicFramePr>
@@ -10061,7 +10107,7 @@
                   <pic:spPr bwMode="auto">
                     <a:xfrm>
                       <a:off x="0" y="0"/>
-                      <a:ext cx="2339975" cy="5064125"/>
+                      <a:ext cx="2592070" cy="5328920"/>
                     </a:xfrm>
                     <a:prstGeom prst="rect">
                       <a:avLst/>
@@ -10091,7 +10137,7 @@
         <w:pStyle w:val="Heading2"/>
         <w:rPr/>
       </w:pPr>
-      <w:bookmarkStart w:id="56" w:name="__RefHeading___Toc1945_3230924885"/>
+      <w:bookmarkStart w:id="56" w:name="__RefHeading___Toc2155_2420786254"/>
       <w:bookmarkStart w:id="57" w:name="tu-día-de-trabajo"/>
       <w:bookmarkEnd w:id="56"/>
       <w:r>
@@ -10140,7 +10186,7 @@
         <w:rPr/>
         <w:drawing>
           <wp:inline distT="0" distB="0" distL="0" distR="0">
-            <wp:extent cx="2339975" cy="5064125"/>
+            <wp:extent cx="2592070" cy="5328920"/>
             <wp:effectExtent l="0" t="0" r="0" b="0"/>
             <wp:docPr id="63" name="Image63" descr="Hoy del vendedor sin el día preparado y el botón Preparar día señalado"/>
             <wp:cNvGraphicFramePr>
@@ -10164,7 +10210,7 @@
                   <pic:spPr bwMode="auto">
                     <a:xfrm>
                       <a:off x="0" y="0"/>
-                      <a:ext cx="2339975" cy="5064125"/>
+                      <a:ext cx="2592070" cy="5328920"/>
                     </a:xfrm>
                     <a:prstGeom prst="rect">
                       <a:avLst/>
@@ -10254,7 +10300,7 @@
         <w:rPr/>
         <w:drawing>
           <wp:inline distT="0" distB="0" distL="0" distR="0">
-            <wp:extent cx="2339975" cy="5064125"/>
+            <wp:extent cx="2592070" cy="5328920"/>
             <wp:effectExtent l="0" t="0" r="0" b="0"/>
             <wp:docPr id="64" name="Image64" descr="Lista de productos del propietario al agregar un producto al día"/>
             <wp:cNvGraphicFramePr>
@@ -10278,7 +10324,7 @@
                   <pic:spPr bwMode="auto">
                     <a:xfrm>
                       <a:off x="0" y="0"/>
-                      <a:ext cx="2339975" cy="5064125"/>
+                      <a:ext cx="2592070" cy="5328920"/>
                     </a:xfrm>
                     <a:prstGeom prst="rect">
                       <a:avLst/>
@@ -10365,7 +10411,7 @@
         <w:rPr/>
         <w:drawing>
           <wp:inline distT="0" distB="0" distL="0" distR="0">
-            <wp:extent cx="2339975" cy="6510020"/>
+            <wp:extent cx="2592070" cy="6781165"/>
             <wp:effectExtent l="0" t="0" r="0" b="0"/>
             <wp:docPr id="65" name="Image65" descr="Día preparado del vendedor con sus productos y cantidades"/>
             <wp:cNvGraphicFramePr>
@@ -10389,7 +10435,7 @@
                   <pic:spPr bwMode="auto">
                     <a:xfrm>
                       <a:off x="0" y="0"/>
-                      <a:ext cx="2339975" cy="6510020"/>
+                      <a:ext cx="2592070" cy="6781165"/>
                     </a:xfrm>
                     <a:prstGeom prst="rect">
                       <a:avLst/>
@@ -10508,7 +10554,7 @@
         <w:pStyle w:val="Heading2"/>
         <w:rPr/>
       </w:pPr>
-      <w:bookmarkStart w:id="58" w:name="__RefHeading___Toc1947_3230924885"/>
+      <w:bookmarkStart w:id="58" w:name="__RefHeading___Toc2157_2420786254"/>
       <w:bookmarkStart w:id="59" w:name="consultar-lo-tuyo"/>
       <w:bookmarkEnd w:id="58"/>
       <w:r>
@@ -10564,7 +10610,7 @@
         <w:rPr/>
         <w:drawing>
           <wp:inline distT="0" distB="0" distL="0" distR="0">
-            <wp:extent cx="2339975" cy="5064125"/>
+            <wp:extent cx="2592070" cy="5328920"/>
             <wp:effectExtent l="0" t="0" r="0" b="0"/>
             <wp:docPr id="66" name="Image66" descr="Mis ventas: solo las ventas de este vendedor"/>
             <wp:cNvGraphicFramePr>
@@ -10588,7 +10634,7 @@
                   <pic:spPr bwMode="auto">
                     <a:xfrm>
                       <a:off x="0" y="0"/>
-                      <a:ext cx="2339975" cy="5064125"/>
+                      <a:ext cx="2592070" cy="5328920"/>
                     </a:xfrm>
                     <a:prstGeom prst="rect">
                       <a:avLst/>
@@ -10659,7 +10705,7 @@
         <w:rPr/>
         <w:drawing>
           <wp:inline distT="0" distB="0" distL="0" distR="0">
-            <wp:extent cx="4860290" cy="4881245"/>
+            <wp:extent cx="5255895" cy="5154930"/>
             <wp:effectExtent l="0" t="0" r="0" b="0"/>
             <wp:docPr id="67" name="Image67" descr="Mis reportes: ventas, cobrado, pendiente por cobrar y utilidad bruta del vendedor"/>
             <wp:cNvGraphicFramePr>
@@ -10683,7 +10729,7 @@
                   <pic:spPr bwMode="auto">
                     <a:xfrm>
                       <a:off x="0" y="0"/>
-                      <a:ext cx="4860290" cy="4881245"/>
+                      <a:ext cx="5255895" cy="5154930"/>
                     </a:xfrm>
                     <a:prstGeom prst="rect">
                       <a:avLst/>
@@ -10733,7 +10779,7 @@
         <w:pStyle w:val="Heading2"/>
         <w:rPr/>
       </w:pPr>
-      <w:bookmarkStart w:id="60" w:name="__RefHeading___Toc1949_3230924885"/>
+      <w:bookmarkStart w:id="60" w:name="__RefHeading___Toc2159_2420786254"/>
       <w:bookmarkStart w:id="61" w:name="si-tu-cuenta-es-dada-de-baja"/>
       <w:bookmarkEnd w:id="60"/>
       <w:r>
@@ -10760,7 +10806,7 @@
         <w:rPr/>
         <w:drawing>
           <wp:inline distT="0" distB="0" distL="0" distR="0">
-            <wp:extent cx="2339975" cy="5064125"/>
+            <wp:extent cx="2592070" cy="5328920"/>
             <wp:effectExtent l="0" t="0" r="0" b="0"/>
             <wp:docPr id="68" name="Image68" descr="Pantalla “Tu cuenta fue dada de baja” con el botón Cerrar sesión"/>
             <wp:cNvGraphicFramePr>
@@ -10784,7 +10830,7 @@
                   <pic:spPr bwMode="auto">
                     <a:xfrm>
                       <a:off x="0" y="0"/>
-                      <a:ext cx="2339975" cy="5064125"/>
+                      <a:ext cx="2592070" cy="5328920"/>
                     </a:xfrm>
                     <a:prstGeom prst="rect">
                       <a:avLst/>
@@ -10816,7 +10862,7 @@
         <w:pStyle w:val="Heading1"/>
         <w:rPr/>
       </w:pPr>
-      <w:bookmarkStart w:id="64" w:name="__RefHeading___Toc1951_3230924885"/>
+      <w:bookmarkStart w:id="64" w:name="__RefHeading___Toc2161_2420786254"/>
       <w:bookmarkEnd w:id="64"/>
       <w:r>
         <w:rPr/>
@@ -10829,6 +10875,7 @@
         <w:tblW w:w="5000" w:type="pct"/>
         <w:jc w:val="left"/>
         <w:tblInd w:w="0" w:type="dxa"/>
+        <w:shd w:fill="F8FAFD" w:val="clear"/>
         <w:tblLayout w:type="fixed"/>
         <w:tblCellMar>
           <w:top w:w="60" w:type="dxa"/>
@@ -10850,7 +10897,7 @@
           <w:tcPr>
             <w:tcW w:w="4872" w:type="dxa"/>
             <w:tcBorders/>
-            <w:shd w:color="auto" w:fill="E3E9FB" w:val="clear"/>
+            <w:shd w:color="auto" w:fill="DCE5FB" w:val="clear"/>
           </w:tcPr>
           <w:p>
             <w:pPr>
@@ -10880,7 +10927,7 @@
           <w:tcPr>
             <w:tcW w:w="4873" w:type="dxa"/>
             <w:tcBorders/>
-            <w:shd w:color="auto" w:fill="E3E9FB" w:val="clear"/>
+            <w:shd w:color="auto" w:fill="DCE5FB" w:val="clear"/>
           </w:tcPr>
           <w:p>
             <w:pPr>
@@ -10913,6 +10960,7 @@
           <w:tcPr>
             <w:tcW w:w="4872" w:type="dxa"/>
             <w:tcBorders/>
+            <w:shd w:color="auto" w:fill="F8FAFD" w:val="clear"/>
           </w:tcPr>
           <w:p>
             <w:pPr>
@@ -10942,6 +10990,7 @@
           <w:tcPr>
             <w:tcW w:w="4873" w:type="dxa"/>
             <w:tcBorders/>
+            <w:shd w:color="auto" w:fill="F8FAFD" w:val="clear"/>
           </w:tcPr>
           <w:p>
             <w:pPr>
@@ -10972,6 +11021,7 @@
           <w:tcPr>
             <w:tcW w:w="4872" w:type="dxa"/>
             <w:tcBorders/>
+            <w:shd w:color="auto" w:fill="F8FAFD" w:val="clear"/>
           </w:tcPr>
           <w:p>
             <w:pPr>
@@ -11001,6 +11051,7 @@
           <w:tcPr>
             <w:tcW w:w="4873" w:type="dxa"/>
             <w:tcBorders/>
+            <w:shd w:color="auto" w:fill="F8FAFD" w:val="clear"/>
           </w:tcPr>
           <w:p>
             <w:pPr>
@@ -11031,6 +11082,7 @@
           <w:tcPr>
             <w:tcW w:w="4872" w:type="dxa"/>
             <w:tcBorders/>
+            <w:shd w:color="auto" w:fill="F8FAFD" w:val="clear"/>
           </w:tcPr>
           <w:p>
             <w:pPr>
@@ -11060,6 +11112,7 @@
           <w:tcPr>
             <w:tcW w:w="4873" w:type="dxa"/>
             <w:tcBorders/>
+            <w:shd w:color="auto" w:fill="F8FAFD" w:val="clear"/>
           </w:tcPr>
           <w:p>
             <w:pPr>
@@ -11090,6 +11143,7 @@
           <w:tcPr>
             <w:tcW w:w="4872" w:type="dxa"/>
             <w:tcBorders/>
+            <w:shd w:color="auto" w:fill="F8FAFD" w:val="clear"/>
           </w:tcPr>
           <w:p>
             <w:pPr>
@@ -11119,6 +11173,7 @@
           <w:tcPr>
             <w:tcW w:w="4873" w:type="dxa"/>
             <w:tcBorders/>
+            <w:shd w:color="auto" w:fill="F8FAFD" w:val="clear"/>
           </w:tcPr>
           <w:p>
             <w:pPr>
@@ -11149,6 +11204,7 @@
           <w:tcPr>
             <w:tcW w:w="4872" w:type="dxa"/>
             <w:tcBorders/>
+            <w:shd w:color="auto" w:fill="F8FAFD" w:val="clear"/>
           </w:tcPr>
           <w:p>
             <w:pPr>
@@ -11178,6 +11234,7 @@
           <w:tcPr>
             <w:tcW w:w="4873" w:type="dxa"/>
             <w:tcBorders/>
+            <w:shd w:color="auto" w:fill="F8FAFD" w:val="clear"/>
           </w:tcPr>
           <w:p>
             <w:pPr>
@@ -11208,6 +11265,7 @@
           <w:tcPr>
             <w:tcW w:w="4872" w:type="dxa"/>
             <w:tcBorders/>
+            <w:shd w:color="auto" w:fill="F8FAFD" w:val="clear"/>
           </w:tcPr>
           <w:p>
             <w:pPr>
@@ -11237,6 +11295,7 @@
           <w:tcPr>
             <w:tcW w:w="4873" w:type="dxa"/>
             <w:tcBorders/>
+            <w:shd w:color="auto" w:fill="F8FAFD" w:val="clear"/>
           </w:tcPr>
           <w:p>
             <w:pPr>
@@ -11267,6 +11326,7 @@
           <w:tcPr>
             <w:tcW w:w="4872" w:type="dxa"/>
             <w:tcBorders/>
+            <w:shd w:color="auto" w:fill="F8FAFD" w:val="clear"/>
           </w:tcPr>
           <w:p>
             <w:pPr>
@@ -11296,6 +11356,7 @@
           <w:tcPr>
             <w:tcW w:w="4873" w:type="dxa"/>
             <w:tcBorders/>
+            <w:shd w:color="auto" w:fill="F8FAFD" w:val="clear"/>
           </w:tcPr>
           <w:p>
             <w:pPr>
@@ -11326,6 +11387,7 @@
           <w:tcPr>
             <w:tcW w:w="4872" w:type="dxa"/>
             <w:tcBorders/>
+            <w:shd w:color="auto" w:fill="F8FAFD" w:val="clear"/>
           </w:tcPr>
           <w:p>
             <w:pPr>
@@ -11355,6 +11417,7 @@
           <w:tcPr>
             <w:tcW w:w="4873" w:type="dxa"/>
             <w:tcBorders/>
+            <w:shd w:color="auto" w:fill="F8FAFD" w:val="clear"/>
           </w:tcPr>
           <w:p>
             <w:pPr>
@@ -11385,6 +11448,7 @@
           <w:tcPr>
             <w:tcW w:w="4872" w:type="dxa"/>
             <w:tcBorders/>
+            <w:shd w:color="auto" w:fill="F8FAFD" w:val="clear"/>
           </w:tcPr>
           <w:p>
             <w:pPr>
@@ -11414,6 +11478,7 @@
           <w:tcPr>
             <w:tcW w:w="4873" w:type="dxa"/>
             <w:tcBorders/>
+            <w:shd w:color="auto" w:fill="F8FAFD" w:val="clear"/>
           </w:tcPr>
           <w:p>
             <w:pPr>
@@ -11462,6 +11527,7 @@
           <w:tcPr>
             <w:tcW w:w="4872" w:type="dxa"/>
             <w:tcBorders/>
+            <w:shd w:color="auto" w:fill="F8FAFD" w:val="clear"/>
           </w:tcPr>
           <w:p>
             <w:pPr>
@@ -11491,6 +11557,7 @@
           <w:tcPr>
             <w:tcW w:w="4873" w:type="dxa"/>
             <w:tcBorders/>
+            <w:shd w:color="auto" w:fill="F8FAFD" w:val="clear"/>
           </w:tcPr>
           <w:p>
             <w:pPr>
@@ -11521,6 +11588,7 @@
           <w:tcPr>
             <w:tcW w:w="4872" w:type="dxa"/>
             <w:tcBorders/>
+            <w:shd w:color="auto" w:fill="F8FAFD" w:val="clear"/>
           </w:tcPr>
           <w:p>
             <w:pPr>
@@ -11550,6 +11618,7 @@
           <w:tcPr>
             <w:tcW w:w="4873" w:type="dxa"/>
             <w:tcBorders/>
+            <w:shd w:color="auto" w:fill="F8FAFD" w:val="clear"/>
           </w:tcPr>
           <w:p>
             <w:pPr>
@@ -11580,6 +11649,7 @@
           <w:tcPr>
             <w:tcW w:w="4872" w:type="dxa"/>
             <w:tcBorders/>
+            <w:shd w:color="auto" w:fill="F8FAFD" w:val="clear"/>
           </w:tcPr>
           <w:p>
             <w:pPr>
@@ -11609,6 +11679,7 @@
           <w:tcPr>
             <w:tcW w:w="4873" w:type="dxa"/>
             <w:tcBorders/>
+            <w:shd w:color="auto" w:fill="F8FAFD" w:val="clear"/>
           </w:tcPr>
           <w:p>
             <w:pPr>
@@ -11637,14 +11708,18 @@
       </w:tr>
     </w:tbl>
     <w:sectPr>
-      <w:footerReference w:type="even" r:id="rId70"/>
-      <w:footerReference w:type="default" r:id="rId71"/>
-      <w:footerReference w:type="first" r:id="rId72"/>
+      <w:headerReference w:type="even" r:id="rId70"/>
+      <w:headerReference w:type="default" r:id="rId71"/>
+      <w:headerReference w:type="first" r:id="rId72"/>
+      <w:footerReference w:type="even" r:id="rId73"/>
+      <w:footerReference w:type="default" r:id="rId74"/>
+      <w:footerReference w:type="first" r:id="rId75"/>
       <w:type w:val="nextPage"/>
       <w:pgSz w:w="12240" w:h="15840"/>
-      <w:pgMar w:left="1247" w:right="1247" w:gutter="0" w:header="0" w:top="1247" w:footer="720" w:bottom="1247"/>
+      <w:pgMar w:left="1247" w:right="1247" w:gutter="0" w:header="720" w:top="1247" w:footer="720" w:bottom="1247"/>
       <w:pgNumType w:fmt="decimal"/>
       <w:formProt w:val="false"/>
+      <w:titlePg/>
       <w:textDirection w:val="lrTb"/>
       <w:docGrid w:type="default" w:linePitch="100" w:charSpace="0"/>
     </w:sectPr>
@@ -11678,14 +11753,14 @@
     </w:pPr>
     <w:r>
       <w:rPr>
-        <w:color w:val="5B6578"/>
+        <w:color w:val="4D5F79"/>
         <w:sz w:val="18"/>
       </w:rPr>
       <w:t xml:space="preserve">Manual de usuario · Página </w:t>
     </w:r>
     <w:r>
       <w:rPr>
-        <w:color w:val="5B6578"/>
+        <w:color w:val="4D5F79"/>
         <w:sz w:val="18"/>
       </w:rPr>
       <w:fldChar w:fldCharType="begin"/>
@@ -11693,28 +11768,28 @@
     <w:r>
       <w:rPr>
         <w:sz w:val="18"/>
-        <w:color w:val="5B6578"/>
+        <w:color w:val="4D5F79"/>
       </w:rPr>
       <w:instrText xml:space="preserve"> PAGE </w:instrText>
     </w:r>
     <w:r>
       <w:rPr>
         <w:sz w:val="18"/>
-        <w:color w:val="5B6578"/>
+        <w:color w:val="4D5F79"/>
       </w:rPr>
       <w:fldChar w:fldCharType="separate"/>
     </w:r>
     <w:r>
       <w:rPr>
         <w:sz w:val="18"/>
-        <w:color w:val="5B6578"/>
+        <w:color w:val="4D5F79"/>
       </w:rPr>
       <w:t>74</w:t>
     </w:r>
     <w:r>
       <w:rPr>
         <w:sz w:val="18"/>
-        <w:color w:val="5B6578"/>
+        <w:color w:val="4D5F79"/>
       </w:rPr>
       <w:fldChar w:fldCharType="end"/>
     </w:r>
@@ -11728,53 +11803,148 @@
     <w:pPr>
       <w:pStyle w:val="Footer"/>
       <w:spacing w:before="0" w:after="80"/>
-      <w:jc w:val="center"/>
       <w:rPr/>
     </w:pPr>
     <w:r>
-      <w:rPr>
-        <w:color w:val="5B6578"/>
-        <w:sz w:val="18"/>
-      </w:rPr>
-      <w:t xml:space="preserve">Manual de usuario · Página </w:t>
-    </w:r>
-    <w:r>
-      <w:rPr>
-        <w:color w:val="5B6578"/>
-        <w:sz w:val="18"/>
-      </w:rPr>
-      <w:fldChar w:fldCharType="begin"/>
-    </w:r>
-    <w:r>
-      <w:rPr>
-        <w:sz w:val="18"/>
-        <w:color w:val="5B6578"/>
-      </w:rPr>
-      <w:instrText xml:space="preserve"> PAGE </w:instrText>
-    </w:r>
-    <w:r>
-      <w:rPr>
-        <w:sz w:val="18"/>
-        <w:color w:val="5B6578"/>
-      </w:rPr>
-      <w:fldChar w:fldCharType="separate"/>
-    </w:r>
-    <w:r>
-      <w:rPr>
-        <w:sz w:val="18"/>
-        <w:color w:val="5B6578"/>
-      </w:rPr>
-      <w:t>74</w:t>
-    </w:r>
-    <w:r>
-      <w:rPr>
-        <w:sz w:val="18"/>
-        <w:color w:val="5B6578"/>
-      </w:rPr>
-      <w:fldChar w:fldCharType="end"/>
+      <w:rPr/>
     </w:r>
   </w:p>
 </w:ftr>
+</file>
+
+<file path=word/header1.xml><?xml version="1.0" encoding="utf-8"?>
+<w:hdr xmlns:o="urn:schemas-microsoft-com:office:office" xmlns:r="http://schemas.openxmlformats.org/officeDocument/2006/relationships" xmlns:v="urn:schemas-microsoft-com:vml" xmlns:w="http://schemas.openxmlformats.org/wordprocessingml/2006/main" xmlns:w10="urn:schemas-microsoft-com:office:word" xmlns:wp="http://schemas.openxmlformats.org/drawingml/2006/wordprocessingDrawing" xmlns:wps="http://schemas.microsoft.com/office/word/2010/wordprocessingShape" xmlns:wpg="http://schemas.microsoft.com/office/word/2010/wordprocessingGroup" xmlns:mc="http://schemas.openxmlformats.org/markup-compatibility/2006" xmlns:wp14="http://schemas.microsoft.com/office/word/2010/wordprocessingDrawing" xmlns:w14="http://schemas.microsoft.com/office/word/2010/wordml" xmlns:w15="http://schemas.microsoft.com/office/word/2012/wordml" mc:Ignorable="w14 wp14 w15">
+  <w:p>
+    <w:pPr>
+      <w:pStyle w:val="Header"/>
+      <w:spacing w:before="0" w:after="80"/>
+      <w:rPr/>
+    </w:pPr>
+    <w:r>
+      <w:rPr/>
+    </w:r>
+  </w:p>
+</w:hdr>
+</file>
+
+<file path=word/header2.xml><?xml version="1.0" encoding="utf-8"?>
+<w:hdr xmlns:o="urn:schemas-microsoft-com:office:office" xmlns:r="http://schemas.openxmlformats.org/officeDocument/2006/relationships" xmlns:v="urn:schemas-microsoft-com:vml" xmlns:w="http://schemas.openxmlformats.org/wordprocessingml/2006/main" xmlns:w10="urn:schemas-microsoft-com:office:word" xmlns:wp="http://schemas.openxmlformats.org/drawingml/2006/wordprocessingDrawing" xmlns:wps="http://schemas.microsoft.com/office/word/2010/wordprocessingShape" xmlns:wpg="http://schemas.microsoft.com/office/word/2010/wordprocessingGroup" xmlns:mc="http://schemas.openxmlformats.org/markup-compatibility/2006" xmlns:wp14="http://schemas.microsoft.com/office/word/2010/wordprocessingDrawing" xmlns:w14="http://schemas.microsoft.com/office/word/2010/wordml" xmlns:w15="http://schemas.microsoft.com/office/word/2012/wordml" mc:Ignorable="w14 wp14 w15">
+  <w:p>
+    <w:pPr>
+      <w:pStyle w:val="Header"/>
+      <w:spacing w:before="0" w:after="80"/>
+      <w:rPr/>
+    </w:pPr>
+    <w:r>
+      <w:rPr/>
+      <w:drawing>
+        <wp:anchor behindDoc="1" distT="0" distB="0" distL="0" distR="0" simplePos="0" locked="0" layoutInCell="0" allowOverlap="1" relativeHeight="143">
+          <wp:simplePos x="0" y="0"/>
+          <wp:positionH relativeFrom="page">
+            <wp:posOffset>0</wp:posOffset>
+          </wp:positionH>
+          <wp:positionV relativeFrom="page">
+            <wp:posOffset>0</wp:posOffset>
+          </wp:positionV>
+          <wp:extent cx="7772400" cy="10058400"/>
+          <wp:effectExtent l="0" t="0" r="0" b="0"/>
+          <wp:wrapNone/>
+          <wp:docPr id="69" name="Picture 1" descr=""/>
+          <wp:cNvGraphicFramePr>
+            <a:graphicFrameLocks xmlns:a="http://schemas.openxmlformats.org/drawingml/2006/main" noChangeAspect="1"/>
+          </wp:cNvGraphicFramePr>
+          <a:graphic xmlns:a="http://schemas.openxmlformats.org/drawingml/2006/main">
+            <a:graphicData uri="http://schemas.openxmlformats.org/drawingml/2006/picture">
+              <pic:pic xmlns:pic="http://schemas.openxmlformats.org/drawingml/2006/picture">
+                <pic:nvPicPr>
+                  <pic:cNvPr id="69" name="Picture 1" descr=""/>
+                  <pic:cNvPicPr>
+                    <a:picLocks noChangeAspect="1" noChangeArrowheads="1"/>
+                  </pic:cNvPicPr>
+                </pic:nvPicPr>
+                <pic:blipFill>
+                  <a:blip r:embed="rId1"/>
+                  <a:stretch>
+                    <a:fillRect/>
+                  </a:stretch>
+                </pic:blipFill>
+                <pic:spPr bwMode="auto">
+                  <a:xfrm>
+                    <a:off x="0" y="0"/>
+                    <a:ext cx="7772400" cy="10058400"/>
+                  </a:xfrm>
+                  <a:prstGeom prst="rect">
+                    <a:avLst/>
+                  </a:prstGeom>
+                </pic:spPr>
+              </pic:pic>
+            </a:graphicData>
+          </a:graphic>
+        </wp:anchor>
+      </w:drawing>
+    </w:r>
+  </w:p>
+</w:hdr>
+</file>
+
+<file path=word/header3.xml><?xml version="1.0" encoding="utf-8"?>
+<w:hdr xmlns:o="urn:schemas-microsoft-com:office:office" xmlns:r="http://schemas.openxmlformats.org/officeDocument/2006/relationships" xmlns:v="urn:schemas-microsoft-com:vml" xmlns:w="http://schemas.openxmlformats.org/wordprocessingml/2006/main" xmlns:w10="urn:schemas-microsoft-com:office:word" xmlns:wp="http://schemas.openxmlformats.org/drawingml/2006/wordprocessingDrawing" xmlns:wps="http://schemas.microsoft.com/office/word/2010/wordprocessingShape" xmlns:wpg="http://schemas.microsoft.com/office/word/2010/wordprocessingGroup" xmlns:mc="http://schemas.openxmlformats.org/markup-compatibility/2006" xmlns:wp14="http://schemas.microsoft.com/office/word/2010/wordprocessingDrawing" xmlns:w14="http://schemas.microsoft.com/office/word/2010/wordml" xmlns:w15="http://schemas.microsoft.com/office/word/2012/wordml" mc:Ignorable="w14 wp14 w15">
+  <w:p>
+    <w:pPr>
+      <w:pStyle w:val="Header"/>
+      <w:spacing w:before="0" w:after="80"/>
+      <w:rPr/>
+    </w:pPr>
+    <w:r>
+      <w:rPr/>
+      <w:drawing>
+        <wp:anchor behindDoc="1" distT="0" distB="0" distL="0" distR="0" simplePos="0" locked="0" layoutInCell="0" allowOverlap="1" relativeHeight="69">
+          <wp:simplePos x="0" y="0"/>
+          <wp:positionH relativeFrom="page">
+            <wp:posOffset>0</wp:posOffset>
+          </wp:positionH>
+          <wp:positionV relativeFrom="page">
+            <wp:posOffset>0</wp:posOffset>
+          </wp:positionV>
+          <wp:extent cx="7772400" cy="10058400"/>
+          <wp:effectExtent l="0" t="0" r="0" b="0"/>
+          <wp:wrapNone/>
+          <wp:docPr id="70" name="Image69" descr=""/>
+          <wp:cNvGraphicFramePr>
+            <a:graphicFrameLocks xmlns:a="http://schemas.openxmlformats.org/drawingml/2006/main" noChangeAspect="1"/>
+          </wp:cNvGraphicFramePr>
+          <a:graphic xmlns:a="http://schemas.openxmlformats.org/drawingml/2006/main">
+            <a:graphicData uri="http://schemas.openxmlformats.org/drawingml/2006/picture">
+              <pic:pic xmlns:pic="http://schemas.openxmlformats.org/drawingml/2006/picture">
+                <pic:nvPicPr>
+                  <pic:cNvPr id="70" name="Image69" descr=""/>
+                  <pic:cNvPicPr>
+                    <a:picLocks noChangeAspect="1" noChangeArrowheads="1"/>
+                  </pic:cNvPicPr>
+                </pic:nvPicPr>
+                <pic:blipFill>
+                  <a:blip r:embed="rId1"/>
+                  <a:stretch>
+                    <a:fillRect/>
+                  </a:stretch>
+                </pic:blipFill>
+                <pic:spPr bwMode="auto">
+                  <a:xfrm>
+                    <a:off x="0" y="0"/>
+                    <a:ext cx="7772400" cy="10058400"/>
+                  </a:xfrm>
+                  <a:prstGeom prst="rect">
+                    <a:avLst/>
+                  </a:prstGeom>
+                </pic:spPr>
+              </pic:pic>
+            </a:graphicData>
+          </a:graphic>
+        </wp:anchor>
+      </w:drawing>
+    </w:r>
+  </w:p>
+</w:hdr>
 </file>
 
 <file path=word/numbering.xml><?xml version="1.0" encoding="utf-8"?>
@@ -14602,7 +14772,7 @@
     </w:pPr>
     <w:rPr>
       <w:rFonts w:ascii="Calibri" w:hAnsi="Calibri" w:eastAsia="Calibri" w:cs="Calibri"/>
-      <w:color w:val="1B243B"/>
+      <w:color w:val="10223A"/>
       <w:kern w:val="0"/>
       <w:sz w:val="21"/>
       <w:szCs w:val="24"/>
@@ -14626,7 +14796,7 @@
       <w:rFonts w:ascii="Calibri" w:hAnsi="Calibri" w:eastAsia="Calibri" w:cs="Calibri"/>
       <w:b/>
       <w:bCs/>
-      <w:color w:val="1E3FD0"/>
+      <w:color w:val="1D3FD1"/>
       <w:sz w:val="48"/>
       <w:szCs w:val="32"/>
     </w:rPr>
@@ -14648,7 +14818,7 @@
       <w:rFonts w:ascii="Calibri" w:hAnsi="Calibri" w:eastAsia="Calibri" w:cs="Calibri"/>
       <w:b/>
       <w:bCs/>
-      <w:color w:val="1E3FD0"/>
+      <w:color w:val="1D3FD1"/>
       <w:sz w:val="32"/>
       <w:szCs w:val="28"/>
     </w:rPr>
@@ -14670,7 +14840,7 @@
       <w:rFonts w:ascii="Calibri" w:hAnsi="Calibri" w:eastAsia="Calibri" w:cs="Calibri"/>
       <w:b/>
       <w:bCs/>
-      <w:color w:val="1B243B"/>
+      <w:color w:val="10223A"/>
       <w:sz w:val="25"/>
       <w:szCs w:val="24"/>
     </w:rPr>
@@ -14693,7 +14863,7 @@
       <w:b/>
       <w:bCs/>
       <w:i/>
-      <w:color w:val="1B243B"/>
+      <w:color w:val="10223A"/>
       <w:sz w:val="22"/>
       <w:szCs w:val="24"/>
     </w:rPr>
@@ -15135,7 +15305,7 @@
     </w:pPr>
     <w:rPr>
       <w:rFonts w:ascii="Calibri" w:hAnsi="Calibri" w:eastAsia="Calibri" w:cs="Calibri"/>
-      <w:color w:val="1B243B"/>
+      <w:color w:val="10223A"/>
       <w:sz w:val="21"/>
     </w:rPr>
   </w:style>
@@ -15158,7 +15328,7 @@
     <w:rPr>
       <w:rFonts w:ascii="Calibri" w:hAnsi="Calibri" w:eastAsia="Calibri" w:cs="Calibri"/>
       <w:i/>
-      <w:color w:val="5B6578"/>
+      <w:color w:val="4D5F79"/>
       <w:sz w:val="18"/>
     </w:rPr>
   </w:style>
@@ -15183,7 +15353,7 @@
     </w:pPr>
     <w:rPr>
       <w:rFonts w:ascii="Calibri" w:hAnsi="Calibri" w:eastAsia="Calibri" w:cs="Calibri"/>
-      <w:color w:val="1B243B"/>
+      <w:color w:val="10223A"/>
       <w:sz w:val="21"/>
     </w:rPr>
   </w:style>
@@ -15196,7 +15366,7 @@
     </w:pPr>
     <w:rPr>
       <w:rFonts w:ascii="Calibri" w:hAnsi="Calibri" w:eastAsia="Calibri" w:cs="Calibri"/>
-      <w:color w:val="1B243B"/>
+      <w:color w:val="10223A"/>
       <w:sz w:val="21"/>
     </w:rPr>
   </w:style>
@@ -15215,7 +15385,7 @@
       <w:rFonts w:ascii="Calibri" w:hAnsi="Calibri" w:eastAsia="Calibri" w:cs="Calibri"/>
       <w:b/>
       <w:bCs/>
-      <w:color w:val="1E3FD0"/>
+      <w:color w:val="1D3FD1"/>
       <w:sz w:val="64"/>
       <w:szCs w:val="36"/>
     </w:rPr>
@@ -15233,7 +15403,7 @@
     </w:pPr>
     <w:rPr>
       <w:rFonts w:ascii="Calibri" w:hAnsi="Calibri" w:eastAsia="Calibri" w:cs="Calibri"/>
-      <w:color w:val="5B6578"/>
+      <w:color w:val="4D5F79"/>
       <w:sz w:val="28"/>
       <w:szCs w:val="30"/>
     </w:rPr>
@@ -15252,7 +15422,7 @@
     </w:pPr>
     <w:rPr>
       <w:rFonts w:ascii="Calibri" w:hAnsi="Calibri" w:eastAsia="Calibri" w:cs="Calibri"/>
-      <w:color w:val="5B6578"/>
+      <w:color w:val="4D5F79"/>
       <w:kern w:val="0"/>
       <w:sz w:val="22"/>
       <w:szCs w:val="24"/>
@@ -15273,7 +15443,7 @@
     </w:pPr>
     <w:rPr>
       <w:rFonts w:ascii="Calibri" w:hAnsi="Calibri" w:eastAsia="Calibri" w:cs="Calibri"/>
-      <w:color w:val="5B6578"/>
+      <w:color w:val="4D5F79"/>
       <w:kern w:val="0"/>
       <w:sz w:val="22"/>
       <w:szCs w:val="24"/>
@@ -15329,15 +15499,15 @@
     <w:qFormat/>
     <w:pPr>
       <w:pBdr>
-        <w:left w:val="single" w:sz="24" w:space="8" w:color="1E3FD0"/>
+        <w:left w:val="single" w:sz="24" w:space="8" w:color="1D3FD1"/>
       </w:pBdr>
-      <w:shd w:val="clear" w:color="auto" w:fill="EEF2FF"/>
+      <w:shd w:val="clear" w:color="auto" w:fill="E4ECFB"/>
       <w:spacing w:lineRule="auto" w:line="276" w:before="120" w:after="160"/>
       <w:ind w:hanging="0" w:left="227" w:right="113"/>
     </w:pPr>
     <w:rPr>
       <w:rFonts w:ascii="Calibri" w:hAnsi="Calibri" w:eastAsia="Calibri" w:cs="Calibri"/>
-      <w:color w:val="1B243B"/>
+      <w:color w:val="10223A"/>
       <w:sz w:val="21"/>
     </w:rPr>
   </w:style>
@@ -15381,7 +15551,7 @@
     <w:rPr>
       <w:rFonts w:ascii="Calibri" w:hAnsi="Calibri" w:eastAsia="Calibri" w:cs="Calibri"/>
       <w:i/>
-      <w:color w:val="5B6578"/>
+      <w:color w:val="4D5F79"/>
       <w:sz w:val="18"/>
     </w:rPr>
   </w:style>
@@ -15396,7 +15566,7 @@
     <w:rPr>
       <w:rFonts w:ascii="Calibri" w:hAnsi="Calibri" w:eastAsia="Calibri" w:cs="Calibri"/>
       <w:i/>
-      <w:color w:val="5B6578"/>
+      <w:color w:val="4D5F79"/>
       <w:sz w:val="18"/>
     </w:rPr>
   </w:style>
@@ -15443,7 +15613,7 @@
       <w:rFonts w:ascii="Calibri" w:hAnsi="Calibri" w:eastAsia="Calibri" w:cs="Calibri"/>
       <w:b/>
       <w:bCs w:val="false"/>
-      <w:color w:val="1E3FD0"/>
+      <w:color w:val="1D3FD1"/>
       <w:sz w:val="40"/>
     </w:rPr>
   </w:style>
@@ -15459,6 +15629,12 @@
     <w:name w:val="Header and Footer"/>
     <w:basedOn w:val="Normal"/>
     <w:qFormat/>
+    <w:pPr/>
+    <w:rPr/>
+  </w:style>
+  <w:style w:type="paragraph" w:styleId="Header">
+    <w:name w:val="Header"/>
+    <w:basedOn w:val="HeaderandFooter"/>
     <w:pPr/>
     <w:rPr/>
   </w:style>
@@ -15500,12 +15676,12 @@
     <w:qFormat/>
     <w:tblPr>
       <w:tblBorders>
-        <w:top w:val="single" w:color="C5CCDB" w:sz="4" w:space="0"/>
-        <w:left w:val="single" w:color="C5CCDB" w:sz="4" w:space="0"/>
-        <w:bottom w:val="single" w:color="C5CCDB" w:sz="4" w:space="0"/>
-        <w:right w:val="single" w:color="C5CCDB" w:sz="4" w:space="0"/>
-        <w:insideH w:val="single" w:color="C5CCDB" w:sz="4" w:space="0"/>
-        <w:insideV w:val="single" w:color="C5CCDB" w:sz="4" w:space="0"/>
+        <w:top w:val="single" w:color="C9D3E6" w:sz="4" w:space="0"/>
+        <w:left w:val="single" w:color="C9D3E6" w:sz="4" w:space="0"/>
+        <w:bottom w:val="single" w:color="C9D3E6" w:sz="4" w:space="0"/>
+        <w:right w:val="single" w:color="C9D3E6" w:sz="4" w:space="0"/>
+        <w:insideH w:val="single" w:color="C9D3E6" w:sz="4" w:space="0"/>
+        <w:insideV w:val="single" w:color="C9D3E6" w:sz="4" w:space="0"/>
       </w:tblBorders>
       <w:tblCellMar>
         <w:top w:w="60" w:type="dxa"/>
@@ -15514,13 +15690,16 @@
         <w:right w:w="100" w:type="dxa"/>
       </w:tblCellMar>
     </w:tblPr>
+    <w:tcPr>
+      <w:shd w:val="clear" w:color="auto" w:fill="F8FAFD"/>
+    </w:tcPr>
     <w:tblStylePr w:type="firstRow">
       <w:rPr>
         <w:b/>
       </w:rPr>
       <w:tblPr/>
       <w:tcPr>
-        <w:shd w:val="clear" w:color="auto" w:fill="E3E9FB"/>
+        <w:shd w:val="clear" w:color="auto" w:fill="DCE5FB"/>
       </w:tcPr>
     </w:tblStylePr>
   </w:style>

</xml_diff>

<commit_message>
docs: cada captura del manual va con su descripción y su pie (T116)
Las capturas se quedan en la misma página que el párrafo que las describe y que su pie,
y las tablas del manual no se parten entre páginas. Se reordenan tres pasajes para que la
captura siga a su explicación y se agrega la descripción que faltaba al selector de periodo.

Co-Authored-By: Claude Sonnet 5.5 <noreply@anthropic.com>
Claude-Session: https://claude.ai/code/session_01TbTsHuPZ8nDmqmeNXGzGnL
</commit_message>
<xml_diff>
--- a/docs/manual-usuario/manual-usuario.docx
+++ b/docs/manual-usuario/manual-usuario.docx
@@ -93,7 +93,7 @@
             </w:rPr>
             <w:fldChar w:fldCharType="separate"/>
           </w:r>
-          <w:hyperlink w:anchor="__RefHeading___Toc2117_2420786254">
+          <w:hyperlink w:anchor="__RefHeading___Toc2133_260347293">
             <w:r>
               <w:rPr>
                 <w:webHidden/>
@@ -114,7 +114,7 @@
             </w:tabs>
             <w:rPr/>
           </w:pPr>
-          <w:hyperlink w:anchor="__RefHeading___Toc2119_2420786254">
+          <w:hyperlink w:anchor="__RefHeading___Toc2135_260347293">
             <w:r>
               <w:rPr>
                 <w:webHidden/>
@@ -135,7 +135,7 @@
             </w:tabs>
             <w:rPr/>
           </w:pPr>
-          <w:hyperlink w:anchor="__RefHeading___Toc2121_2420786254">
+          <w:hyperlink w:anchor="__RefHeading___Toc2137_260347293">
             <w:r>
               <w:rPr>
                 <w:webHidden/>
@@ -156,7 +156,7 @@
             </w:tabs>
             <w:rPr/>
           </w:pPr>
-          <w:hyperlink w:anchor="__RefHeading___Toc2123_2420786254">
+          <w:hyperlink w:anchor="__RefHeading___Toc2139_260347293">
             <w:r>
               <w:rPr>
                 <w:webHidden/>
@@ -164,7 +164,7 @@
               </w:rPr>
               <w:t>2. Conocer la pantalla</w:t>
               <w:tab/>
-              <w:t>5</w:t>
+              <w:t>6</w:t>
             </w:r>
           </w:hyperlink>
         </w:p>
@@ -177,7 +177,7 @@
             </w:tabs>
             <w:rPr/>
           </w:pPr>
-          <w:hyperlink w:anchor="__RefHeading___Toc2125_2420786254">
+          <w:hyperlink w:anchor="__RefHeading___Toc2141_260347293">
             <w:r>
               <w:rPr>
                 <w:webHidden/>
@@ -185,7 +185,7 @@
               </w:rPr>
               <w:t>3. Preparar el día</w:t>
               <w:tab/>
-              <w:t>7</w:t>
+              <w:t>8</w:t>
             </w:r>
           </w:hyperlink>
         </w:p>
@@ -198,7 +198,7 @@
             </w:tabs>
             <w:rPr/>
           </w:pPr>
-          <w:hyperlink w:anchor="__RefHeading___Toc2127_2420786254">
+          <w:hyperlink w:anchor="__RefHeading___Toc2143_260347293">
             <w:r>
               <w:rPr>
                 <w:webHidden/>
@@ -206,7 +206,7 @@
               </w:rPr>
               <w:t>4. Vender</w:t>
               <w:tab/>
-              <w:t>16</w:t>
+              <w:t>17</w:t>
             </w:r>
           </w:hyperlink>
         </w:p>
@@ -219,7 +219,7 @@
             </w:tabs>
             <w:rPr/>
           </w:pPr>
-          <w:hyperlink w:anchor="__RefHeading___Toc2129_2420786254">
+          <w:hyperlink w:anchor="__RefHeading___Toc2145_260347293">
             <w:r>
               <w:rPr>
                 <w:webHidden/>
@@ -227,7 +227,7 @@
               </w:rPr>
               <w:t>5. Cobrar una venta pendiente</w:t>
               <w:tab/>
-              <w:t>23</w:t>
+              <w:t>24</w:t>
             </w:r>
           </w:hyperlink>
         </w:p>
@@ -240,7 +240,7 @@
             </w:tabs>
             <w:rPr/>
           </w:pPr>
-          <w:hyperlink w:anchor="__RefHeading___Toc2131_2420786254">
+          <w:hyperlink w:anchor="__RefHeading___Toc2147_260347293">
             <w:r>
               <w:rPr>
                 <w:webHidden/>
@@ -261,7 +261,7 @@
             </w:tabs>
             <w:rPr/>
           </w:pPr>
-          <w:hyperlink w:anchor="__RefHeading___Toc2133_2420786254">
+          <w:hyperlink w:anchor="__RefHeading___Toc2149_260347293">
             <w:r>
               <w:rPr>
                 <w:webHidden/>
@@ -269,7 +269,7 @@
               </w:rPr>
               <w:t>7. Consultar tus ventas: Historial</w:t>
               <w:tab/>
-              <w:t>32</w:t>
+              <w:t>33</w:t>
             </w:r>
           </w:hyperlink>
         </w:p>
@@ -282,7 +282,7 @@
             </w:tabs>
             <w:rPr/>
           </w:pPr>
-          <w:hyperlink w:anchor="__RefHeading___Toc2135_2420786254">
+          <w:hyperlink w:anchor="__RefHeading___Toc2151_260347293">
             <w:r>
               <w:rPr>
                 <w:webHidden/>
@@ -290,7 +290,7 @@
               </w:rPr>
               <w:t>8. Reportes</w:t>
               <w:tab/>
-              <w:t>35</w:t>
+              <w:t>36</w:t>
             </w:r>
           </w:hyperlink>
         </w:p>
@@ -303,7 +303,7 @@
             </w:tabs>
             <w:rPr/>
           </w:pPr>
-          <w:hyperlink w:anchor="__RefHeading___Toc2137_2420786254">
+          <w:hyperlink w:anchor="__RefHeading___Toc2153_260347293">
             <w:r>
               <w:rPr>
                 <w:webHidden/>
@@ -311,7 +311,7 @@
               </w:rPr>
               <w:t>9. Tu perfil y cerrar sesión</w:t>
               <w:tab/>
-              <w:t>39</w:t>
+              <w:t>40</w:t>
             </w:r>
           </w:hyperlink>
         </w:p>
@@ -324,7 +324,7 @@
             </w:tabs>
             <w:rPr/>
           </w:pPr>
-          <w:hyperlink w:anchor="__RefHeading___Toc2139_2420786254">
+          <w:hyperlink w:anchor="__RefHeading___Toc2155_260347293">
             <w:r>
               <w:rPr>
                 <w:webHidden/>
@@ -332,7 +332,7 @@
               </w:rPr>
               <w:t>10. Si algo no sale como esperabas</w:t>
               <w:tab/>
-              <w:t>40</w:t>
+              <w:t>42</w:t>
             </w:r>
           </w:hyperlink>
         </w:p>
@@ -345,7 +345,7 @@
             </w:tabs>
             <w:rPr/>
           </w:pPr>
-          <w:hyperlink w:anchor="__RefHeading___Toc2141_2420786254">
+          <w:hyperlink w:anchor="__RefHeading___Toc2157_260347293">
             <w:r>
               <w:rPr>
                 <w:webHidden/>
@@ -353,7 +353,7 @@
               </w:rPr>
               <w:t>Parte 2. Guía del propietario</w:t>
               <w:tab/>
-              <w:t>46</w:t>
+              <w:t>47</w:t>
             </w:r>
           </w:hyperlink>
         </w:p>
@@ -366,7 +366,7 @@
             </w:tabs>
             <w:rPr/>
           </w:pPr>
-          <w:hyperlink w:anchor="__RefHeading___Toc2143_2420786254">
+          <w:hyperlink w:anchor="__RefHeading___Toc2159_260347293">
             <w:r>
               <w:rPr>
                 <w:webHidden/>
@@ -374,7 +374,7 @@
               </w:rPr>
               <w:t>11. Catálogo de productos</w:t>
               <w:tab/>
-              <w:t>46</w:t>
+              <w:t>47</w:t>
             </w:r>
           </w:hyperlink>
         </w:p>
@@ -387,7 +387,7 @@
             </w:tabs>
             <w:rPr/>
           </w:pPr>
-          <w:hyperlink w:anchor="__RefHeading___Toc2145_2420786254">
+          <w:hyperlink w:anchor="__RefHeading___Toc2161_260347293">
             <w:r>
               <w:rPr>
                 <w:webHidden/>
@@ -395,7 +395,7 @@
               </w:rPr>
               <w:t>12. Configuración de la tienda</w:t>
               <w:tab/>
-              <w:t>51</w:t>
+              <w:t>53</w:t>
             </w:r>
           </w:hyperlink>
         </w:p>
@@ -408,7 +408,7 @@
             </w:tabs>
             <w:rPr/>
           </w:pPr>
-          <w:hyperlink w:anchor="__RefHeading___Toc2147_2420786254">
+          <w:hyperlink w:anchor="__RefHeading___Toc2163_260347293">
             <w:r>
               <w:rPr>
                 <w:webHidden/>
@@ -416,7 +416,7 @@
               </w:rPr>
               <w:t>13. Equipo: tus vendedores</w:t>
               <w:tab/>
-              <w:t>52</w:t>
+              <w:t>54</w:t>
             </w:r>
           </w:hyperlink>
         </w:p>
@@ -429,7 +429,7 @@
             </w:tabs>
             <w:rPr/>
           </w:pPr>
-          <w:hyperlink w:anchor="__RefHeading___Toc2149_2420786254">
+          <w:hyperlink w:anchor="__RefHeading___Toc2165_260347293">
             <w:r>
               <w:rPr>
                 <w:webHidden/>
@@ -437,7 +437,7 @@
               </w:rPr>
               <w:t>14. Ver el trabajo de tu equipo</w:t>
               <w:tab/>
-              <w:t>57</w:t>
+              <w:t>58</w:t>
             </w:r>
           </w:hyperlink>
         </w:p>
@@ -450,7 +450,7 @@
             </w:tabs>
             <w:rPr/>
           </w:pPr>
-          <w:hyperlink w:anchor="__RefHeading___Toc2151_2420786254">
+          <w:hyperlink w:anchor="__RefHeading___Toc2167_260347293">
             <w:r>
               <w:rPr>
                 <w:webHidden/>
@@ -458,7 +458,7 @@
               </w:rPr>
               <w:t>Parte 3. Guía del vendedor</w:t>
               <w:tab/>
-              <w:t>65</w:t>
+              <w:t>66</w:t>
             </w:r>
           </w:hyperlink>
         </w:p>
@@ -471,7 +471,7 @@
             </w:tabs>
             <w:rPr/>
           </w:pPr>
-          <w:hyperlink w:anchor="__RefHeading___Toc2153_2420786254">
+          <w:hyperlink w:anchor="__RefHeading___Toc2169_260347293">
             <w:r>
               <w:rPr>
                 <w:webHidden/>
@@ -479,7 +479,7 @@
               </w:rPr>
               <w:t>15. Lo que puedes y lo que no</w:t>
               <w:tab/>
-              <w:t>65</w:t>
+              <w:t>66</w:t>
             </w:r>
           </w:hyperlink>
         </w:p>
@@ -492,7 +492,7 @@
             </w:tabs>
             <w:rPr/>
           </w:pPr>
-          <w:hyperlink w:anchor="__RefHeading___Toc2155_2420786254">
+          <w:hyperlink w:anchor="__RefHeading___Toc2171_260347293">
             <w:r>
               <w:rPr>
                 <w:webHidden/>
@@ -500,7 +500,7 @@
               </w:rPr>
               <w:t>16. Tu día de trabajo</w:t>
               <w:tab/>
-              <w:t>67</w:t>
+              <w:t>69</w:t>
             </w:r>
           </w:hyperlink>
         </w:p>
@@ -513,7 +513,7 @@
             </w:tabs>
             <w:rPr/>
           </w:pPr>
-          <w:hyperlink w:anchor="__RefHeading___Toc2157_2420786254">
+          <w:hyperlink w:anchor="__RefHeading___Toc2173_260347293">
             <w:r>
               <w:rPr>
                 <w:webHidden/>
@@ -521,7 +521,7 @@
               </w:rPr>
               <w:t>17. Consultar lo tuyo</w:t>
               <w:tab/>
-              <w:t>71</w:t>
+              <w:t>72</w:t>
             </w:r>
           </w:hyperlink>
         </w:p>
@@ -534,7 +534,7 @@
             </w:tabs>
             <w:rPr/>
           </w:pPr>
-          <w:hyperlink w:anchor="__RefHeading___Toc2159_2420786254">
+          <w:hyperlink w:anchor="__RefHeading___Toc2175_260347293">
             <w:r>
               <w:rPr>
                 <w:webHidden/>
@@ -542,7 +542,7 @@
               </w:rPr>
               <w:t>18. Si tu cuenta es dada de baja</w:t>
               <w:tab/>
-              <w:t>72</w:t>
+              <w:t>74</w:t>
             </w:r>
           </w:hyperlink>
         </w:p>
@@ -555,7 +555,7 @@
             </w:tabs>
             <w:rPr/>
           </w:pPr>
-          <w:hyperlink w:anchor="__RefHeading___Toc2161_2420786254">
+          <w:hyperlink w:anchor="__RefHeading___Toc2177_260347293">
             <w:r>
               <w:rPr>
                 <w:webHidden/>
@@ -563,7 +563,7 @@
               </w:rPr>
               <w:t>Glosario</w:t>
               <w:tab/>
-              <w:t>74</w:t>
+              <w:t>75</w:t>
             </w:r>
           </w:hyperlink>
           <w:r>
@@ -593,7 +593,7 @@
         <w:spacing w:before="0" w:after="120"/>
         <w:rPr/>
       </w:pPr>
-      <w:bookmarkStart w:id="0" w:name="__RefHeading___Toc2117_2420786254"/>
+      <w:bookmarkStart w:id="0" w:name="__RefHeading___Toc2133_260347293"/>
       <w:bookmarkStart w:id="1" w:name="cómo-usar-este-manual"/>
       <w:bookmarkEnd w:id="0"/>
       <w:r>
@@ -614,6 +614,7 @@
     <w:p>
       <w:pPr>
         <w:pStyle w:val="BodyText"/>
+        <w:keepNext w:val="true"/>
         <w:rPr/>
       </w:pPr>
       <w:r>
@@ -647,6 +648,7 @@
       <w:tr>
         <w:trPr>
           <w:tblHeader w:val="true"/>
+          <w:cantSplit w:val="true"/>
         </w:trPr>
         <w:tc>
           <w:tcPr>
@@ -657,6 +659,7 @@
           <w:p>
             <w:pPr>
               <w:pStyle w:val="Compact"/>
+              <w:keepNext w:val="true"/>
               <w:widowControl/>
               <w:spacing w:before="0" w:after="40"/>
               <w:jc w:val="left"/>
@@ -687,6 +690,7 @@
           <w:p>
             <w:pPr>
               <w:pStyle w:val="Compact"/>
+              <w:keepNext w:val="true"/>
               <w:widowControl/>
               <w:spacing w:before="0" w:after="40"/>
               <w:jc w:val="left"/>
@@ -710,7 +714,9 @@
         </w:tc>
       </w:tr>
       <w:tr>
-        <w:trPr/>
+        <w:trPr>
+          <w:cantSplit w:val="true"/>
+        </w:trPr>
         <w:tc>
           <w:tcPr>
             <w:tcW w:w="4872" w:type="dxa"/>
@@ -720,6 +726,7 @@
           <w:p>
             <w:pPr>
               <w:pStyle w:val="Compact"/>
+              <w:keepNext w:val="true"/>
               <w:widowControl/>
               <w:spacing w:before="0" w:after="40"/>
               <w:jc w:val="left"/>
@@ -748,6 +755,7 @@
           <w:p>
             <w:pPr>
               <w:pStyle w:val="Compact"/>
+              <w:keepNext w:val="true"/>
               <w:widowControl/>
               <w:spacing w:before="0" w:after="40"/>
               <w:jc w:val="left"/>
@@ -769,7 +777,9 @@
         </w:tc>
       </w:tr>
       <w:tr>
-        <w:trPr/>
+        <w:trPr>
+          <w:cantSplit w:val="true"/>
+        </w:trPr>
         <w:tc>
           <w:tcPr>
             <w:tcW w:w="4872" w:type="dxa"/>
@@ -983,7 +993,7 @@
         <w:pStyle w:val="Heading1"/>
         <w:rPr/>
       </w:pPr>
-      <w:bookmarkStart w:id="2" w:name="__RefHeading___Toc2119_2420786254"/>
+      <w:bookmarkStart w:id="2" w:name="__RefHeading___Toc2135_260347293"/>
       <w:bookmarkStart w:id="3" w:name="parte-1.-para-todos"/>
       <w:bookmarkEnd w:id="2"/>
       <w:r>
@@ -1006,7 +1016,7 @@
         <w:pStyle w:val="Heading2"/>
         <w:rPr/>
       </w:pPr>
-      <w:bookmarkStart w:id="4" w:name="__RefHeading___Toc2121_2420786254"/>
+      <w:bookmarkStart w:id="4" w:name="__RefHeading___Toc2137_260347293"/>
       <w:bookmarkStart w:id="5" w:name="iniciar-sesión"/>
       <w:bookmarkEnd w:id="4"/>
       <w:r>
@@ -1017,6 +1027,8 @@
     <w:p>
       <w:pPr>
         <w:pStyle w:val="Normal"/>
+        <w:keepNext w:val="true"/>
+        <w:keepLines/>
         <w:numPr>
           <w:ilvl w:val="0"/>
           <w:numId w:val="24"/>
@@ -1064,6 +1076,8 @@
     <w:p>
       <w:pPr>
         <w:pStyle w:val="CaptionedFigure"/>
+        <w:keepNext w:val="true"/>
+        <w:keepLines/>
         <w:numPr>
           <w:ilvl w:val="0"/>
           <w:numId w:val="1"/>
@@ -1128,6 +1142,8 @@
     <w:p>
       <w:pPr>
         <w:pStyle w:val="Normal"/>
+        <w:keepNext w:val="true"/>
+        <w:keepLines/>
         <w:numPr>
           <w:ilvl w:val="0"/>
           <w:numId w:val="4"/>
@@ -1153,6 +1169,8 @@
     <w:p>
       <w:pPr>
         <w:pStyle w:val="CaptionedFigure"/>
+        <w:keepNext w:val="true"/>
+        <w:keepLines/>
         <w:numPr>
           <w:ilvl w:val="0"/>
           <w:numId w:val="1"/>
@@ -1231,7 +1249,7 @@
         <w:pStyle w:val="Heading2"/>
         <w:rPr/>
       </w:pPr>
-      <w:bookmarkStart w:id="7" w:name="__RefHeading___Toc2123_2420786254"/>
+      <w:bookmarkStart w:id="7" w:name="__RefHeading___Toc2139_260347293"/>
       <w:bookmarkStart w:id="8" w:name="conocer-la-pantalla"/>
       <w:bookmarkEnd w:id="7"/>
       <w:r>
@@ -1242,6 +1260,8 @@
     <w:p>
       <w:pPr>
         <w:pStyle w:val="FirstParagraph"/>
+        <w:keepNext w:val="true"/>
+        <w:keepLines/>
         <w:rPr/>
       </w:pPr>
       <w:r>
@@ -1263,6 +1283,8 @@
     <w:p>
       <w:pPr>
         <w:pStyle w:val="CaptionedFigure"/>
+        <w:keepNext w:val="true"/>
+        <w:keepLines/>
         <w:rPr/>
       </w:pPr>
       <w:r>
@@ -1319,6 +1341,8 @@
     <w:p>
       <w:pPr>
         <w:pStyle w:val="BodyText"/>
+        <w:keepNext w:val="true"/>
+        <w:keepLines/>
         <w:rPr/>
       </w:pPr>
       <w:r>
@@ -1340,6 +1364,8 @@
     <w:p>
       <w:pPr>
         <w:pStyle w:val="CaptionedFigure"/>
+        <w:keepNext w:val="true"/>
+        <w:keepLines/>
         <w:rPr/>
       </w:pPr>
       <w:r>
@@ -1602,7 +1628,7 @@
         <w:pStyle w:val="Heading2"/>
         <w:rPr/>
       </w:pPr>
-      <w:bookmarkStart w:id="9" w:name="__RefHeading___Toc2125_2420786254"/>
+      <w:bookmarkStart w:id="9" w:name="__RefHeading___Toc2141_260347293"/>
       <w:bookmarkStart w:id="10" w:name="preparar-el-día"/>
       <w:bookmarkEnd w:id="9"/>
       <w:r>
@@ -1634,6 +1660,8 @@
     <w:p>
       <w:pPr>
         <w:pStyle w:val="Normal"/>
+        <w:keepNext w:val="true"/>
+        <w:keepLines/>
         <w:numPr>
           <w:ilvl w:val="0"/>
           <w:numId w:val="30"/>
@@ -1681,6 +1709,8 @@
     <w:p>
       <w:pPr>
         <w:pStyle w:val="CaptionedFigure"/>
+        <w:keepNext w:val="true"/>
+        <w:keepLines/>
         <w:numPr>
           <w:ilvl w:val="0"/>
           <w:numId w:val="1"/>
@@ -1745,6 +1775,8 @@
     <w:p>
       <w:pPr>
         <w:pStyle w:val="Normal"/>
+        <w:keepNext w:val="true"/>
+        <w:keepLines/>
         <w:numPr>
           <w:ilvl w:val="0"/>
           <w:numId w:val="31"/>
@@ -1759,6 +1791,8 @@
     <w:p>
       <w:pPr>
         <w:pStyle w:val="CaptionedFigure"/>
+        <w:keepNext w:val="true"/>
+        <w:keepLines/>
         <w:numPr>
           <w:ilvl w:val="0"/>
           <w:numId w:val="1"/>
@@ -1823,6 +1857,8 @@
     <w:p>
       <w:pPr>
         <w:pStyle w:val="Normal"/>
+        <w:keepNext w:val="true"/>
+        <w:keepLines/>
         <w:numPr>
           <w:ilvl w:val="0"/>
           <w:numId w:val="32"/>
@@ -1859,6 +1895,8 @@
     <w:p>
       <w:pPr>
         <w:pStyle w:val="CaptionedFigure"/>
+        <w:keepNext w:val="true"/>
+        <w:keepLines/>
         <w:numPr>
           <w:ilvl w:val="0"/>
           <w:numId w:val="1"/>
@@ -1923,6 +1961,8 @@
     <w:p>
       <w:pPr>
         <w:pStyle w:val="Normal"/>
+        <w:keepNext w:val="true"/>
+        <w:keepLines/>
         <w:numPr>
           <w:ilvl w:val="0"/>
           <w:numId w:val="33"/>
@@ -1970,6 +2010,8 @@
     <w:p>
       <w:pPr>
         <w:pStyle w:val="CaptionedFigure"/>
+        <w:keepNext w:val="true"/>
+        <w:keepLines/>
         <w:numPr>
           <w:ilvl w:val="0"/>
           <w:numId w:val="1"/>
@@ -2034,6 +2076,8 @@
     <w:p>
       <w:pPr>
         <w:pStyle w:val="FirstParagraph"/>
+        <w:keepNext w:val="true"/>
+        <w:keepLines/>
         <w:rPr/>
       </w:pPr>
       <w:r>
@@ -2095,6 +2139,8 @@
     <w:p>
       <w:pPr>
         <w:pStyle w:val="CaptionedFigure"/>
+        <w:keepNext w:val="true"/>
+        <w:keepLines/>
         <w:rPr/>
       </w:pPr>
       <w:r>
@@ -2151,6 +2197,8 @@
     <w:p>
       <w:pPr>
         <w:pStyle w:val="BodyText"/>
+        <w:keepNext w:val="true"/>
+        <w:keepLines/>
         <w:rPr/>
       </w:pPr>
       <w:r>
@@ -2190,6 +2238,8 @@
     <w:p>
       <w:pPr>
         <w:pStyle w:val="CaptionedFigure"/>
+        <w:keepNext w:val="true"/>
+        <w:keepLines/>
         <w:rPr/>
       </w:pPr>
       <w:r>
@@ -2246,6 +2296,8 @@
     <w:p>
       <w:pPr>
         <w:pStyle w:val="BodyText"/>
+        <w:keepNext w:val="true"/>
+        <w:keepLines/>
         <w:rPr/>
       </w:pPr>
       <w:r>
@@ -2267,6 +2319,8 @@
     <w:p>
       <w:pPr>
         <w:pStyle w:val="CaptionedFigure"/>
+        <w:keepNext w:val="true"/>
+        <w:keepLines/>
         <w:rPr/>
       </w:pPr>
       <w:r>
@@ -2323,6 +2377,8 @@
     <w:p>
       <w:pPr>
         <w:pStyle w:val="BodyText"/>
+        <w:keepNext w:val="true"/>
+        <w:keepLines/>
         <w:rPr/>
       </w:pPr>
       <w:r>
@@ -2362,6 +2418,8 @@
     <w:p>
       <w:pPr>
         <w:pStyle w:val="CaptionedFigure"/>
+        <w:keepNext w:val="true"/>
+        <w:keepLines/>
         <w:rPr/>
       </w:pPr>
       <w:r>
@@ -2418,6 +2476,8 @@
     <w:p>
       <w:pPr>
         <w:pStyle w:val="BodyText"/>
+        <w:keepNext w:val="true"/>
+        <w:keepLines/>
         <w:rPr/>
       </w:pPr>
       <w:r>
@@ -2457,6 +2517,8 @@
     <w:p>
       <w:pPr>
         <w:pStyle w:val="CaptionedFigure"/>
+        <w:keepNext w:val="true"/>
+        <w:keepLines/>
         <w:rPr/>
       </w:pPr>
       <w:r>
@@ -2544,7 +2606,7 @@
         <w:pStyle w:val="Heading2"/>
         <w:rPr/>
       </w:pPr>
-      <w:bookmarkStart w:id="11" w:name="__RefHeading___Toc2127_2420786254"/>
+      <w:bookmarkStart w:id="11" w:name="__RefHeading___Toc2143_260347293"/>
       <w:bookmarkStart w:id="12" w:name="vender"/>
       <w:bookmarkEnd w:id="11"/>
       <w:r>
@@ -2555,6 +2617,8 @@
     <w:p>
       <w:pPr>
         <w:pStyle w:val="Normal"/>
+        <w:keepNext w:val="true"/>
+        <w:keepLines/>
         <w:numPr>
           <w:ilvl w:val="0"/>
           <w:numId w:val="34"/>
@@ -2602,6 +2666,8 @@
     <w:p>
       <w:pPr>
         <w:pStyle w:val="CaptionedFigure"/>
+        <w:keepNext w:val="true"/>
+        <w:keepLines/>
         <w:numPr>
           <w:ilvl w:val="0"/>
           <w:numId w:val="1"/>
@@ -2666,6 +2732,8 @@
     <w:p>
       <w:pPr>
         <w:pStyle w:val="Normal"/>
+        <w:keepNext w:val="true"/>
+        <w:keepLines/>
         <w:numPr>
           <w:ilvl w:val="0"/>
           <w:numId w:val="35"/>
@@ -2724,6 +2792,8 @@
     <w:p>
       <w:pPr>
         <w:pStyle w:val="CaptionedFigure"/>
+        <w:keepNext w:val="true"/>
+        <w:keepLines/>
         <w:numPr>
           <w:ilvl w:val="0"/>
           <w:numId w:val="1"/>
@@ -2813,6 +2883,8 @@
     <w:p>
       <w:pPr>
         <w:pStyle w:val="Normal"/>
+        <w:keepNext w:val="true"/>
+        <w:keepLines/>
         <w:numPr>
           <w:ilvl w:val="0"/>
           <w:numId w:val="36"/>
@@ -2882,6 +2954,8 @@
     <w:p>
       <w:pPr>
         <w:pStyle w:val="CaptionedFigure"/>
+        <w:keepNext w:val="true"/>
+        <w:keepLines/>
         <w:numPr>
           <w:ilvl w:val="0"/>
           <w:numId w:val="1"/>
@@ -2946,6 +3020,8 @@
     <w:p>
       <w:pPr>
         <w:pStyle w:val="Normal"/>
+        <w:keepNext w:val="true"/>
+        <w:keepLines/>
         <w:numPr>
           <w:ilvl w:val="0"/>
           <w:numId w:val="37"/>
@@ -3015,6 +3091,8 @@
     <w:p>
       <w:pPr>
         <w:pStyle w:val="CaptionedFigure"/>
+        <w:keepNext w:val="true"/>
+        <w:keepLines/>
         <w:numPr>
           <w:ilvl w:val="0"/>
           <w:numId w:val="1"/>
@@ -3090,6 +3168,8 @@
     <w:p>
       <w:pPr>
         <w:pStyle w:val="FirstParagraph"/>
+        <w:keepNext w:val="true"/>
+        <w:keepLines/>
         <w:rPr/>
       </w:pPr>
       <w:r>
@@ -3184,6 +3264,8 @@
     <w:p>
       <w:pPr>
         <w:pStyle w:val="CaptionedFigure"/>
+        <w:keepNext w:val="true"/>
+        <w:keepLines/>
         <w:rPr/>
       </w:pPr>
       <w:r>
@@ -3279,6 +3361,8 @@
     <w:p>
       <w:pPr>
         <w:pStyle w:val="BodyText"/>
+        <w:keepNext w:val="true"/>
+        <w:keepLines/>
         <w:rPr/>
       </w:pPr>
       <w:r>
@@ -3318,6 +3402,8 @@
     <w:p>
       <w:pPr>
         <w:pStyle w:val="CaptionedFigure"/>
+        <w:keepNext w:val="true"/>
+        <w:keepLines/>
         <w:rPr/>
       </w:pPr>
       <w:r>
@@ -3414,6 +3500,8 @@
     <w:p>
       <w:pPr>
         <w:pStyle w:val="FirstParagraph"/>
+        <w:keepNext w:val="true"/>
+        <w:keepLines/>
         <w:rPr/>
       </w:pPr>
       <w:r>
@@ -3446,6 +3534,8 @@
     <w:p>
       <w:pPr>
         <w:pStyle w:val="CaptionedFigure"/>
+        <w:keepNext w:val="true"/>
+        <w:keepLines/>
         <w:rPr/>
       </w:pPr>
       <w:r>
@@ -3508,7 +3598,7 @@
         <w:pStyle w:val="Heading2"/>
         <w:rPr/>
       </w:pPr>
-      <w:bookmarkStart w:id="17" w:name="__RefHeading___Toc2129_2420786254"/>
+      <w:bookmarkStart w:id="17" w:name="__RefHeading___Toc2145_260347293"/>
       <w:bookmarkStart w:id="18" w:name="cobrar-una-venta-pendiente"/>
       <w:bookmarkEnd w:id="17"/>
       <w:r>
@@ -3519,6 +3609,8 @@
     <w:p>
       <w:pPr>
         <w:pStyle w:val="Normal"/>
+        <w:keepNext w:val="true"/>
+        <w:keepLines/>
         <w:numPr>
           <w:ilvl w:val="0"/>
           <w:numId w:val="38"/>
@@ -3588,6 +3680,8 @@
     <w:p>
       <w:pPr>
         <w:pStyle w:val="CaptionedFigure"/>
+        <w:keepNext w:val="true"/>
+        <w:keepLines/>
         <w:numPr>
           <w:ilvl w:val="0"/>
           <w:numId w:val="1"/>
@@ -3652,6 +3746,8 @@
     <w:p>
       <w:pPr>
         <w:pStyle w:val="Normal"/>
+        <w:keepNext w:val="true"/>
+        <w:keepLines/>
         <w:numPr>
           <w:ilvl w:val="0"/>
           <w:numId w:val="39"/>
@@ -3765,6 +3861,8 @@
     <w:p>
       <w:pPr>
         <w:pStyle w:val="CaptionedFigure"/>
+        <w:keepNext w:val="true"/>
+        <w:keepLines/>
         <w:numPr>
           <w:ilvl w:val="0"/>
           <w:numId w:val="1"/>
@@ -3829,6 +3927,8 @@
     <w:p>
       <w:pPr>
         <w:pStyle w:val="Normal"/>
+        <w:keepNext w:val="true"/>
+        <w:keepLines/>
         <w:numPr>
           <w:ilvl w:val="0"/>
           <w:numId w:val="40"/>
@@ -3865,6 +3965,8 @@
     <w:p>
       <w:pPr>
         <w:pStyle w:val="CaptionedFigure"/>
+        <w:keepNext w:val="true"/>
+        <w:keepLines/>
         <w:numPr>
           <w:ilvl w:val="0"/>
           <w:numId w:val="1"/>
@@ -3929,6 +4031,8 @@
     <w:p>
       <w:pPr>
         <w:pStyle w:val="Normal"/>
+        <w:keepNext w:val="true"/>
+        <w:keepLines/>
         <w:numPr>
           <w:ilvl w:val="0"/>
           <w:numId w:val="41"/>
@@ -3987,6 +4091,8 @@
     <w:p>
       <w:pPr>
         <w:pStyle w:val="CaptionedFigure"/>
+        <w:keepNext w:val="true"/>
+        <w:keepLines/>
         <w:numPr>
           <w:ilvl w:val="0"/>
           <w:numId w:val="1"/>
@@ -4051,6 +4157,8 @@
     <w:p>
       <w:pPr>
         <w:pStyle w:val="Normal"/>
+        <w:keepNext w:val="true"/>
+        <w:keepLines/>
         <w:numPr>
           <w:ilvl w:val="0"/>
           <w:numId w:val="42"/>
@@ -4087,6 +4195,8 @@
     <w:p>
       <w:pPr>
         <w:pStyle w:val="CaptionedFigure"/>
+        <w:keepNext w:val="true"/>
+        <w:keepLines/>
         <w:numPr>
           <w:ilvl w:val="0"/>
           <w:numId w:val="1"/>
@@ -4155,7 +4265,7 @@
         <w:pStyle w:val="Heading2"/>
         <w:rPr/>
       </w:pPr>
-      <w:bookmarkStart w:id="20" w:name="__RefHeading___Toc2131_2420786254"/>
+      <w:bookmarkStart w:id="20" w:name="__RefHeading___Toc2147_260347293"/>
       <w:bookmarkStart w:id="21" w:name="corregir-un-error"/>
       <w:bookmarkEnd w:id="20"/>
       <w:r>
@@ -4244,6 +4354,8 @@
     <w:p>
       <w:pPr>
         <w:pStyle w:val="Normal"/>
+        <w:keepNext w:val="true"/>
+        <w:keepLines/>
         <w:numPr>
           <w:ilvl w:val="0"/>
           <w:numId w:val="44"/>
@@ -4280,6 +4392,8 @@
     <w:p>
       <w:pPr>
         <w:pStyle w:val="CaptionedFigure"/>
+        <w:keepNext w:val="true"/>
+        <w:keepLines/>
         <w:numPr>
           <w:ilvl w:val="0"/>
           <w:numId w:val="1"/>
@@ -4344,6 +4458,8 @@
     <w:p>
       <w:pPr>
         <w:pStyle w:val="Normal"/>
+        <w:keepNext w:val="true"/>
+        <w:keepLines/>
         <w:numPr>
           <w:ilvl w:val="0"/>
           <w:numId w:val="45"/>
@@ -4369,6 +4485,8 @@
     <w:p>
       <w:pPr>
         <w:pStyle w:val="CaptionedFigure"/>
+        <w:keepNext w:val="true"/>
+        <w:keepLines/>
         <w:numPr>
           <w:ilvl w:val="0"/>
           <w:numId w:val="1"/>
@@ -4481,6 +4599,8 @@
     <w:p>
       <w:pPr>
         <w:pStyle w:val="Normal"/>
+        <w:keepNext w:val="true"/>
+        <w:keepLines/>
         <w:numPr>
           <w:ilvl w:val="0"/>
           <w:numId w:val="47"/>
@@ -4517,6 +4637,8 @@
     <w:p>
       <w:pPr>
         <w:pStyle w:val="CaptionedFigure"/>
+        <w:keepNext w:val="true"/>
+        <w:keepLines/>
         <w:numPr>
           <w:ilvl w:val="0"/>
           <w:numId w:val="1"/>
@@ -4581,6 +4703,8 @@
     <w:p>
       <w:pPr>
         <w:pStyle w:val="Normal"/>
+        <w:keepNext w:val="true"/>
+        <w:keepLines/>
         <w:numPr>
           <w:ilvl w:val="0"/>
           <w:numId w:val="48"/>
@@ -4606,6 +4730,8 @@
     <w:p>
       <w:pPr>
         <w:pStyle w:val="CaptionedFigure"/>
+        <w:keepNext w:val="true"/>
+        <w:keepLines/>
         <w:numPr>
           <w:ilvl w:val="0"/>
           <w:numId w:val="1"/>
@@ -4769,7 +4895,7 @@
         <w:pStyle w:val="Heading2"/>
         <w:rPr/>
       </w:pPr>
-      <w:bookmarkStart w:id="25" w:name="__RefHeading___Toc2133_2420786254"/>
+      <w:bookmarkStart w:id="25" w:name="__RefHeading___Toc2149_260347293"/>
       <w:bookmarkStart w:id="26" w:name="consultar-tus-ventas-historial"/>
       <w:bookmarkEnd w:id="25"/>
       <w:r>
@@ -4780,6 +4906,8 @@
     <w:p>
       <w:pPr>
         <w:pStyle w:val="FirstParagraph"/>
+        <w:keepNext w:val="true"/>
+        <w:keepLines/>
         <w:rPr/>
       </w:pPr>
       <w:r>
@@ -4823,6 +4951,8 @@
     <w:p>
       <w:pPr>
         <w:pStyle w:val="CaptionedFigure"/>
+        <w:keepNext w:val="true"/>
+        <w:keepLines/>
         <w:rPr/>
       </w:pPr>
       <w:r>
@@ -4893,6 +5023,8 @@
     <w:p>
       <w:pPr>
         <w:pStyle w:val="Normal"/>
+        <w:keepNext w:val="true"/>
+        <w:keepLines/>
         <w:numPr>
           <w:ilvl w:val="0"/>
           <w:numId w:val="53"/>
@@ -4951,6 +5083,8 @@
     <w:p>
       <w:pPr>
         <w:pStyle w:val="CaptionedFigure"/>
+        <w:keepNext w:val="true"/>
+        <w:keepLines/>
         <w:numPr>
           <w:ilvl w:val="0"/>
           <w:numId w:val="1"/>
@@ -5015,6 +5149,8 @@
     <w:p>
       <w:pPr>
         <w:pStyle w:val="Normal"/>
+        <w:keepNext w:val="true"/>
+        <w:keepLines/>
         <w:numPr>
           <w:ilvl w:val="0"/>
           <w:numId w:val="54"/>
@@ -5040,6 +5176,8 @@
     <w:p>
       <w:pPr>
         <w:pStyle w:val="CaptionedFigure"/>
+        <w:keepNext w:val="true"/>
+        <w:keepLines/>
         <w:numPr>
           <w:ilvl w:val="0"/>
           <w:numId w:val="1"/>
@@ -5122,7 +5260,7 @@
         <w:pStyle w:val="Heading2"/>
         <w:rPr/>
       </w:pPr>
-      <w:bookmarkStart w:id="28" w:name="__RefHeading___Toc2135_2420786254"/>
+      <w:bookmarkStart w:id="28" w:name="__RefHeading___Toc2151_260347293"/>
       <w:bookmarkEnd w:id="28"/>
       <w:r>
         <w:rPr/>
@@ -5132,6 +5270,8 @@
     <w:p>
       <w:pPr>
         <w:pStyle w:val="FirstParagraph"/>
+        <w:keepNext w:val="true"/>
+        <w:keepLines/>
         <w:rPr/>
       </w:pPr>
       <w:r>
@@ -5219,6 +5359,8 @@
     <w:p>
       <w:pPr>
         <w:pStyle w:val="CaptionedFigure"/>
+        <w:keepNext w:val="true"/>
+        <w:keepLines/>
         <w:rPr/>
       </w:pPr>
       <w:r>
@@ -5274,7 +5416,65 @@
     </w:p>
     <w:p>
       <w:pPr>
+        <w:pStyle w:val="BodyText"/>
+        <w:keepNext w:val="true"/>
+        <w:keepLines/>
+        <w:rPr/>
+      </w:pPr>
+      <w:r>
+        <w:rPr/>
+        <w:t xml:space="preserve">Para cambiar de periodo, toca </w:t>
+      </w:r>
+      <w:r>
+        <w:rPr>
+          <w:b/>
+          <w:bCs/>
+        </w:rPr>
+        <w:t>Día</w:t>
+      </w:r>
+      <w:r>
+        <w:rPr/>
+        <w:t xml:space="preserve">, </w:t>
+      </w:r>
+      <w:r>
+        <w:rPr>
+          <w:b/>
+          <w:bCs/>
+        </w:rPr>
+        <w:t>Semana</w:t>
+      </w:r>
+      <w:r>
+        <w:rPr/>
+        <w:t xml:space="preserve">, </w:t>
+      </w:r>
+      <w:r>
+        <w:rPr>
+          <w:b/>
+          <w:bCs/>
+        </w:rPr>
+        <w:t>Mes</w:t>
+      </w:r>
+      <w:r>
+        <w:rPr/>
+        <w:t xml:space="preserve"> o </w:t>
+      </w:r>
+      <w:r>
+        <w:rPr>
+          <w:b/>
+          <w:bCs/>
+        </w:rPr>
+        <w:t>Rango</w:t>
+      </w:r>
+      <w:r>
+        <w:rPr/>
+        <w:t>. Las flechas de abajo te llevan al periodo anterior o al siguiente.</w:t>
+      </w:r>
+    </w:p>
+    <w:p>
+      <w:pPr>
         <w:pStyle w:val="CaptionedFigure"/>
+        <w:keepNext w:val="true"/>
+        <w:keepLines/>
         <w:rPr/>
       </w:pPr>
       <w:r>
@@ -5331,6 +5531,8 @@
     <w:p>
       <w:pPr>
         <w:pStyle w:val="BodyText"/>
+        <w:keepNext w:val="true"/>
+        <w:keepLines/>
         <w:rPr/>
       </w:pPr>
       <w:r>
@@ -5385,6 +5587,8 @@
     <w:p>
       <w:pPr>
         <w:pStyle w:val="CaptionedFigure"/>
+        <w:keepNext w:val="true"/>
+        <w:keepLines/>
         <w:rPr/>
       </w:pPr>
       <w:r>
@@ -5441,6 +5645,7 @@
     <w:p>
       <w:pPr>
         <w:pStyle w:val="BodyText"/>
+        <w:keepNext w:val="true"/>
         <w:rPr/>
       </w:pPr>
       <w:r>
@@ -5471,6 +5676,7 @@
       <w:tr>
         <w:trPr>
           <w:tblHeader w:val="true"/>
+          <w:cantSplit w:val="true"/>
         </w:trPr>
         <w:tc>
           <w:tcPr>
@@ -5481,6 +5687,7 @@
           <w:p>
             <w:pPr>
               <w:pStyle w:val="Compact"/>
+              <w:keepNext w:val="true"/>
               <w:widowControl/>
               <w:spacing w:before="0" w:after="40"/>
               <w:jc w:val="left"/>
@@ -5511,6 +5718,7 @@
           <w:p>
             <w:pPr>
               <w:pStyle w:val="Compact"/>
+              <w:keepNext w:val="true"/>
               <w:widowControl/>
               <w:spacing w:before="0" w:after="40"/>
               <w:jc w:val="left"/>
@@ -5534,7 +5742,9 @@
         </w:tc>
       </w:tr>
       <w:tr>
-        <w:trPr/>
+        <w:trPr>
+          <w:cantSplit w:val="true"/>
+        </w:trPr>
         <w:tc>
           <w:tcPr>
             <w:tcW w:w="4872" w:type="dxa"/>
@@ -5544,6 +5754,7 @@
           <w:p>
             <w:pPr>
               <w:pStyle w:val="Compact"/>
+              <w:keepNext w:val="true"/>
               <w:widowControl/>
               <w:spacing w:before="0" w:after="40"/>
               <w:jc w:val="left"/>
@@ -5574,6 +5785,7 @@
           <w:p>
             <w:pPr>
               <w:pStyle w:val="Compact"/>
+              <w:keepNext w:val="true"/>
               <w:widowControl/>
               <w:spacing w:before="0" w:after="40"/>
               <w:jc w:val="left"/>
@@ -5595,7 +5807,9 @@
         </w:tc>
       </w:tr>
       <w:tr>
-        <w:trPr/>
+        <w:trPr>
+          <w:cantSplit w:val="true"/>
+        </w:trPr>
         <w:tc>
           <w:tcPr>
             <w:tcW w:w="4872" w:type="dxa"/>
@@ -5605,6 +5819,7 @@
           <w:p>
             <w:pPr>
               <w:pStyle w:val="Compact"/>
+              <w:keepNext w:val="true"/>
               <w:widowControl/>
               <w:spacing w:before="0" w:after="40"/>
               <w:jc w:val="left"/>
@@ -5635,6 +5850,7 @@
           <w:p>
             <w:pPr>
               <w:pStyle w:val="Compact"/>
+              <w:keepNext w:val="true"/>
               <w:widowControl/>
               <w:spacing w:before="0" w:after="40"/>
               <w:jc w:val="left"/>
@@ -5674,7 +5890,9 @@
         </w:tc>
       </w:tr>
       <w:tr>
-        <w:trPr/>
+        <w:trPr>
+          <w:cantSplit w:val="true"/>
+        </w:trPr>
         <w:tc>
           <w:tcPr>
             <w:tcW w:w="4872" w:type="dxa"/>
@@ -5684,6 +5902,7 @@
           <w:p>
             <w:pPr>
               <w:pStyle w:val="Compact"/>
+              <w:keepNext w:val="true"/>
               <w:widowControl/>
               <w:spacing w:before="0" w:after="40"/>
               <w:jc w:val="left"/>
@@ -5714,6 +5933,7 @@
           <w:p>
             <w:pPr>
               <w:pStyle w:val="Compact"/>
+              <w:keepNext w:val="true"/>
               <w:widowControl/>
               <w:spacing w:before="0" w:after="40"/>
               <w:jc w:val="left"/>
@@ -5735,7 +5955,9 @@
         </w:tc>
       </w:tr>
       <w:tr>
-        <w:trPr/>
+        <w:trPr>
+          <w:cantSplit w:val="true"/>
+        </w:trPr>
         <w:tc>
           <w:tcPr>
             <w:tcW w:w="4872" w:type="dxa"/>
@@ -5745,6 +5967,7 @@
           <w:p>
             <w:pPr>
               <w:pStyle w:val="Compact"/>
+              <w:keepNext w:val="true"/>
               <w:widowControl/>
               <w:spacing w:before="0" w:after="40"/>
               <w:jc w:val="left"/>
@@ -5775,6 +5998,7 @@
           <w:p>
             <w:pPr>
               <w:pStyle w:val="Compact"/>
+              <w:keepNext w:val="true"/>
               <w:widowControl/>
               <w:spacing w:before="0" w:after="40"/>
               <w:jc w:val="left"/>
@@ -5796,7 +6020,9 @@
         </w:tc>
       </w:tr>
       <w:tr>
-        <w:trPr/>
+        <w:trPr>
+          <w:cantSplit w:val="true"/>
+        </w:trPr>
         <w:tc>
           <w:tcPr>
             <w:tcW w:w="4872" w:type="dxa"/>
@@ -5806,6 +6032,7 @@
           <w:p>
             <w:pPr>
               <w:pStyle w:val="Compact"/>
+              <w:keepNext w:val="true"/>
               <w:widowControl/>
               <w:spacing w:before="0" w:after="40"/>
               <w:jc w:val="left"/>
@@ -5836,6 +6063,7 @@
           <w:p>
             <w:pPr>
               <w:pStyle w:val="Compact"/>
+              <w:keepNext w:val="true"/>
               <w:widowControl/>
               <w:spacing w:before="0" w:after="40"/>
               <w:jc w:val="left"/>
@@ -5885,7 +6113,9 @@
         </w:tc>
       </w:tr>
       <w:tr>
-        <w:trPr/>
+        <w:trPr>
+          <w:cantSplit w:val="true"/>
+        </w:trPr>
         <w:tc>
           <w:tcPr>
             <w:tcW w:w="4872" w:type="dxa"/>
@@ -5895,6 +6125,7 @@
           <w:p>
             <w:pPr>
               <w:pStyle w:val="Compact"/>
+              <w:keepNext w:val="true"/>
               <w:widowControl/>
               <w:spacing w:before="0" w:after="40"/>
               <w:jc w:val="left"/>
@@ -5925,6 +6156,7 @@
           <w:p>
             <w:pPr>
               <w:pStyle w:val="Compact"/>
+              <w:keepNext w:val="true"/>
               <w:widowControl/>
               <w:spacing w:before="0" w:after="40"/>
               <w:jc w:val="left"/>
@@ -5946,7 +6178,9 @@
         </w:tc>
       </w:tr>
       <w:tr>
-        <w:trPr/>
+        <w:trPr>
+          <w:cantSplit w:val="true"/>
+        </w:trPr>
         <w:tc>
           <w:tcPr>
             <w:tcW w:w="4872" w:type="dxa"/>
@@ -6014,7 +6248,7 @@
         <w:pStyle w:val="Heading2"/>
         <w:rPr/>
       </w:pPr>
-      <w:bookmarkStart w:id="30" w:name="__RefHeading___Toc2137_2420786254"/>
+      <w:bookmarkStart w:id="30" w:name="__RefHeading___Toc2153_260347293"/>
       <w:bookmarkEnd w:id="30"/>
       <w:r>
         <w:rPr/>
@@ -6024,6 +6258,8 @@
     <w:p>
       <w:pPr>
         <w:pStyle w:val="FirstParagraph"/>
+        <w:keepNext w:val="true"/>
+        <w:keepLines/>
         <w:rPr/>
       </w:pPr>
       <w:r>
@@ -6111,6 +6347,8 @@
     <w:p>
       <w:pPr>
         <w:pStyle w:val="CaptionedFigure"/>
+        <w:keepNext w:val="true"/>
+        <w:keepLines/>
         <w:rPr/>
       </w:pPr>
       <w:r>
@@ -6167,6 +6405,8 @@
     <w:p>
       <w:pPr>
         <w:pStyle w:val="BodyText"/>
+        <w:keepNext w:val="true"/>
+        <w:keepLines/>
         <w:rPr/>
       </w:pPr>
       <w:r>
@@ -6188,6 +6428,8 @@
     <w:p>
       <w:pPr>
         <w:pStyle w:val="CaptionedFigure"/>
+        <w:keepNext w:val="true"/>
+        <w:keepLines/>
         <w:rPr/>
       </w:pPr>
       <w:r>
@@ -6246,7 +6488,7 @@
         <w:pStyle w:val="Heading2"/>
         <w:rPr/>
       </w:pPr>
-      <w:bookmarkStart w:id="31" w:name="__RefHeading___Toc2139_2420786254"/>
+      <w:bookmarkStart w:id="31" w:name="__RefHeading___Toc2155_260347293"/>
       <w:bookmarkStart w:id="32" w:name="si-algo-no-sale-como-esperabas"/>
       <w:bookmarkEnd w:id="31"/>
       <w:r>
@@ -6257,6 +6499,8 @@
     <w:p>
       <w:pPr>
         <w:pStyle w:val="FirstParagraph"/>
+        <w:keepNext w:val="true"/>
+        <w:keepLines/>
         <w:rPr/>
       </w:pPr>
       <w:r>
@@ -6274,6 +6518,8 @@
     <w:p>
       <w:pPr>
         <w:pStyle w:val="CaptionedFigure"/>
+        <w:keepNext w:val="true"/>
+        <w:keepLines/>
         <w:rPr/>
       </w:pPr>
       <w:r>
@@ -6330,6 +6576,8 @@
     <w:p>
       <w:pPr>
         <w:pStyle w:val="BodyText"/>
+        <w:keepNext w:val="true"/>
+        <w:keepLines/>
         <w:rPr/>
       </w:pPr>
       <w:r>
@@ -6369,6 +6617,8 @@
     <w:p>
       <w:pPr>
         <w:pStyle w:val="CaptionedFigure"/>
+        <w:keepNext w:val="true"/>
+        <w:keepLines/>
         <w:rPr/>
       </w:pPr>
       <w:r>
@@ -6425,6 +6675,8 @@
     <w:p>
       <w:pPr>
         <w:pStyle w:val="BodyText"/>
+        <w:keepNext w:val="true"/>
+        <w:keepLines/>
         <w:rPr/>
       </w:pPr>
       <w:r>
@@ -6460,6 +6712,8 @@
     <w:p>
       <w:pPr>
         <w:pStyle w:val="CaptionedFigure"/>
+        <w:keepNext w:val="true"/>
+        <w:keepLines/>
         <w:rPr/>
       </w:pPr>
       <w:r>
@@ -6516,6 +6770,8 @@
     <w:p>
       <w:pPr>
         <w:pStyle w:val="BodyText"/>
+        <w:keepNext w:val="true"/>
+        <w:keepLines/>
         <w:rPr/>
       </w:pPr>
       <w:r>
@@ -6544,6 +6800,8 @@
     <w:p>
       <w:pPr>
         <w:pStyle w:val="CaptionedFigure"/>
+        <w:keepNext w:val="true"/>
+        <w:keepLines/>
         <w:rPr/>
       </w:pPr>
       <w:r>
@@ -6600,6 +6858,8 @@
     <w:p>
       <w:pPr>
         <w:pStyle w:val="BodyText"/>
+        <w:keepNext w:val="true"/>
+        <w:keepLines/>
         <w:rPr/>
       </w:pPr>
       <w:r>
@@ -6617,6 +6877,8 @@
     <w:p>
       <w:pPr>
         <w:pStyle w:val="CaptionedFigure"/>
+        <w:keepNext w:val="true"/>
+        <w:keepLines/>
         <w:rPr/>
       </w:pPr>
       <w:r>
@@ -6711,7 +6973,7 @@
         <w:pStyle w:val="Heading1"/>
         <w:rPr/>
       </w:pPr>
-      <w:bookmarkStart w:id="33" w:name="__RefHeading___Toc2141_2420786254"/>
+      <w:bookmarkStart w:id="33" w:name="__RefHeading___Toc2157_260347293"/>
       <w:bookmarkStart w:id="34" w:name="parte-2.-guía-del-propietario"/>
       <w:bookmarkEnd w:id="33"/>
       <w:r>
@@ -6734,7 +6996,7 @@
         <w:pStyle w:val="Heading2"/>
         <w:rPr/>
       </w:pPr>
-      <w:bookmarkStart w:id="35" w:name="__RefHeading___Toc2143_2420786254"/>
+      <w:bookmarkStart w:id="35" w:name="__RefHeading___Toc2159_260347293"/>
       <w:bookmarkStart w:id="36" w:name="catálogo-de-productos"/>
       <w:bookmarkEnd w:id="35"/>
       <w:r>
@@ -6745,6 +7007,8 @@
     <w:p>
       <w:pPr>
         <w:pStyle w:val="FirstParagraph"/>
+        <w:keepNext w:val="true"/>
+        <w:keepLines/>
         <w:rPr/>
       </w:pPr>
       <w:r>
@@ -6773,6 +7037,8 @@
     <w:p>
       <w:pPr>
         <w:pStyle w:val="CaptionedFigure"/>
+        <w:keepNext w:val="true"/>
+        <w:keepLines/>
         <w:rPr/>
       </w:pPr>
       <w:r>
@@ -6951,6 +7217,8 @@
     <w:p>
       <w:pPr>
         <w:pStyle w:val="Normal"/>
+        <w:keepNext w:val="true"/>
+        <w:keepLines/>
         <w:numPr>
           <w:ilvl w:val="0"/>
           <w:numId w:val="60"/>
@@ -6959,561 +7227,14 @@
       </w:pPr>
       <w:r>
         <w:rPr/>
-        <w:t>Llena los datos. Los marcados con asterisco son obligatorios:</w:t>
-      </w:r>
-    </w:p>
-    <w:tbl>
-      <w:tblPr>
-        <w:tblStyle w:val="Table"/>
-        <w:tblW w:w="5000" w:type="pct"/>
-        <w:jc w:val="left"/>
-        <w:tblInd w:w="825" w:type="dxa"/>
-        <w:shd w:fill="F8FAFD" w:val="clear"/>
-        <w:tblLayout w:type="fixed"/>
-        <w:tblCellMar>
-          <w:top w:w="60" w:type="dxa"/>
-          <w:left w:w="100" w:type="dxa"/>
-          <w:bottom w:w="60" w:type="dxa"/>
-          <w:right w:w="100" w:type="dxa"/>
-        </w:tblCellMar>
-        <w:tblLook w:val="0020" w:noHBand="0" w:noVBand="0" w:firstColumn="0" w:lastRow="0" w:lastColumn="0" w:firstRow="1"/>
-      </w:tblPr>
-      <w:tblGrid>
-        <w:gridCol w:w="4872"/>
-        <w:gridCol w:w="4873"/>
-      </w:tblGrid>
-      <w:tr>
-        <w:trPr>
-          <w:tblHeader w:val="true"/>
-        </w:trPr>
-        <w:tc>
-          <w:tcPr>
-            <w:tcW w:w="4872" w:type="dxa"/>
-            <w:tcBorders/>
-            <w:shd w:color="auto" w:fill="DCE5FB" w:val="clear"/>
-          </w:tcPr>
-          <w:p>
-            <w:pPr>
-              <w:pStyle w:val="Compact"/>
-              <w:widowControl/>
-              <w:spacing w:before="0" w:after="40"/>
-              <w:jc w:val="left"/>
-              <w:rPr>
-                <w:b/>
-                <w:kern w:val="0"/>
-                <w:szCs w:val="24"/>
-                <w:lang w:val="es-MX" w:eastAsia="en-US" w:bidi="ar-SA"/>
-              </w:rPr>
-            </w:pPr>
-            <w:r>
-              <w:rPr>
-                <w:b/>
-                <w:kern w:val="0"/>
-                <w:szCs w:val="24"/>
-                <w:lang w:val="es-MX" w:eastAsia="en-US" w:bidi="ar-SA"/>
-              </w:rPr>
-              <w:t>Campo</w:t>
-            </w:r>
-          </w:p>
-        </w:tc>
-        <w:tc>
-          <w:tcPr>
-            <w:tcW w:w="4873" w:type="dxa"/>
-            <w:tcBorders/>
-            <w:shd w:color="auto" w:fill="DCE5FB" w:val="clear"/>
-          </w:tcPr>
-          <w:p>
-            <w:pPr>
-              <w:pStyle w:val="Compact"/>
-              <w:widowControl/>
-              <w:spacing w:before="0" w:after="40"/>
-              <w:jc w:val="left"/>
-              <w:rPr>
-                <w:b/>
-                <w:kern w:val="0"/>
-                <w:szCs w:val="24"/>
-                <w:lang w:val="es-MX" w:eastAsia="en-US" w:bidi="ar-SA"/>
-              </w:rPr>
-            </w:pPr>
-            <w:r>
-              <w:rPr>
-                <w:b/>
-                <w:kern w:val="0"/>
-                <w:szCs w:val="24"/>
-                <w:lang w:val="es-MX" w:eastAsia="en-US" w:bidi="ar-SA"/>
-              </w:rPr>
-              <w:t>Para qué sirve</w:t>
-            </w:r>
-          </w:p>
-        </w:tc>
-      </w:tr>
-      <w:tr>
-        <w:trPr/>
-        <w:tc>
-          <w:tcPr>
-            <w:tcW w:w="4872" w:type="dxa"/>
-            <w:tcBorders/>
-            <w:shd w:color="auto" w:fill="F8FAFD" w:val="clear"/>
-          </w:tcPr>
-          <w:p>
-            <w:pPr>
-              <w:pStyle w:val="Compact"/>
-              <w:widowControl/>
-              <w:spacing w:before="0" w:after="40"/>
-              <w:jc w:val="left"/>
-              <w:rPr>
-                <w:kern w:val="0"/>
-                <w:szCs w:val="24"/>
-                <w:lang w:val="es-MX" w:eastAsia="en-US" w:bidi="ar-SA"/>
-              </w:rPr>
-            </w:pPr>
-            <w:r>
-              <w:rPr>
-                <w:b/>
-                <w:bCs/>
-                <w:kern w:val="0"/>
-                <w:szCs w:val="24"/>
-                <w:lang w:val="es-MX" w:eastAsia="en-US" w:bidi="ar-SA"/>
-              </w:rPr>
-              <w:t>Nombre *</w:t>
-            </w:r>
-          </w:p>
-        </w:tc>
-        <w:tc>
-          <w:tcPr>
-            <w:tcW w:w="4873" w:type="dxa"/>
-            <w:tcBorders/>
-            <w:shd w:color="auto" w:fill="F8FAFD" w:val="clear"/>
-          </w:tcPr>
-          <w:p>
-            <w:pPr>
-              <w:pStyle w:val="Compact"/>
-              <w:widowControl/>
-              <w:spacing w:before="0" w:after="40"/>
-              <w:jc w:val="left"/>
-              <w:rPr>
-                <w:kern w:val="0"/>
-                <w:szCs w:val="24"/>
-                <w:lang w:val="es-MX" w:eastAsia="en-US" w:bidi="ar-SA"/>
-              </w:rPr>
-            </w:pPr>
-            <w:r>
-              <w:rPr>
-                <w:kern w:val="0"/>
-                <w:szCs w:val="24"/>
-                <w:lang w:val="es-MX" w:eastAsia="en-US" w:bidi="ar-SA"/>
-              </w:rPr>
-              <w:t>Cómo lo ves al vender.</w:t>
-            </w:r>
-          </w:p>
-        </w:tc>
-      </w:tr>
-      <w:tr>
-        <w:trPr/>
-        <w:tc>
-          <w:tcPr>
-            <w:tcW w:w="4872" w:type="dxa"/>
-            <w:tcBorders/>
-            <w:shd w:color="auto" w:fill="F8FAFD" w:val="clear"/>
-          </w:tcPr>
-          <w:p>
-            <w:pPr>
-              <w:pStyle w:val="Compact"/>
-              <w:widowControl/>
-              <w:spacing w:before="0" w:after="40"/>
-              <w:jc w:val="left"/>
-              <w:rPr>
-                <w:kern w:val="0"/>
-                <w:szCs w:val="24"/>
-                <w:lang w:val="es-MX" w:eastAsia="en-US" w:bidi="ar-SA"/>
-              </w:rPr>
-            </w:pPr>
-            <w:r>
-              <w:rPr>
-                <w:b/>
-                <w:bCs/>
-                <w:kern w:val="0"/>
-                <w:szCs w:val="24"/>
-                <w:lang w:val="es-MX" w:eastAsia="en-US" w:bidi="ar-SA"/>
-              </w:rPr>
-              <w:t>Precio de venta *</w:t>
-            </w:r>
-          </w:p>
-        </w:tc>
-        <w:tc>
-          <w:tcPr>
-            <w:tcW w:w="4873" w:type="dxa"/>
-            <w:tcBorders/>
-            <w:shd w:color="auto" w:fill="F8FAFD" w:val="clear"/>
-          </w:tcPr>
-          <w:p>
-            <w:pPr>
-              <w:pStyle w:val="Compact"/>
-              <w:widowControl/>
-              <w:spacing w:before="0" w:after="40"/>
-              <w:jc w:val="left"/>
-              <w:rPr>
-                <w:kern w:val="0"/>
-                <w:szCs w:val="24"/>
-                <w:lang w:val="es-MX" w:eastAsia="en-US" w:bidi="ar-SA"/>
-              </w:rPr>
-            </w:pPr>
-            <w:r>
-              <w:rPr>
-                <w:kern w:val="0"/>
-                <w:szCs w:val="24"/>
-                <w:lang w:val="es-MX" w:eastAsia="en-US" w:bidi="ar-SA"/>
-              </w:rPr>
-              <w:t>Lo que cobras. Se congela en cada venta.</w:t>
-            </w:r>
-          </w:p>
-        </w:tc>
-      </w:tr>
-      <w:tr>
-        <w:trPr/>
-        <w:tc>
-          <w:tcPr>
-            <w:tcW w:w="4872" w:type="dxa"/>
-            <w:tcBorders/>
-            <w:shd w:color="auto" w:fill="F8FAFD" w:val="clear"/>
-          </w:tcPr>
-          <w:p>
-            <w:pPr>
-              <w:pStyle w:val="Compact"/>
-              <w:widowControl/>
-              <w:spacing w:before="0" w:after="40"/>
-              <w:jc w:val="left"/>
-              <w:rPr>
-                <w:kern w:val="0"/>
-                <w:szCs w:val="24"/>
-                <w:lang w:val="es-MX" w:eastAsia="en-US" w:bidi="ar-SA"/>
-              </w:rPr>
-            </w:pPr>
-            <w:r>
-              <w:rPr>
-                <w:b/>
-                <w:bCs/>
-                <w:kern w:val="0"/>
-                <w:szCs w:val="24"/>
-                <w:lang w:val="es-MX" w:eastAsia="en-US" w:bidi="ar-SA"/>
-              </w:rPr>
-              <w:t>Costo *</w:t>
-            </w:r>
-          </w:p>
-        </w:tc>
-        <w:tc>
-          <w:tcPr>
-            <w:tcW w:w="4873" w:type="dxa"/>
-            <w:tcBorders/>
-            <w:shd w:color="auto" w:fill="F8FAFD" w:val="clear"/>
-          </w:tcPr>
-          <w:p>
-            <w:pPr>
-              <w:pStyle w:val="Compact"/>
-              <w:widowControl/>
-              <w:spacing w:before="0" w:after="40"/>
-              <w:jc w:val="left"/>
-              <w:rPr>
-                <w:kern w:val="0"/>
-                <w:szCs w:val="24"/>
-                <w:lang w:val="es-MX" w:eastAsia="en-US" w:bidi="ar-SA"/>
-              </w:rPr>
-            </w:pPr>
-            <w:r>
-              <w:rPr>
-                <w:kern w:val="0"/>
-                <w:szCs w:val="24"/>
-                <w:lang w:val="es-MX" w:eastAsia="en-US" w:bidi="ar-SA"/>
-              </w:rPr>
-              <w:t>Lo que te cuesta. Con él se calcula la utilidad bruta; si no lo conoces, puede ser 0.</w:t>
-            </w:r>
-          </w:p>
-        </w:tc>
-      </w:tr>
-      <w:tr>
-        <w:trPr/>
-        <w:tc>
-          <w:tcPr>
-            <w:tcW w:w="4872" w:type="dxa"/>
-            <w:tcBorders/>
-            <w:shd w:color="auto" w:fill="F8FAFD" w:val="clear"/>
-          </w:tcPr>
-          <w:p>
-            <w:pPr>
-              <w:pStyle w:val="Compact"/>
-              <w:widowControl/>
-              <w:spacing w:before="0" w:after="40"/>
-              <w:jc w:val="left"/>
-              <w:rPr>
-                <w:kern w:val="0"/>
-                <w:szCs w:val="24"/>
-                <w:lang w:val="es-MX" w:eastAsia="en-US" w:bidi="ar-SA"/>
-              </w:rPr>
-            </w:pPr>
-            <w:r>
-              <w:rPr>
-                <w:b/>
-                <w:bCs/>
-                <w:kern w:val="0"/>
-                <w:szCs w:val="24"/>
-                <w:lang w:val="es-MX" w:eastAsia="en-US" w:bidi="ar-SA"/>
-              </w:rPr>
-              <w:t>Unidad</w:t>
-            </w:r>
-          </w:p>
-        </w:tc>
-        <w:tc>
-          <w:tcPr>
-            <w:tcW w:w="4873" w:type="dxa"/>
-            <w:tcBorders/>
-            <w:shd w:color="auto" w:fill="F8FAFD" w:val="clear"/>
-          </w:tcPr>
-          <w:p>
-            <w:pPr>
-              <w:pStyle w:val="Compact"/>
-              <w:widowControl/>
-              <w:spacing w:before="0" w:after="40"/>
-              <w:jc w:val="left"/>
-              <w:rPr>
-                <w:kern w:val="0"/>
-                <w:szCs w:val="24"/>
-                <w:lang w:val="es-MX" w:eastAsia="en-US" w:bidi="ar-SA"/>
-              </w:rPr>
-            </w:pPr>
-            <w:r>
-              <w:rPr>
-                <w:kern w:val="0"/>
-                <w:szCs w:val="24"/>
-                <w:lang w:val="es-MX" w:eastAsia="en-US" w:bidi="ar-SA"/>
-              </w:rPr>
-              <w:t>Por ejemplo, pieza.</w:t>
-            </w:r>
-          </w:p>
-        </w:tc>
-      </w:tr>
-      <w:tr>
-        <w:trPr/>
-        <w:tc>
-          <w:tcPr>
-            <w:tcW w:w="4872" w:type="dxa"/>
-            <w:tcBorders/>
-            <w:shd w:color="auto" w:fill="F8FAFD" w:val="clear"/>
-          </w:tcPr>
-          <w:p>
-            <w:pPr>
-              <w:pStyle w:val="Compact"/>
-              <w:widowControl/>
-              <w:spacing w:before="0" w:after="40"/>
-              <w:jc w:val="left"/>
-              <w:rPr>
-                <w:kern w:val="0"/>
-                <w:szCs w:val="24"/>
-                <w:lang w:val="es-MX" w:eastAsia="en-US" w:bidi="ar-SA"/>
-              </w:rPr>
-            </w:pPr>
-            <w:r>
-              <w:rPr>
-                <w:b/>
-                <w:bCs/>
-                <w:kern w:val="0"/>
-                <w:szCs w:val="24"/>
-                <w:lang w:val="es-MX" w:eastAsia="en-US" w:bidi="ar-SA"/>
-              </w:rPr>
-              <w:t>Código interno</w:t>
-            </w:r>
-          </w:p>
-        </w:tc>
-        <w:tc>
-          <w:tcPr>
-            <w:tcW w:w="4873" w:type="dxa"/>
-            <w:tcBorders/>
-            <w:shd w:color="auto" w:fill="F8FAFD" w:val="clear"/>
-          </w:tcPr>
-          <w:p>
-            <w:pPr>
-              <w:pStyle w:val="Compact"/>
-              <w:widowControl/>
-              <w:spacing w:before="0" w:after="40"/>
-              <w:jc w:val="left"/>
-              <w:rPr>
-                <w:kern w:val="0"/>
-                <w:szCs w:val="24"/>
-                <w:lang w:val="es-MX" w:eastAsia="en-US" w:bidi="ar-SA"/>
-              </w:rPr>
-            </w:pPr>
-            <w:r>
-              <w:rPr>
-                <w:kern w:val="0"/>
-                <w:szCs w:val="24"/>
-                <w:lang w:val="es-MX" w:eastAsia="en-US" w:bidi="ar-SA"/>
-              </w:rPr>
-              <w:t>Opcional, para buscarlo rápido. No puede repetirse.</w:t>
-            </w:r>
-          </w:p>
-        </w:tc>
-      </w:tr>
-      <w:tr>
-        <w:trPr/>
-        <w:tc>
-          <w:tcPr>
-            <w:tcW w:w="4872" w:type="dxa"/>
-            <w:tcBorders/>
-            <w:shd w:color="auto" w:fill="F8FAFD" w:val="clear"/>
-          </w:tcPr>
-          <w:p>
-            <w:pPr>
-              <w:pStyle w:val="Compact"/>
-              <w:widowControl/>
-              <w:spacing w:before="0" w:after="40"/>
-              <w:jc w:val="left"/>
-              <w:rPr>
-                <w:kern w:val="0"/>
-                <w:szCs w:val="24"/>
-                <w:lang w:val="es-MX" w:eastAsia="en-US" w:bidi="ar-SA"/>
-              </w:rPr>
-            </w:pPr>
-            <w:r>
-              <w:rPr>
-                <w:b/>
-                <w:bCs/>
-                <w:kern w:val="0"/>
-                <w:szCs w:val="24"/>
-                <w:lang w:val="es-MX" w:eastAsia="en-US" w:bidi="ar-SA"/>
-              </w:rPr>
-              <w:t>Categoría</w:t>
-            </w:r>
-            <w:r>
-              <w:rPr>
-                <w:kern w:val="0"/>
-                <w:szCs w:val="24"/>
-                <w:lang w:val="es-MX" w:eastAsia="en-US" w:bidi="ar-SA"/>
-              </w:rPr>
-              <w:t xml:space="preserve">, </w:t>
-            </w:r>
-            <w:r>
-              <w:rPr>
-                <w:b/>
-                <w:bCs/>
-                <w:kern w:val="0"/>
-                <w:szCs w:val="24"/>
-                <w:lang w:val="es-MX" w:eastAsia="en-US" w:bidi="ar-SA"/>
-              </w:rPr>
-              <w:t>Descripción</w:t>
-            </w:r>
-            <w:r>
-              <w:rPr>
-                <w:kern w:val="0"/>
-                <w:szCs w:val="24"/>
-                <w:lang w:val="es-MX" w:eastAsia="en-US" w:bidi="ar-SA"/>
-              </w:rPr>
-              <w:t xml:space="preserve">, </w:t>
-            </w:r>
-            <w:r>
-              <w:rPr>
-                <w:b/>
-                <w:bCs/>
-                <w:kern w:val="0"/>
-                <w:szCs w:val="24"/>
-                <w:lang w:val="es-MX" w:eastAsia="en-US" w:bidi="ar-SA"/>
-              </w:rPr>
-              <w:t>Notas</w:t>
-            </w:r>
-          </w:p>
-        </w:tc>
-        <w:tc>
-          <w:tcPr>
-            <w:tcW w:w="4873" w:type="dxa"/>
-            <w:tcBorders/>
-            <w:shd w:color="auto" w:fill="F8FAFD" w:val="clear"/>
-          </w:tcPr>
-          <w:p>
-            <w:pPr>
-              <w:pStyle w:val="Compact"/>
-              <w:widowControl/>
-              <w:spacing w:before="0" w:after="40"/>
-              <w:jc w:val="left"/>
-              <w:rPr>
-                <w:kern w:val="0"/>
-                <w:szCs w:val="24"/>
-                <w:lang w:val="es-MX" w:eastAsia="en-US" w:bidi="ar-SA"/>
-              </w:rPr>
-            </w:pPr>
-            <w:r>
-              <w:rPr>
-                <w:kern w:val="0"/>
-                <w:szCs w:val="24"/>
-                <w:lang w:val="es-MX" w:eastAsia="en-US" w:bidi="ar-SA"/>
-              </w:rPr>
-              <w:t>Opcionales.</w:t>
-            </w:r>
-          </w:p>
-        </w:tc>
-      </w:tr>
-      <w:tr>
-        <w:trPr/>
-        <w:tc>
-          <w:tcPr>
-            <w:tcW w:w="4872" w:type="dxa"/>
-            <w:tcBorders/>
-            <w:shd w:color="auto" w:fill="F8FAFD" w:val="clear"/>
-          </w:tcPr>
-          <w:p>
-            <w:pPr>
-              <w:pStyle w:val="Compact"/>
-              <w:widowControl/>
-              <w:spacing w:before="0" w:after="40"/>
-              <w:jc w:val="left"/>
-              <w:rPr>
-                <w:kern w:val="0"/>
-                <w:szCs w:val="24"/>
-                <w:lang w:val="es-MX" w:eastAsia="en-US" w:bidi="ar-SA"/>
-              </w:rPr>
-            </w:pPr>
-            <w:r>
-              <w:rPr>
-                <w:b/>
-                <w:bCs/>
-                <w:kern w:val="0"/>
-                <w:szCs w:val="24"/>
-                <w:lang w:val="es-MX" w:eastAsia="en-US" w:bidi="ar-SA"/>
-              </w:rPr>
-              <w:t>Producto activo</w:t>
-            </w:r>
-          </w:p>
-        </w:tc>
-        <w:tc>
-          <w:tcPr>
-            <w:tcW w:w="4873" w:type="dxa"/>
-            <w:tcBorders/>
-            <w:shd w:color="auto" w:fill="F8FAFD" w:val="clear"/>
-          </w:tcPr>
-          <w:p>
-            <w:pPr>
-              <w:pStyle w:val="Compact"/>
-              <w:widowControl/>
-              <w:spacing w:before="0" w:after="40"/>
-              <w:jc w:val="left"/>
-              <w:rPr>
-                <w:kern w:val="0"/>
-                <w:szCs w:val="24"/>
-                <w:lang w:val="es-MX" w:eastAsia="en-US" w:bidi="ar-SA"/>
-              </w:rPr>
-            </w:pPr>
-            <w:r>
-              <w:rPr>
-                <w:kern w:val="0"/>
-                <w:szCs w:val="24"/>
-                <w:lang w:val="es-MX" w:eastAsia="en-US" w:bidi="ar-SA"/>
-              </w:rPr>
-              <w:t>Si está apagado, no se puede vender.</w:t>
-            </w:r>
-          </w:p>
-        </w:tc>
-      </w:tr>
-    </w:tbl>
+        <w:t>Llena los datos del formulario. Los marcados con asterisco son obligatorios.</w:t>
+      </w:r>
+    </w:p>
     <w:p>
       <w:pPr>
         <w:pStyle w:val="CaptionedFigure"/>
+        <w:keepNext w:val="true"/>
+        <w:keepLines/>
         <w:numPr>
           <w:ilvl w:val="0"/>
           <w:numId w:val="1"/>
@@ -7578,6 +7299,601 @@
     <w:p>
       <w:pPr>
         <w:pStyle w:val="Normal"/>
+        <w:keepNext w:val="true"/>
+        <w:numPr>
+          <w:ilvl w:val="0"/>
+          <w:numId w:val="1"/>
+        </w:numPr>
+        <w:rPr/>
+      </w:pPr>
+      <w:r>
+        <w:rPr/>
+        <w:t>Qué va en cada campo:</w:t>
+      </w:r>
+    </w:p>
+    <w:tbl>
+      <w:tblPr>
+        <w:tblStyle w:val="Table"/>
+        <w:tblW w:w="5000" w:type="pct"/>
+        <w:jc w:val="left"/>
+        <w:tblInd w:w="825" w:type="dxa"/>
+        <w:shd w:fill="F8FAFD" w:val="clear"/>
+        <w:tblLayout w:type="fixed"/>
+        <w:tblCellMar>
+          <w:top w:w="60" w:type="dxa"/>
+          <w:left w:w="100" w:type="dxa"/>
+          <w:bottom w:w="60" w:type="dxa"/>
+          <w:right w:w="100" w:type="dxa"/>
+        </w:tblCellMar>
+        <w:tblLook w:val="0020" w:noHBand="0" w:noVBand="0" w:firstColumn="0" w:lastRow="0" w:lastColumn="0" w:firstRow="1"/>
+      </w:tblPr>
+      <w:tblGrid>
+        <w:gridCol w:w="4872"/>
+        <w:gridCol w:w="4873"/>
+      </w:tblGrid>
+      <w:tr>
+        <w:trPr>
+          <w:tblHeader w:val="true"/>
+          <w:cantSplit w:val="true"/>
+        </w:trPr>
+        <w:tc>
+          <w:tcPr>
+            <w:tcW w:w="4872" w:type="dxa"/>
+            <w:tcBorders/>
+            <w:shd w:color="auto" w:fill="DCE5FB" w:val="clear"/>
+          </w:tcPr>
+          <w:p>
+            <w:pPr>
+              <w:pStyle w:val="Compact"/>
+              <w:keepNext w:val="true"/>
+              <w:widowControl/>
+              <w:spacing w:before="0" w:after="40"/>
+              <w:jc w:val="left"/>
+              <w:rPr>
+                <w:b/>
+                <w:kern w:val="0"/>
+                <w:szCs w:val="24"/>
+                <w:lang w:val="es-MX" w:eastAsia="en-US" w:bidi="ar-SA"/>
+              </w:rPr>
+            </w:pPr>
+            <w:r>
+              <w:rPr>
+                <w:b/>
+                <w:kern w:val="0"/>
+                <w:szCs w:val="24"/>
+                <w:lang w:val="es-MX" w:eastAsia="en-US" w:bidi="ar-SA"/>
+              </w:rPr>
+              <w:t>Campo</w:t>
+            </w:r>
+          </w:p>
+        </w:tc>
+        <w:tc>
+          <w:tcPr>
+            <w:tcW w:w="4873" w:type="dxa"/>
+            <w:tcBorders/>
+            <w:shd w:color="auto" w:fill="DCE5FB" w:val="clear"/>
+          </w:tcPr>
+          <w:p>
+            <w:pPr>
+              <w:pStyle w:val="Compact"/>
+              <w:keepNext w:val="true"/>
+              <w:widowControl/>
+              <w:spacing w:before="0" w:after="40"/>
+              <w:jc w:val="left"/>
+              <w:rPr>
+                <w:b/>
+                <w:kern w:val="0"/>
+                <w:szCs w:val="24"/>
+                <w:lang w:val="es-MX" w:eastAsia="en-US" w:bidi="ar-SA"/>
+              </w:rPr>
+            </w:pPr>
+            <w:r>
+              <w:rPr>
+                <w:b/>
+                <w:kern w:val="0"/>
+                <w:szCs w:val="24"/>
+                <w:lang w:val="es-MX" w:eastAsia="en-US" w:bidi="ar-SA"/>
+              </w:rPr>
+              <w:t>Para qué sirve</w:t>
+            </w:r>
+          </w:p>
+        </w:tc>
+      </w:tr>
+      <w:tr>
+        <w:trPr>
+          <w:cantSplit w:val="true"/>
+        </w:trPr>
+        <w:tc>
+          <w:tcPr>
+            <w:tcW w:w="4872" w:type="dxa"/>
+            <w:tcBorders/>
+            <w:shd w:color="auto" w:fill="F8FAFD" w:val="clear"/>
+          </w:tcPr>
+          <w:p>
+            <w:pPr>
+              <w:pStyle w:val="Compact"/>
+              <w:keepNext w:val="true"/>
+              <w:widowControl/>
+              <w:spacing w:before="0" w:after="40"/>
+              <w:jc w:val="left"/>
+              <w:rPr>
+                <w:kern w:val="0"/>
+                <w:szCs w:val="24"/>
+                <w:lang w:val="es-MX" w:eastAsia="en-US" w:bidi="ar-SA"/>
+              </w:rPr>
+            </w:pPr>
+            <w:r>
+              <w:rPr>
+                <w:b/>
+                <w:bCs/>
+                <w:kern w:val="0"/>
+                <w:szCs w:val="24"/>
+                <w:lang w:val="es-MX" w:eastAsia="en-US" w:bidi="ar-SA"/>
+              </w:rPr>
+              <w:t>Nombre *</w:t>
+            </w:r>
+          </w:p>
+        </w:tc>
+        <w:tc>
+          <w:tcPr>
+            <w:tcW w:w="4873" w:type="dxa"/>
+            <w:tcBorders/>
+            <w:shd w:color="auto" w:fill="F8FAFD" w:val="clear"/>
+          </w:tcPr>
+          <w:p>
+            <w:pPr>
+              <w:pStyle w:val="Compact"/>
+              <w:keepNext w:val="true"/>
+              <w:widowControl/>
+              <w:spacing w:before="0" w:after="40"/>
+              <w:jc w:val="left"/>
+              <w:rPr>
+                <w:kern w:val="0"/>
+                <w:szCs w:val="24"/>
+                <w:lang w:val="es-MX" w:eastAsia="en-US" w:bidi="ar-SA"/>
+              </w:rPr>
+            </w:pPr>
+            <w:r>
+              <w:rPr>
+                <w:kern w:val="0"/>
+                <w:szCs w:val="24"/>
+                <w:lang w:val="es-MX" w:eastAsia="en-US" w:bidi="ar-SA"/>
+              </w:rPr>
+              <w:t>Cómo lo ves al vender.</w:t>
+            </w:r>
+          </w:p>
+        </w:tc>
+      </w:tr>
+      <w:tr>
+        <w:trPr>
+          <w:cantSplit w:val="true"/>
+        </w:trPr>
+        <w:tc>
+          <w:tcPr>
+            <w:tcW w:w="4872" w:type="dxa"/>
+            <w:tcBorders/>
+            <w:shd w:color="auto" w:fill="F8FAFD" w:val="clear"/>
+          </w:tcPr>
+          <w:p>
+            <w:pPr>
+              <w:pStyle w:val="Compact"/>
+              <w:keepNext w:val="true"/>
+              <w:widowControl/>
+              <w:spacing w:before="0" w:after="40"/>
+              <w:jc w:val="left"/>
+              <w:rPr>
+                <w:kern w:val="0"/>
+                <w:szCs w:val="24"/>
+                <w:lang w:val="es-MX" w:eastAsia="en-US" w:bidi="ar-SA"/>
+              </w:rPr>
+            </w:pPr>
+            <w:r>
+              <w:rPr>
+                <w:b/>
+                <w:bCs/>
+                <w:kern w:val="0"/>
+                <w:szCs w:val="24"/>
+                <w:lang w:val="es-MX" w:eastAsia="en-US" w:bidi="ar-SA"/>
+              </w:rPr>
+              <w:t>Precio de venta *</w:t>
+            </w:r>
+          </w:p>
+        </w:tc>
+        <w:tc>
+          <w:tcPr>
+            <w:tcW w:w="4873" w:type="dxa"/>
+            <w:tcBorders/>
+            <w:shd w:color="auto" w:fill="F8FAFD" w:val="clear"/>
+          </w:tcPr>
+          <w:p>
+            <w:pPr>
+              <w:pStyle w:val="Compact"/>
+              <w:keepNext w:val="true"/>
+              <w:widowControl/>
+              <w:spacing w:before="0" w:after="40"/>
+              <w:jc w:val="left"/>
+              <w:rPr>
+                <w:kern w:val="0"/>
+                <w:szCs w:val="24"/>
+                <w:lang w:val="es-MX" w:eastAsia="en-US" w:bidi="ar-SA"/>
+              </w:rPr>
+            </w:pPr>
+            <w:r>
+              <w:rPr>
+                <w:kern w:val="0"/>
+                <w:szCs w:val="24"/>
+                <w:lang w:val="es-MX" w:eastAsia="en-US" w:bidi="ar-SA"/>
+              </w:rPr>
+              <w:t>Lo que cobras. Se congela en cada venta.</w:t>
+            </w:r>
+          </w:p>
+        </w:tc>
+      </w:tr>
+      <w:tr>
+        <w:trPr>
+          <w:cantSplit w:val="true"/>
+        </w:trPr>
+        <w:tc>
+          <w:tcPr>
+            <w:tcW w:w="4872" w:type="dxa"/>
+            <w:tcBorders/>
+            <w:shd w:color="auto" w:fill="F8FAFD" w:val="clear"/>
+          </w:tcPr>
+          <w:p>
+            <w:pPr>
+              <w:pStyle w:val="Compact"/>
+              <w:keepNext w:val="true"/>
+              <w:widowControl/>
+              <w:spacing w:before="0" w:after="40"/>
+              <w:jc w:val="left"/>
+              <w:rPr>
+                <w:kern w:val="0"/>
+                <w:szCs w:val="24"/>
+                <w:lang w:val="es-MX" w:eastAsia="en-US" w:bidi="ar-SA"/>
+              </w:rPr>
+            </w:pPr>
+            <w:r>
+              <w:rPr>
+                <w:b/>
+                <w:bCs/>
+                <w:kern w:val="0"/>
+                <w:szCs w:val="24"/>
+                <w:lang w:val="es-MX" w:eastAsia="en-US" w:bidi="ar-SA"/>
+              </w:rPr>
+              <w:t>Costo *</w:t>
+            </w:r>
+          </w:p>
+        </w:tc>
+        <w:tc>
+          <w:tcPr>
+            <w:tcW w:w="4873" w:type="dxa"/>
+            <w:tcBorders/>
+            <w:shd w:color="auto" w:fill="F8FAFD" w:val="clear"/>
+          </w:tcPr>
+          <w:p>
+            <w:pPr>
+              <w:pStyle w:val="Compact"/>
+              <w:keepNext w:val="true"/>
+              <w:widowControl/>
+              <w:spacing w:before="0" w:after="40"/>
+              <w:jc w:val="left"/>
+              <w:rPr>
+                <w:kern w:val="0"/>
+                <w:szCs w:val="24"/>
+                <w:lang w:val="es-MX" w:eastAsia="en-US" w:bidi="ar-SA"/>
+              </w:rPr>
+            </w:pPr>
+            <w:r>
+              <w:rPr>
+                <w:kern w:val="0"/>
+                <w:szCs w:val="24"/>
+                <w:lang w:val="es-MX" w:eastAsia="en-US" w:bidi="ar-SA"/>
+              </w:rPr>
+              <w:t>Lo que te cuesta. Con él se calcula la utilidad bruta; si no lo conoces, puede ser 0.</w:t>
+            </w:r>
+          </w:p>
+        </w:tc>
+      </w:tr>
+      <w:tr>
+        <w:trPr>
+          <w:cantSplit w:val="true"/>
+        </w:trPr>
+        <w:tc>
+          <w:tcPr>
+            <w:tcW w:w="4872" w:type="dxa"/>
+            <w:tcBorders/>
+            <w:shd w:color="auto" w:fill="F8FAFD" w:val="clear"/>
+          </w:tcPr>
+          <w:p>
+            <w:pPr>
+              <w:pStyle w:val="Compact"/>
+              <w:keepNext w:val="true"/>
+              <w:widowControl/>
+              <w:spacing w:before="0" w:after="40"/>
+              <w:jc w:val="left"/>
+              <w:rPr>
+                <w:kern w:val="0"/>
+                <w:szCs w:val="24"/>
+                <w:lang w:val="es-MX" w:eastAsia="en-US" w:bidi="ar-SA"/>
+              </w:rPr>
+            </w:pPr>
+            <w:r>
+              <w:rPr>
+                <w:b/>
+                <w:bCs/>
+                <w:kern w:val="0"/>
+                <w:szCs w:val="24"/>
+                <w:lang w:val="es-MX" w:eastAsia="en-US" w:bidi="ar-SA"/>
+              </w:rPr>
+              <w:t>Unidad</w:t>
+            </w:r>
+          </w:p>
+        </w:tc>
+        <w:tc>
+          <w:tcPr>
+            <w:tcW w:w="4873" w:type="dxa"/>
+            <w:tcBorders/>
+            <w:shd w:color="auto" w:fill="F8FAFD" w:val="clear"/>
+          </w:tcPr>
+          <w:p>
+            <w:pPr>
+              <w:pStyle w:val="Compact"/>
+              <w:keepNext w:val="true"/>
+              <w:widowControl/>
+              <w:spacing w:before="0" w:after="40"/>
+              <w:jc w:val="left"/>
+              <w:rPr>
+                <w:kern w:val="0"/>
+                <w:szCs w:val="24"/>
+                <w:lang w:val="es-MX" w:eastAsia="en-US" w:bidi="ar-SA"/>
+              </w:rPr>
+            </w:pPr>
+            <w:r>
+              <w:rPr>
+                <w:kern w:val="0"/>
+                <w:szCs w:val="24"/>
+                <w:lang w:val="es-MX" w:eastAsia="en-US" w:bidi="ar-SA"/>
+              </w:rPr>
+              <w:t>Por ejemplo, pieza.</w:t>
+            </w:r>
+          </w:p>
+        </w:tc>
+      </w:tr>
+      <w:tr>
+        <w:trPr>
+          <w:cantSplit w:val="true"/>
+        </w:trPr>
+        <w:tc>
+          <w:tcPr>
+            <w:tcW w:w="4872" w:type="dxa"/>
+            <w:tcBorders/>
+            <w:shd w:color="auto" w:fill="F8FAFD" w:val="clear"/>
+          </w:tcPr>
+          <w:p>
+            <w:pPr>
+              <w:pStyle w:val="Compact"/>
+              <w:keepNext w:val="true"/>
+              <w:widowControl/>
+              <w:spacing w:before="0" w:after="40"/>
+              <w:jc w:val="left"/>
+              <w:rPr>
+                <w:kern w:val="0"/>
+                <w:szCs w:val="24"/>
+                <w:lang w:val="es-MX" w:eastAsia="en-US" w:bidi="ar-SA"/>
+              </w:rPr>
+            </w:pPr>
+            <w:r>
+              <w:rPr>
+                <w:b/>
+                <w:bCs/>
+                <w:kern w:val="0"/>
+                <w:szCs w:val="24"/>
+                <w:lang w:val="es-MX" w:eastAsia="en-US" w:bidi="ar-SA"/>
+              </w:rPr>
+              <w:t>Código interno</w:t>
+            </w:r>
+          </w:p>
+        </w:tc>
+        <w:tc>
+          <w:tcPr>
+            <w:tcW w:w="4873" w:type="dxa"/>
+            <w:tcBorders/>
+            <w:shd w:color="auto" w:fill="F8FAFD" w:val="clear"/>
+          </w:tcPr>
+          <w:p>
+            <w:pPr>
+              <w:pStyle w:val="Compact"/>
+              <w:keepNext w:val="true"/>
+              <w:widowControl/>
+              <w:spacing w:before="0" w:after="40"/>
+              <w:jc w:val="left"/>
+              <w:rPr>
+                <w:kern w:val="0"/>
+                <w:szCs w:val="24"/>
+                <w:lang w:val="es-MX" w:eastAsia="en-US" w:bidi="ar-SA"/>
+              </w:rPr>
+            </w:pPr>
+            <w:r>
+              <w:rPr>
+                <w:kern w:val="0"/>
+                <w:szCs w:val="24"/>
+                <w:lang w:val="es-MX" w:eastAsia="en-US" w:bidi="ar-SA"/>
+              </w:rPr>
+              <w:t>Opcional, para buscarlo rápido. No puede repetirse.</w:t>
+            </w:r>
+          </w:p>
+        </w:tc>
+      </w:tr>
+      <w:tr>
+        <w:trPr>
+          <w:cantSplit w:val="true"/>
+        </w:trPr>
+        <w:tc>
+          <w:tcPr>
+            <w:tcW w:w="4872" w:type="dxa"/>
+            <w:tcBorders/>
+            <w:shd w:color="auto" w:fill="F8FAFD" w:val="clear"/>
+          </w:tcPr>
+          <w:p>
+            <w:pPr>
+              <w:pStyle w:val="Compact"/>
+              <w:keepNext w:val="true"/>
+              <w:widowControl/>
+              <w:spacing w:before="0" w:after="40"/>
+              <w:jc w:val="left"/>
+              <w:rPr>
+                <w:kern w:val="0"/>
+                <w:szCs w:val="24"/>
+                <w:lang w:val="es-MX" w:eastAsia="en-US" w:bidi="ar-SA"/>
+              </w:rPr>
+            </w:pPr>
+            <w:r>
+              <w:rPr>
+                <w:b/>
+                <w:bCs/>
+                <w:kern w:val="0"/>
+                <w:szCs w:val="24"/>
+                <w:lang w:val="es-MX" w:eastAsia="en-US" w:bidi="ar-SA"/>
+              </w:rPr>
+              <w:t>Categoría</w:t>
+            </w:r>
+            <w:r>
+              <w:rPr>
+                <w:kern w:val="0"/>
+                <w:szCs w:val="24"/>
+                <w:lang w:val="es-MX" w:eastAsia="en-US" w:bidi="ar-SA"/>
+              </w:rPr>
+              <w:t xml:space="preserve">, </w:t>
+            </w:r>
+            <w:r>
+              <w:rPr>
+                <w:b/>
+                <w:bCs/>
+                <w:kern w:val="0"/>
+                <w:szCs w:val="24"/>
+                <w:lang w:val="es-MX" w:eastAsia="en-US" w:bidi="ar-SA"/>
+              </w:rPr>
+              <w:t>Descripción</w:t>
+            </w:r>
+            <w:r>
+              <w:rPr>
+                <w:kern w:val="0"/>
+                <w:szCs w:val="24"/>
+                <w:lang w:val="es-MX" w:eastAsia="en-US" w:bidi="ar-SA"/>
+              </w:rPr>
+              <w:t xml:space="preserve">, </w:t>
+            </w:r>
+            <w:r>
+              <w:rPr>
+                <w:b/>
+                <w:bCs/>
+                <w:kern w:val="0"/>
+                <w:szCs w:val="24"/>
+                <w:lang w:val="es-MX" w:eastAsia="en-US" w:bidi="ar-SA"/>
+              </w:rPr>
+              <w:t>Notas</w:t>
+            </w:r>
+          </w:p>
+        </w:tc>
+        <w:tc>
+          <w:tcPr>
+            <w:tcW w:w="4873" w:type="dxa"/>
+            <w:tcBorders/>
+            <w:shd w:color="auto" w:fill="F8FAFD" w:val="clear"/>
+          </w:tcPr>
+          <w:p>
+            <w:pPr>
+              <w:pStyle w:val="Compact"/>
+              <w:keepNext w:val="true"/>
+              <w:widowControl/>
+              <w:spacing w:before="0" w:after="40"/>
+              <w:jc w:val="left"/>
+              <w:rPr>
+                <w:kern w:val="0"/>
+                <w:szCs w:val="24"/>
+                <w:lang w:val="es-MX" w:eastAsia="en-US" w:bidi="ar-SA"/>
+              </w:rPr>
+            </w:pPr>
+            <w:r>
+              <w:rPr>
+                <w:kern w:val="0"/>
+                <w:szCs w:val="24"/>
+                <w:lang w:val="es-MX" w:eastAsia="en-US" w:bidi="ar-SA"/>
+              </w:rPr>
+              <w:t>Opcionales.</w:t>
+            </w:r>
+          </w:p>
+        </w:tc>
+      </w:tr>
+      <w:tr>
+        <w:trPr>
+          <w:cantSplit w:val="true"/>
+        </w:trPr>
+        <w:tc>
+          <w:tcPr>
+            <w:tcW w:w="4872" w:type="dxa"/>
+            <w:tcBorders/>
+            <w:shd w:color="auto" w:fill="F8FAFD" w:val="clear"/>
+          </w:tcPr>
+          <w:p>
+            <w:pPr>
+              <w:pStyle w:val="Compact"/>
+              <w:widowControl/>
+              <w:spacing w:before="0" w:after="40"/>
+              <w:jc w:val="left"/>
+              <w:rPr>
+                <w:kern w:val="0"/>
+                <w:szCs w:val="24"/>
+                <w:lang w:val="es-MX" w:eastAsia="en-US" w:bidi="ar-SA"/>
+              </w:rPr>
+            </w:pPr>
+            <w:r>
+              <w:rPr>
+                <w:b/>
+                <w:bCs/>
+                <w:kern w:val="0"/>
+                <w:szCs w:val="24"/>
+                <w:lang w:val="es-MX" w:eastAsia="en-US" w:bidi="ar-SA"/>
+              </w:rPr>
+              <w:t>Producto activo</w:t>
+            </w:r>
+          </w:p>
+        </w:tc>
+        <w:tc>
+          <w:tcPr>
+            <w:tcW w:w="4873" w:type="dxa"/>
+            <w:tcBorders/>
+            <w:shd w:color="auto" w:fill="F8FAFD" w:val="clear"/>
+          </w:tcPr>
+          <w:p>
+            <w:pPr>
+              <w:pStyle w:val="Compact"/>
+              <w:widowControl/>
+              <w:spacing w:before="0" w:after="40"/>
+              <w:jc w:val="left"/>
+              <w:rPr>
+                <w:kern w:val="0"/>
+                <w:szCs w:val="24"/>
+                <w:lang w:val="es-MX" w:eastAsia="en-US" w:bidi="ar-SA"/>
+              </w:rPr>
+            </w:pPr>
+            <w:r>
+              <w:rPr>
+                <w:kern w:val="0"/>
+                <w:szCs w:val="24"/>
+                <w:lang w:val="es-MX" w:eastAsia="en-US" w:bidi="ar-SA"/>
+              </w:rPr>
+              <w:t>Si está apagado, no se puede vender.</w:t>
+            </w:r>
+          </w:p>
+        </w:tc>
+      </w:tr>
+    </w:tbl>
+    <w:p>
+      <w:pPr>
+        <w:pStyle w:val="Normal"/>
+        <w:keepNext w:val="true"/>
+        <w:keepLines/>
         <w:numPr>
           <w:ilvl w:val="0"/>
           <w:numId w:val="61"/>
@@ -7614,6 +7930,8 @@
     <w:p>
       <w:pPr>
         <w:pStyle w:val="CaptionedFigure"/>
+        <w:keepNext w:val="true"/>
+        <w:keepLines/>
         <w:numPr>
           <w:ilvl w:val="0"/>
           <w:numId w:val="1"/>
@@ -7733,6 +8051,8 @@
     <w:p>
       <w:pPr>
         <w:pStyle w:val="FirstParagraph"/>
+        <w:keepNext w:val="true"/>
+        <w:keepLines/>
         <w:rPr/>
       </w:pPr>
       <w:r>
@@ -7754,6 +8074,8 @@
     <w:p>
       <w:pPr>
         <w:pStyle w:val="CaptionedFigure"/>
+        <w:keepNext w:val="true"/>
+        <w:keepLines/>
         <w:rPr/>
       </w:pPr>
       <w:r>
@@ -7810,6 +8132,8 @@
     <w:p>
       <w:pPr>
         <w:pStyle w:val="BodyText"/>
+        <w:keepNext w:val="true"/>
+        <w:keepLines/>
         <w:rPr/>
       </w:pPr>
       <w:r>
@@ -7831,6 +8155,8 @@
     <w:p>
       <w:pPr>
         <w:pStyle w:val="CaptionedFigure"/>
+        <w:keepNext w:val="true"/>
+        <w:keepLines/>
         <w:rPr/>
       </w:pPr>
       <w:r>
@@ -7893,7 +8219,7 @@
         <w:pStyle w:val="Heading2"/>
         <w:rPr/>
       </w:pPr>
-      <w:bookmarkStart w:id="41" w:name="__RefHeading___Toc2145_2420786254"/>
+      <w:bookmarkStart w:id="41" w:name="__RefHeading___Toc2161_260347293"/>
       <w:bookmarkStart w:id="42" w:name="configuración-de-la-tienda"/>
       <w:bookmarkEnd w:id="41"/>
       <w:r>
@@ -7904,6 +8230,8 @@
     <w:p>
       <w:pPr>
         <w:pStyle w:val="FirstParagraph"/>
+        <w:keepNext w:val="true"/>
+        <w:keepLines/>
         <w:rPr/>
       </w:pPr>
       <w:r>
@@ -7943,6 +8271,8 @@
     <w:p>
       <w:pPr>
         <w:pStyle w:val="CaptionedFigure"/>
+        <w:keepNext w:val="true"/>
+        <w:keepLines/>
         <w:rPr/>
       </w:pPr>
       <w:r>
@@ -8130,7 +8460,7 @@
         <w:pStyle w:val="Heading2"/>
         <w:rPr/>
       </w:pPr>
-      <w:bookmarkStart w:id="43" w:name="__RefHeading___Toc2147_2420786254"/>
+      <w:bookmarkStart w:id="43" w:name="__RefHeading___Toc2163_260347293"/>
       <w:bookmarkStart w:id="44" w:name="equipo-tus-vendedores"/>
       <w:bookmarkEnd w:id="43"/>
       <w:r>
@@ -8141,6 +8471,8 @@
     <w:p>
       <w:pPr>
         <w:pStyle w:val="FirstParagraph"/>
+        <w:keepNext w:val="true"/>
+        <w:keepLines/>
         <w:rPr/>
       </w:pPr>
       <w:r>
@@ -8180,6 +8512,8 @@
     <w:p>
       <w:pPr>
         <w:pStyle w:val="CaptionedFigure"/>
+        <w:keepNext w:val="true"/>
+        <w:keepLines/>
         <w:rPr/>
       </w:pPr>
       <w:r>
@@ -8272,6 +8606,8 @@
     <w:p>
       <w:pPr>
         <w:pStyle w:val="Normal"/>
+        <w:keepNext w:val="true"/>
+        <w:keepLines/>
         <w:numPr>
           <w:ilvl w:val="0"/>
           <w:numId w:val="66"/>
@@ -8319,6 +8655,8 @@
     <w:p>
       <w:pPr>
         <w:pStyle w:val="CaptionedFigure"/>
+        <w:keepNext w:val="true"/>
+        <w:keepLines/>
         <w:numPr>
           <w:ilvl w:val="0"/>
           <w:numId w:val="1"/>
@@ -8428,35 +8766,21 @@
     </w:p>
     <w:p>
       <w:pPr>
-        <w:pStyle w:val="BlockText"/>
-        <w:rPr/>
-      </w:pPr>
-      <w:r>
-        <w:rPr>
-          <w:b/>
-          <w:bCs/>
-        </w:rPr>
-        <w:t>Importante sobre la contraseña.</w:t>
-      </w:r>
-      <w:r>
-        <w:rPr/>
-        <w:t xml:space="preserve"> La contraseña que escribes </w:t>
-      </w:r>
-      <w:r>
-        <w:rPr>
-          <w:b/>
-          <w:bCs/>
-        </w:rPr>
-        <w:t>no se puede ver ni cambiar después</w:t>
-      </w:r>
-      <w:r>
-        <w:rPr/>
-        <w:t>, ni tú ni el vendedor desde la aplicación. Por ahora, si un vendedor la pierde, hay que pedir ayuda a quien administra la aplicación.</w:t>
+        <w:pStyle w:val="FirstParagraph"/>
+        <w:keepNext w:val="true"/>
+        <w:keepLines/>
+        <w:rPr/>
+      </w:pPr>
+      <w:r>
+        <w:rPr/>
+        <w:t>Al terminar, tu equipo se ve así:</w:t>
       </w:r>
     </w:p>
     <w:p>
       <w:pPr>
         <w:pStyle w:val="CaptionedFigure"/>
+        <w:keepNext w:val="true"/>
+        <w:keepLines/>
         <w:rPr/>
       </w:pPr>
       <w:r>
@@ -8615,6 +8939,34 @@
         <w:rPr/>
         <w:t>.</w:t>
       </w:r>
+    </w:p>
+    <w:p>
+      <w:pPr>
+        <w:pStyle w:val="BlockText"/>
+        <w:rPr/>
+      </w:pPr>
+      <w:r>
+        <w:rPr>
+          <w:b/>
+          <w:bCs/>
+        </w:rPr>
+        <w:t>Importante sobre la contraseña.</w:t>
+      </w:r>
+      <w:r>
+        <w:rPr/>
+        <w:t xml:space="preserve"> La contraseña que escribes </w:t>
+      </w:r>
+      <w:r>
+        <w:rPr>
+          <w:b/>
+          <w:bCs/>
+        </w:rPr>
+        <w:t>no se puede ver ni cambiar después</w:t>
+      </w:r>
+      <w:r>
+        <w:rPr/>
+        <w:t>, ni tú ni el vendedor desde la aplicación. Por ahora, si un vendedor la pierde, hay que pedir ayuda a quien administra la aplicación.</w:t>
+      </w:r>
       <w:bookmarkEnd w:id="45"/>
     </w:p>
     <w:p>
@@ -8641,6 +8993,8 @@
     <w:p>
       <w:pPr>
         <w:pStyle w:val="Normal"/>
+        <w:keepNext w:val="true"/>
+        <w:keepLines/>
         <w:numPr>
           <w:ilvl w:val="0"/>
           <w:numId w:val="72"/>
@@ -8677,6 +9031,8 @@
     <w:p>
       <w:pPr>
         <w:pStyle w:val="CaptionedFigure"/>
+        <w:keepNext w:val="true"/>
+        <w:keepLines/>
         <w:numPr>
           <w:ilvl w:val="0"/>
           <w:numId w:val="1"/>
@@ -8741,6 +9097,8 @@
     <w:p>
       <w:pPr>
         <w:pStyle w:val="Normal"/>
+        <w:keepNext w:val="true"/>
+        <w:keepLines/>
         <w:numPr>
           <w:ilvl w:val="0"/>
           <w:numId w:val="73"/>
@@ -8777,6 +9135,8 @@
     <w:p>
       <w:pPr>
         <w:pStyle w:val="CaptionedFigure"/>
+        <w:keepNext w:val="true"/>
+        <w:keepLines/>
         <w:numPr>
           <w:ilvl w:val="0"/>
           <w:numId w:val="1"/>
@@ -8847,7 +9207,7 @@
         <w:pStyle w:val="Heading2"/>
         <w:rPr/>
       </w:pPr>
-      <w:bookmarkStart w:id="49" w:name="__RefHeading___Toc2149_2420786254"/>
+      <w:bookmarkStart w:id="49" w:name="__RefHeading___Toc2165_260347293"/>
       <w:bookmarkStart w:id="50" w:name="ver-el-trabajo-de-tu-equipo"/>
       <w:bookmarkEnd w:id="49"/>
       <w:r>
@@ -8868,6 +9228,8 @@
     <w:p>
       <w:pPr>
         <w:pStyle w:val="BodyText"/>
+        <w:keepNext w:val="true"/>
+        <w:keepLines/>
         <w:rPr/>
       </w:pPr>
       <w:r>
@@ -8896,13 +9258,15 @@
     <w:p>
       <w:pPr>
         <w:pStyle w:val="CaptionedFigure"/>
+        <w:keepNext w:val="true"/>
+        <w:keepLines/>
         <w:rPr/>
       </w:pPr>
       <w:r>
         <w:rPr/>
         <w:drawing>
           <wp:inline distT="0" distB="0" distL="0" distR="0">
-            <wp:extent cx="2592070" cy="6793865"/>
+            <wp:extent cx="2541905" cy="6661150"/>
             <wp:effectExtent l="0" t="0" r="0" b="0"/>
             <wp:docPr id="54" name="Image54" descr="Pantalla Hoy del propietario con el bloque Por vendedor señalado"/>
             <wp:cNvGraphicFramePr>
@@ -8926,7 +9290,7 @@
                   <pic:spPr bwMode="auto">
                     <a:xfrm>
                       <a:off x="0" y="0"/>
-                      <a:ext cx="2592070" cy="6793865"/>
+                      <a:ext cx="2541905" cy="6661150"/>
                     </a:xfrm>
                     <a:prstGeom prst="rect">
                       <a:avLst/>
@@ -8952,6 +9316,8 @@
     <w:p>
       <w:pPr>
         <w:pStyle w:val="BodyText"/>
+        <w:keepNext w:val="true"/>
+        <w:keepLines/>
         <w:rPr/>
       </w:pPr>
       <w:r>
@@ -8969,6 +9335,8 @@
     <w:p>
       <w:pPr>
         <w:pStyle w:val="CaptionedFigure"/>
+        <w:keepNext w:val="true"/>
+        <w:keepLines/>
         <w:rPr/>
       </w:pPr>
       <w:r>
@@ -9025,6 +9393,8 @@
     <w:p>
       <w:pPr>
         <w:pStyle w:val="BodyText"/>
+        <w:keepNext w:val="true"/>
+        <w:keepLines/>
         <w:rPr/>
       </w:pPr>
       <w:r>
@@ -9053,6 +9423,8 @@
     <w:p>
       <w:pPr>
         <w:pStyle w:val="CaptionedFigure"/>
+        <w:keepNext w:val="true"/>
+        <w:keepLines/>
         <w:rPr/>
       </w:pPr>
       <w:r>
@@ -9109,6 +9481,8 @@
     <w:p>
       <w:pPr>
         <w:pStyle w:val="BodyText"/>
+        <w:keepNext w:val="true"/>
+        <w:keepLines/>
         <w:rPr/>
       </w:pPr>
       <w:r>
@@ -9148,6 +9522,8 @@
     <w:p>
       <w:pPr>
         <w:pStyle w:val="CaptionedFigure"/>
+        <w:keepNext w:val="true"/>
+        <w:keepLines/>
         <w:rPr/>
       </w:pPr>
       <w:r>
@@ -9204,6 +9580,8 @@
     <w:p>
       <w:pPr>
         <w:pStyle w:val="BodyText"/>
+        <w:keepNext w:val="true"/>
+        <w:keepLines/>
         <w:rPr/>
       </w:pPr>
       <w:r>
@@ -9236,6 +9614,8 @@
     <w:p>
       <w:pPr>
         <w:pStyle w:val="CaptionedFigure"/>
+        <w:keepNext w:val="true"/>
+        <w:keepLines/>
         <w:rPr/>
       </w:pPr>
       <w:r>
@@ -9292,6 +9672,8 @@
     <w:p>
       <w:pPr>
         <w:pStyle w:val="BodyText"/>
+        <w:keepNext w:val="true"/>
+        <w:keepLines/>
         <w:rPr/>
       </w:pPr>
       <w:r>
@@ -9313,13 +9695,15 @@
     <w:p>
       <w:pPr>
         <w:pStyle w:val="CaptionedFigure"/>
+        <w:keepNext w:val="true"/>
+        <w:keepLines/>
         <w:rPr/>
       </w:pPr>
       <w:r>
         <w:rPr/>
         <w:drawing>
           <wp:inline distT="0" distB="0" distL="0" distR="0">
-            <wp:extent cx="4442460" cy="7019925"/>
+            <wp:extent cx="4215765" cy="6661785"/>
             <wp:effectExtent l="0" t="0" r="0" b="0"/>
             <wp:docPr id="59" name="Image59" descr="Detalle del vendedor: lo que se le debe, ventas y cobros del periodo"/>
             <wp:cNvGraphicFramePr>
@@ -9343,7 +9727,7 @@
                   <pic:spPr bwMode="auto">
                     <a:xfrm>
                       <a:off x="0" y="0"/>
-                      <a:ext cx="4442460" cy="7019925"/>
+                      <a:ext cx="4215765" cy="6661785"/>
                     </a:xfrm>
                     <a:prstGeom prst="rect">
                       <a:avLst/>
@@ -9368,7 +9752,26 @@
     </w:p>
     <w:p>
       <w:pPr>
-        <w:pStyle w:val="BodyText"/>
+        <w:pStyle w:val="BlockText"/>
+        <w:rPr/>
+      </w:pPr>
+      <w:r>
+        <w:rPr>
+          <w:b/>
+          <w:bCs/>
+        </w:rPr>
+        <w:t>Cómo entender “lo que se le debe”.</w:t>
+      </w:r>
+      <w:r>
+        <w:rPr/>
+        <w:t xml:space="preserve"> Es el dinero de las ventas pendientes de esa persona, de cualquier día: lo que sus clientes todavía no han pagado y que ella te debe entregar o cobrar.</w:t>
+      </w:r>
+    </w:p>
+    <w:p>
+      <w:pPr>
+        <w:pStyle w:val="FirstParagraph"/>
+        <w:keepNext w:val="true"/>
+        <w:keepLines/>
         <w:rPr/>
       </w:pPr>
       <w:r>
@@ -9408,6 +9811,8 @@
     <w:p>
       <w:pPr>
         <w:pStyle w:val="CaptionedFigure"/>
+        <w:keepNext w:val="true"/>
+        <w:keepLines/>
         <w:rPr/>
       </w:pPr>
       <w:r>
@@ -9456,38 +9861,23 @@
         <w:pStyle w:val="ImageCaption"/>
         <w:rPr/>
       </w:pPr>
+      <w:bookmarkStart w:id="51" w:name="parte-2.-guía-del-propietario"/>
+      <w:bookmarkStart w:id="52" w:name="ver-el-trabajo-de-tu-equipo"/>
       <w:r>
         <w:rPr/>
         <w:t>Inventario de un vendedor, en solo lectura</w:t>
       </w:r>
-    </w:p>
-    <w:p>
-      <w:pPr>
-        <w:pStyle w:val="BlockText"/>
-        <w:rPr/>
-      </w:pPr>
-      <w:r>
-        <w:rPr>
-          <w:b/>
-          <w:bCs/>
-        </w:rPr>
-        <w:t>Cómo entender “lo que se le debe”.</w:t>
-      </w:r>
-      <w:r>
-        <w:rPr/>
-        <w:t xml:space="preserve"> Es el dinero de las ventas pendientes de esa persona, de cualquier día: lo que sus clientes todavía no han pagado y que ella te debe entregar o cobrar.</w:t>
-      </w:r>
-      <w:bookmarkEnd w:id="34"/>
-      <w:bookmarkEnd w:id="50"/>
+      <w:bookmarkEnd w:id="51"/>
+      <w:bookmarkEnd w:id="52"/>
     </w:p>
     <w:p>
       <w:pPr>
         <w:pStyle w:val="Heading1"/>
         <w:rPr/>
       </w:pPr>
-      <w:bookmarkStart w:id="51" w:name="__RefHeading___Toc2151_2420786254"/>
-      <w:bookmarkStart w:id="52" w:name="parte-3.-guía-del-vendedor"/>
-      <w:bookmarkEnd w:id="51"/>
+      <w:bookmarkStart w:id="53" w:name="__RefHeading___Toc2167_260347293"/>
+      <w:bookmarkStart w:id="54" w:name="parte-3.-guía-del-vendedor"/>
+      <w:bookmarkEnd w:id="53"/>
       <w:r>
         <w:rPr/>
         <w:t>Parte 3. Guía del vendedor</w:t>
@@ -9506,11 +9896,12 @@
     <w:p>
       <w:pPr>
         <w:pStyle w:val="Heading2"/>
-        <w:rPr/>
-      </w:pPr>
-      <w:bookmarkStart w:id="53" w:name="__RefHeading___Toc2153_2420786254"/>
-      <w:bookmarkStart w:id="54" w:name="lo-que-puedes-y-lo-que-no"/>
-      <w:bookmarkEnd w:id="53"/>
+        <w:keepNext w:val="true"/>
+        <w:rPr/>
+      </w:pPr>
+      <w:bookmarkStart w:id="55" w:name="__RefHeading___Toc2169_260347293"/>
+      <w:bookmarkStart w:id="56" w:name="lo-que-puedes-y-lo-que-no"/>
+      <w:bookmarkEnd w:id="55"/>
       <w:r>
         <w:rPr/>
         <w:t>15. Lo que puedes y lo que no</w:t>
@@ -9539,6 +9930,7 @@
       <w:tr>
         <w:trPr>
           <w:tblHeader w:val="true"/>
+          <w:cantSplit w:val="true"/>
         </w:trPr>
         <w:tc>
           <w:tcPr>
@@ -9549,6 +9941,7 @@
           <w:p>
             <w:pPr>
               <w:pStyle w:val="Compact"/>
+              <w:keepNext w:val="true"/>
               <w:widowControl/>
               <w:spacing w:before="0" w:after="40"/>
               <w:jc w:val="left"/>
@@ -9579,6 +9972,7 @@
           <w:p>
             <w:pPr>
               <w:pStyle w:val="Compact"/>
+              <w:keepNext w:val="true"/>
               <w:widowControl/>
               <w:spacing w:before="0" w:after="40"/>
               <w:jc w:val="left"/>
@@ -9602,7 +9996,9 @@
         </w:tc>
       </w:tr>
       <w:tr>
-        <w:trPr/>
+        <w:trPr>
+          <w:cantSplit w:val="true"/>
+        </w:trPr>
         <w:tc>
           <w:tcPr>
             <w:tcW w:w="4872" w:type="dxa"/>
@@ -9612,6 +10008,7 @@
           <w:p>
             <w:pPr>
               <w:pStyle w:val="Compact"/>
+              <w:keepNext w:val="true"/>
               <w:widowControl/>
               <w:spacing w:before="0" w:after="40"/>
               <w:jc w:val="left"/>
@@ -9640,6 +10037,7 @@
           <w:p>
             <w:pPr>
               <w:pStyle w:val="Compact"/>
+              <w:keepNext w:val="true"/>
               <w:widowControl/>
               <w:spacing w:before="0" w:after="40"/>
               <w:jc w:val="left"/>
@@ -9661,7 +10059,9 @@
         </w:tc>
       </w:tr>
       <w:tr>
-        <w:trPr/>
+        <w:trPr>
+          <w:cantSplit w:val="true"/>
+        </w:trPr>
         <w:tc>
           <w:tcPr>
             <w:tcW w:w="4872" w:type="dxa"/>
@@ -9671,6 +10071,7 @@
           <w:p>
             <w:pPr>
               <w:pStyle w:val="Compact"/>
+              <w:keepNext w:val="true"/>
               <w:widowControl/>
               <w:spacing w:before="0" w:after="40"/>
               <w:jc w:val="left"/>
@@ -9699,6 +10100,7 @@
           <w:p>
             <w:pPr>
               <w:pStyle w:val="Compact"/>
+              <w:keepNext w:val="true"/>
               <w:widowControl/>
               <w:spacing w:before="0" w:after="40"/>
               <w:jc w:val="left"/>
@@ -9720,7 +10122,9 @@
         </w:tc>
       </w:tr>
       <w:tr>
-        <w:trPr/>
+        <w:trPr>
+          <w:cantSplit w:val="true"/>
+        </w:trPr>
         <w:tc>
           <w:tcPr>
             <w:tcW w:w="4872" w:type="dxa"/>
@@ -9730,6 +10134,7 @@
           <w:p>
             <w:pPr>
               <w:pStyle w:val="Compact"/>
+              <w:keepNext w:val="true"/>
               <w:widowControl/>
               <w:spacing w:before="0" w:after="40"/>
               <w:jc w:val="left"/>
@@ -9758,6 +10163,7 @@
           <w:p>
             <w:pPr>
               <w:pStyle w:val="Compact"/>
+              <w:keepNext w:val="true"/>
               <w:widowControl/>
               <w:spacing w:before="0" w:after="40"/>
               <w:jc w:val="left"/>
@@ -9779,7 +10185,9 @@
         </w:tc>
       </w:tr>
       <w:tr>
-        <w:trPr/>
+        <w:trPr>
+          <w:cantSplit w:val="true"/>
+        </w:trPr>
         <w:tc>
           <w:tcPr>
             <w:tcW w:w="4872" w:type="dxa"/>
@@ -9789,6 +10197,7 @@
           <w:p>
             <w:pPr>
               <w:pStyle w:val="Compact"/>
+              <w:keepNext w:val="true"/>
               <w:widowControl/>
               <w:spacing w:before="0" w:after="40"/>
               <w:jc w:val="left"/>
@@ -9853,6 +10262,7 @@
           <w:p>
             <w:pPr>
               <w:pStyle w:val="Compact"/>
+              <w:keepNext w:val="true"/>
               <w:widowControl/>
               <w:spacing w:before="0" w:after="40"/>
               <w:jc w:val="left"/>
@@ -9874,7 +10284,9 @@
         </w:tc>
       </w:tr>
       <w:tr>
-        <w:trPr/>
+        <w:trPr>
+          <w:cantSplit w:val="true"/>
+        </w:trPr>
         <w:tc>
           <w:tcPr>
             <w:tcW w:w="4872" w:type="dxa"/>
@@ -9972,6 +10384,8 @@
     <w:p>
       <w:pPr>
         <w:pStyle w:val="BodyText"/>
+        <w:keepNext w:val="true"/>
+        <w:keepLines/>
         <w:rPr/>
       </w:pPr>
       <w:r>
@@ -9993,6 +10407,8 @@
     <w:p>
       <w:pPr>
         <w:pStyle w:val="CaptionedFigure"/>
+        <w:keepNext w:val="true"/>
+        <w:keepLines/>
         <w:rPr/>
       </w:pPr>
       <w:r>
@@ -10049,6 +10465,8 @@
     <w:p>
       <w:pPr>
         <w:pStyle w:val="BodyText"/>
+        <w:keepNext w:val="true"/>
+        <w:keepLines/>
         <w:rPr/>
       </w:pPr>
       <w:r>
@@ -10077,6 +10495,8 @@
     <w:p>
       <w:pPr>
         <w:pStyle w:val="CaptionedFigure"/>
+        <w:keepNext w:val="true"/>
+        <w:keepLines/>
         <w:rPr/>
       </w:pPr>
       <w:r>
@@ -10125,21 +10545,21 @@
         <w:pStyle w:val="ImageCaption"/>
         <w:rPr/>
       </w:pPr>
-      <w:bookmarkStart w:id="55" w:name="lo-que-puedes-y-lo-que-no"/>
+      <w:bookmarkStart w:id="57" w:name="lo-que-puedes-y-lo-que-no"/>
       <w:r>
         <w:rPr/>
         <w:t>Pantalla Hoy con el aviso “No tienes acceso a esa pantalla.”</w:t>
       </w:r>
-      <w:bookmarkEnd w:id="55"/>
+      <w:bookmarkEnd w:id="57"/>
     </w:p>
     <w:p>
       <w:pPr>
         <w:pStyle w:val="Heading2"/>
         <w:rPr/>
       </w:pPr>
-      <w:bookmarkStart w:id="56" w:name="__RefHeading___Toc2155_2420786254"/>
-      <w:bookmarkStart w:id="57" w:name="tu-día-de-trabajo"/>
-      <w:bookmarkEnd w:id="56"/>
+      <w:bookmarkStart w:id="58" w:name="__RefHeading___Toc2171_260347293"/>
+      <w:bookmarkStart w:id="59" w:name="tu-día-de-trabajo"/>
+      <w:bookmarkEnd w:id="58"/>
       <w:r>
         <w:rPr/>
         <w:t>16. Tu día de trabajo</w:t>
@@ -10148,6 +10568,8 @@
     <w:p>
       <w:pPr>
         <w:pStyle w:val="FirstParagraph"/>
+        <w:keepNext w:val="true"/>
+        <w:keepLines/>
         <w:rPr/>
       </w:pPr>
       <w:r>
@@ -10180,6 +10602,8 @@
     <w:p>
       <w:pPr>
         <w:pStyle w:val="CaptionedFigure"/>
+        <w:keepNext w:val="true"/>
+        <w:keepLines/>
         <w:rPr/>
       </w:pPr>
       <w:r>
@@ -10236,6 +10660,8 @@
     <w:p>
       <w:pPr>
         <w:pStyle w:val="Normal"/>
+        <w:keepNext w:val="true"/>
+        <w:keepLines/>
         <w:numPr>
           <w:ilvl w:val="0"/>
           <w:numId w:val="74"/>
@@ -10290,6 +10716,8 @@
     <w:p>
       <w:pPr>
         <w:pStyle w:val="CaptionedFigure"/>
+        <w:keepNext w:val="true"/>
+        <w:keepLines/>
         <w:numPr>
           <w:ilvl w:val="0"/>
           <w:numId w:val="1"/>
@@ -10354,6 +10782,8 @@
     <w:p>
       <w:pPr>
         <w:pStyle w:val="Normal"/>
+        <w:keepNext w:val="true"/>
+        <w:keepLines/>
         <w:numPr>
           <w:ilvl w:val="0"/>
           <w:numId w:val="1"/>
@@ -10401,6 +10831,8 @@
     <w:p>
       <w:pPr>
         <w:pStyle w:val="CaptionedFigure"/>
+        <w:keepNext w:val="true"/>
+        <w:keepLines/>
         <w:numPr>
           <w:ilvl w:val="0"/>
           <w:numId w:val="1"/>
@@ -10411,7 +10843,7 @@
         <w:rPr/>
         <w:drawing>
           <wp:inline distT="0" distB="0" distL="0" distR="0">
-            <wp:extent cx="2592070" cy="6781165"/>
+            <wp:extent cx="2545080" cy="6658610"/>
             <wp:effectExtent l="0" t="0" r="0" b="0"/>
             <wp:docPr id="65" name="Image65" descr="Día preparado del vendedor con sus productos y cantidades"/>
             <wp:cNvGraphicFramePr>
@@ -10435,7 +10867,7 @@
                   <pic:spPr bwMode="auto">
                     <a:xfrm>
                       <a:off x="0" y="0"/>
-                      <a:ext cx="2592070" cy="6781165"/>
+                      <a:ext cx="2545080" cy="6658610"/>
                     </a:xfrm>
                     <a:prstGeom prst="rect">
                       <a:avLst/>
@@ -10547,16 +10979,16 @@
         <w:rPr/>
         <w:t xml:space="preserve"> Puedes cancelar una venta tuya y anular un pago tuyo, con motivo (sección 6).</w:t>
       </w:r>
-      <w:bookmarkEnd w:id="57"/>
+      <w:bookmarkEnd w:id="59"/>
     </w:p>
     <w:p>
       <w:pPr>
         <w:pStyle w:val="Heading2"/>
         <w:rPr/>
       </w:pPr>
-      <w:bookmarkStart w:id="58" w:name="__RefHeading___Toc2157_2420786254"/>
-      <w:bookmarkStart w:id="59" w:name="consultar-lo-tuyo"/>
-      <w:bookmarkEnd w:id="58"/>
+      <w:bookmarkStart w:id="60" w:name="__RefHeading___Toc2173_260347293"/>
+      <w:bookmarkStart w:id="61" w:name="consultar-lo-tuyo"/>
+      <w:bookmarkEnd w:id="60"/>
       <w:r>
         <w:rPr/>
         <w:t>17. Consultar lo tuyo</w:t>
@@ -10565,6 +10997,8 @@
     <w:p>
       <w:pPr>
         <w:pStyle w:val="FirstParagraph"/>
+        <w:keepNext w:val="true"/>
+        <w:keepLines/>
         <w:rPr/>
       </w:pPr>
       <w:r>
@@ -10604,6 +11038,8 @@
     <w:p>
       <w:pPr>
         <w:pStyle w:val="CaptionedFigure"/>
+        <w:keepNext w:val="true"/>
+        <w:keepLines/>
         <w:rPr/>
       </w:pPr>
       <w:r>
@@ -10660,6 +11096,8 @@
     <w:p>
       <w:pPr>
         <w:pStyle w:val="BodyText"/>
+        <w:keepNext w:val="true"/>
+        <w:keepLines/>
         <w:rPr/>
       </w:pPr>
       <w:r>
@@ -10699,6 +11137,8 @@
     <w:p>
       <w:pPr>
         <w:pStyle w:val="CaptionedFigure"/>
+        <w:keepNext w:val="true"/>
+        <w:keepLines/>
         <w:rPr/>
       </w:pPr>
       <w:r>
@@ -10772,16 +11212,16 @@
         <w:rPr/>
         <w:t xml:space="preserve"> es el dinero de tus ventas que todavía no cobras. El propietario ve esa misma cifra en sus reportes por vendedor.</w:t>
       </w:r>
-      <w:bookmarkEnd w:id="59"/>
+      <w:bookmarkEnd w:id="61"/>
     </w:p>
     <w:p>
       <w:pPr>
         <w:pStyle w:val="Heading2"/>
         <w:rPr/>
       </w:pPr>
-      <w:bookmarkStart w:id="60" w:name="__RefHeading___Toc2159_2420786254"/>
-      <w:bookmarkStart w:id="61" w:name="si-tu-cuenta-es-dada-de-baja"/>
-      <w:bookmarkEnd w:id="60"/>
+      <w:bookmarkStart w:id="62" w:name="__RefHeading___Toc2175_260347293"/>
+      <w:bookmarkStart w:id="63" w:name="si-tu-cuenta-es-dada-de-baja"/>
+      <w:bookmarkEnd w:id="62"/>
       <w:r>
         <w:rPr/>
         <w:t>18. Si tu cuenta es dada de baja</w:t>
@@ -10790,6 +11230,8 @@
     <w:p>
       <w:pPr>
         <w:pStyle w:val="FirstParagraph"/>
+        <w:keepNext w:val="true"/>
+        <w:keepLines/>
         <w:rPr/>
       </w:pPr>
       <w:r>
@@ -10800,6 +11242,8 @@
     <w:p>
       <w:pPr>
         <w:pStyle w:val="CaptionedFigure"/>
+        <w:keepNext w:val="true"/>
+        <w:keepLines/>
         <w:rPr/>
       </w:pPr>
       <w:r>
@@ -10848,22 +11292,23 @@
         <w:pStyle w:val="ImageCaption"/>
         <w:rPr/>
       </w:pPr>
-      <w:bookmarkStart w:id="62" w:name="parte-3.-guía-del-vendedor"/>
-      <w:bookmarkStart w:id="63" w:name="si-tu-cuenta-es-dada-de-baja"/>
+      <w:bookmarkStart w:id="64" w:name="parte-3.-guía-del-vendedor"/>
+      <w:bookmarkStart w:id="65" w:name="si-tu-cuenta-es-dada-de-baja"/>
       <w:r>
         <w:rPr/>
         <w:t>Pantalla “Tu cuenta fue dada de baja” con el botón Cerrar sesión</w:t>
       </w:r>
-      <w:bookmarkEnd w:id="62"/>
-      <w:bookmarkEnd w:id="63"/>
+      <w:bookmarkEnd w:id="64"/>
+      <w:bookmarkEnd w:id="65"/>
     </w:p>
     <w:p>
       <w:pPr>
         <w:pStyle w:val="Heading1"/>
-        <w:rPr/>
-      </w:pPr>
-      <w:bookmarkStart w:id="64" w:name="__RefHeading___Toc2161_2420786254"/>
-      <w:bookmarkEnd w:id="64"/>
+        <w:keepNext w:val="true"/>
+        <w:rPr/>
+      </w:pPr>
+      <w:bookmarkStart w:id="66" w:name="__RefHeading___Toc2177_260347293"/>
+      <w:bookmarkEnd w:id="66"/>
       <w:r>
         <w:rPr/>
         <w:t>Glosario</w:t>
@@ -10892,6 +11337,7 @@
       <w:tr>
         <w:trPr>
           <w:tblHeader w:val="true"/>
+          <w:cantSplit w:val="true"/>
         </w:trPr>
         <w:tc>
           <w:tcPr>
@@ -10902,6 +11348,7 @@
           <w:p>
             <w:pPr>
               <w:pStyle w:val="Compact"/>
+              <w:keepNext w:val="true"/>
               <w:widowControl/>
               <w:spacing w:before="0" w:after="40"/>
               <w:jc w:val="left"/>
@@ -10932,6 +11379,7 @@
           <w:p>
             <w:pPr>
               <w:pStyle w:val="Compact"/>
+              <w:keepNext w:val="true"/>
               <w:widowControl/>
               <w:spacing w:before="0" w:after="40"/>
               <w:jc w:val="left"/>
@@ -10955,7 +11403,9 @@
         </w:tc>
       </w:tr>
       <w:tr>
-        <w:trPr/>
+        <w:trPr>
+          <w:cantSplit w:val="true"/>
+        </w:trPr>
         <w:tc>
           <w:tcPr>
             <w:tcW w:w="4872" w:type="dxa"/>
@@ -10965,6 +11415,7 @@
           <w:p>
             <w:pPr>
               <w:pStyle w:val="Compact"/>
+              <w:keepNext w:val="true"/>
               <w:widowControl/>
               <w:spacing w:before="0" w:after="40"/>
               <w:jc w:val="left"/>
@@ -10995,6 +11446,7 @@
           <w:p>
             <w:pPr>
               <w:pStyle w:val="Compact"/>
+              <w:keepNext w:val="true"/>
               <w:widowControl/>
               <w:spacing w:before="0" w:after="40"/>
               <w:jc w:val="left"/>
@@ -11016,7 +11468,9 @@
         </w:tc>
       </w:tr>
       <w:tr>
-        <w:trPr/>
+        <w:trPr>
+          <w:cantSplit w:val="true"/>
+        </w:trPr>
         <w:tc>
           <w:tcPr>
             <w:tcW w:w="4872" w:type="dxa"/>
@@ -11026,6 +11480,7 @@
           <w:p>
             <w:pPr>
               <w:pStyle w:val="Compact"/>
+              <w:keepNext w:val="true"/>
               <w:widowControl/>
               <w:spacing w:before="0" w:after="40"/>
               <w:jc w:val="left"/>
@@ -11056,6 +11511,7 @@
           <w:p>
             <w:pPr>
               <w:pStyle w:val="Compact"/>
+              <w:keepNext w:val="true"/>
               <w:widowControl/>
               <w:spacing w:before="0" w:after="40"/>
               <w:jc w:val="left"/>
@@ -11077,7 +11533,9 @@
         </w:tc>
       </w:tr>
       <w:tr>
-        <w:trPr/>
+        <w:trPr>
+          <w:cantSplit w:val="true"/>
+        </w:trPr>
         <w:tc>
           <w:tcPr>
             <w:tcW w:w="4872" w:type="dxa"/>
@@ -11087,6 +11545,7 @@
           <w:p>
             <w:pPr>
               <w:pStyle w:val="Compact"/>
+              <w:keepNext w:val="true"/>
               <w:widowControl/>
               <w:spacing w:before="0" w:after="40"/>
               <w:jc w:val="left"/>
@@ -11117,6 +11576,7 @@
           <w:p>
             <w:pPr>
               <w:pStyle w:val="Compact"/>
+              <w:keepNext w:val="true"/>
               <w:widowControl/>
               <w:spacing w:before="0" w:after="40"/>
               <w:jc w:val="left"/>
@@ -11138,7 +11598,9 @@
         </w:tc>
       </w:tr>
       <w:tr>
-        <w:trPr/>
+        <w:trPr>
+          <w:cantSplit w:val="true"/>
+        </w:trPr>
         <w:tc>
           <w:tcPr>
             <w:tcW w:w="4872" w:type="dxa"/>
@@ -11148,6 +11610,7 @@
           <w:p>
             <w:pPr>
               <w:pStyle w:val="Compact"/>
+              <w:keepNext w:val="true"/>
               <w:widowControl/>
               <w:spacing w:before="0" w:after="40"/>
               <w:jc w:val="left"/>
@@ -11178,6 +11641,7 @@
           <w:p>
             <w:pPr>
               <w:pStyle w:val="Compact"/>
+              <w:keepNext w:val="true"/>
               <w:widowControl/>
               <w:spacing w:before="0" w:after="40"/>
               <w:jc w:val="left"/>
@@ -11199,7 +11663,9 @@
         </w:tc>
       </w:tr>
       <w:tr>
-        <w:trPr/>
+        <w:trPr>
+          <w:cantSplit w:val="true"/>
+        </w:trPr>
         <w:tc>
           <w:tcPr>
             <w:tcW w:w="4872" w:type="dxa"/>
@@ -11209,6 +11675,7 @@
           <w:p>
             <w:pPr>
               <w:pStyle w:val="Compact"/>
+              <w:keepNext w:val="true"/>
               <w:widowControl/>
               <w:spacing w:before="0" w:after="40"/>
               <w:jc w:val="left"/>
@@ -11239,6 +11706,7 @@
           <w:p>
             <w:pPr>
               <w:pStyle w:val="Compact"/>
+              <w:keepNext w:val="true"/>
               <w:widowControl/>
               <w:spacing w:before="0" w:after="40"/>
               <w:jc w:val="left"/>
@@ -11260,7 +11728,9 @@
         </w:tc>
       </w:tr>
       <w:tr>
-        <w:trPr/>
+        <w:trPr>
+          <w:cantSplit w:val="true"/>
+        </w:trPr>
         <w:tc>
           <w:tcPr>
             <w:tcW w:w="4872" w:type="dxa"/>
@@ -11270,6 +11740,7 @@
           <w:p>
             <w:pPr>
               <w:pStyle w:val="Compact"/>
+              <w:keepNext w:val="true"/>
               <w:widowControl/>
               <w:spacing w:before="0" w:after="40"/>
               <w:jc w:val="left"/>
@@ -11300,6 +11771,7 @@
           <w:p>
             <w:pPr>
               <w:pStyle w:val="Compact"/>
+              <w:keepNext w:val="true"/>
               <w:widowControl/>
               <w:spacing w:before="0" w:after="40"/>
               <w:jc w:val="left"/>
@@ -11321,7 +11793,9 @@
         </w:tc>
       </w:tr>
       <w:tr>
-        <w:trPr/>
+        <w:trPr>
+          <w:cantSplit w:val="true"/>
+        </w:trPr>
         <w:tc>
           <w:tcPr>
             <w:tcW w:w="4872" w:type="dxa"/>
@@ -11331,6 +11805,7 @@
           <w:p>
             <w:pPr>
               <w:pStyle w:val="Compact"/>
+              <w:keepNext w:val="true"/>
               <w:widowControl/>
               <w:spacing w:before="0" w:after="40"/>
               <w:jc w:val="left"/>
@@ -11361,6 +11836,7 @@
           <w:p>
             <w:pPr>
               <w:pStyle w:val="Compact"/>
+              <w:keepNext w:val="true"/>
               <w:widowControl/>
               <w:spacing w:before="0" w:after="40"/>
               <w:jc w:val="left"/>
@@ -11382,7 +11858,9 @@
         </w:tc>
       </w:tr>
       <w:tr>
-        <w:trPr/>
+        <w:trPr>
+          <w:cantSplit w:val="true"/>
+        </w:trPr>
         <w:tc>
           <w:tcPr>
             <w:tcW w:w="4872" w:type="dxa"/>
@@ -11392,6 +11870,7 @@
           <w:p>
             <w:pPr>
               <w:pStyle w:val="Compact"/>
+              <w:keepNext w:val="true"/>
               <w:widowControl/>
               <w:spacing w:before="0" w:after="40"/>
               <w:jc w:val="left"/>
@@ -11422,6 +11901,7 @@
           <w:p>
             <w:pPr>
               <w:pStyle w:val="Compact"/>
+              <w:keepNext w:val="true"/>
               <w:widowControl/>
               <w:spacing w:before="0" w:after="40"/>
               <w:jc w:val="left"/>
@@ -11443,7 +11923,9 @@
         </w:tc>
       </w:tr>
       <w:tr>
-        <w:trPr/>
+        <w:trPr>
+          <w:cantSplit w:val="true"/>
+        </w:trPr>
         <w:tc>
           <w:tcPr>
             <w:tcW w:w="4872" w:type="dxa"/>
@@ -11453,6 +11935,7 @@
           <w:p>
             <w:pPr>
               <w:pStyle w:val="Compact"/>
+              <w:keepNext w:val="true"/>
               <w:widowControl/>
               <w:spacing w:before="0" w:after="40"/>
               <w:jc w:val="left"/>
@@ -11483,6 +11966,7 @@
           <w:p>
             <w:pPr>
               <w:pStyle w:val="Compact"/>
+              <w:keepNext w:val="true"/>
               <w:widowControl/>
               <w:spacing w:before="0" w:after="40"/>
               <w:jc w:val="left"/>
@@ -11522,7 +12006,9 @@
         </w:tc>
       </w:tr>
       <w:tr>
-        <w:trPr/>
+        <w:trPr>
+          <w:cantSplit w:val="true"/>
+        </w:trPr>
         <w:tc>
           <w:tcPr>
             <w:tcW w:w="4872" w:type="dxa"/>
@@ -11532,6 +12018,7 @@
           <w:p>
             <w:pPr>
               <w:pStyle w:val="Compact"/>
+              <w:keepNext w:val="true"/>
               <w:widowControl/>
               <w:spacing w:before="0" w:after="40"/>
               <w:jc w:val="left"/>
@@ -11562,6 +12049,7 @@
           <w:p>
             <w:pPr>
               <w:pStyle w:val="Compact"/>
+              <w:keepNext w:val="true"/>
               <w:widowControl/>
               <w:spacing w:before="0" w:after="40"/>
               <w:jc w:val="left"/>
@@ -11583,7 +12071,9 @@
         </w:tc>
       </w:tr>
       <w:tr>
-        <w:trPr/>
+        <w:trPr>
+          <w:cantSplit w:val="true"/>
+        </w:trPr>
         <w:tc>
           <w:tcPr>
             <w:tcW w:w="4872" w:type="dxa"/>
@@ -11593,6 +12083,7 @@
           <w:p>
             <w:pPr>
               <w:pStyle w:val="Compact"/>
+              <w:keepNext w:val="true"/>
               <w:widowControl/>
               <w:spacing w:before="0" w:after="40"/>
               <w:jc w:val="left"/>
@@ -11623,6 +12114,7 @@
           <w:p>
             <w:pPr>
               <w:pStyle w:val="Compact"/>
+              <w:keepNext w:val="true"/>
               <w:widowControl/>
               <w:spacing w:before="0" w:after="40"/>
               <w:jc w:val="left"/>
@@ -11644,7 +12136,9 @@
         </w:tc>
       </w:tr>
       <w:tr>
-        <w:trPr/>
+        <w:trPr>
+          <w:cantSplit w:val="true"/>
+        </w:trPr>
         <w:tc>
           <w:tcPr>
             <w:tcW w:w="4872" w:type="dxa"/>
@@ -11701,8 +12195,8 @@
               </w:rPr>
               <w:t>Una persona del equipo que ya no puede entrar. Sus ventas se conservan.</w:t>
             </w:r>
-            <w:bookmarkStart w:id="65" w:name="glosario"/>
-            <w:bookmarkEnd w:id="65"/>
+            <w:bookmarkStart w:id="67" w:name="glosario"/>
+            <w:bookmarkEnd w:id="67"/>
           </w:p>
         </w:tc>
       </w:tr>
@@ -11784,7 +12278,7 @@
         <w:sz w:val="18"/>
         <w:color w:val="4D5F79"/>
       </w:rPr>
-      <w:t>74</w:t>
+      <w:t>75</w:t>
     </w:r>
     <w:r>
       <w:rPr>
@@ -11838,7 +12332,7 @@
     <w:r>
       <w:rPr/>
       <w:drawing>
-        <wp:anchor behindDoc="1" distT="0" distB="0" distL="0" distR="0" simplePos="0" locked="0" layoutInCell="0" allowOverlap="1" relativeHeight="143">
+        <wp:anchor behindDoc="1" distT="0" distB="0" distL="0" distR="0" simplePos="0" locked="0" layoutInCell="0" allowOverlap="1" relativeHeight="144">
           <wp:simplePos x="0" y="0"/>
           <wp:positionH relativeFrom="page">
             <wp:posOffset>0</wp:posOffset>

</xml_diff>